<commit_message>
Restructure KHBD activity tables into 4 chronological interaction rows and update gems_agent generator
</commit_message>
<xml_diff>
--- a/agent soạn tài liệu/output/bai3_noi_nang_nhiet_luong/ready/bai3_noi_nang_nhiet_luong_ke_hoach_bai_day.docx
+++ b/agent soạn tài liệu/output/bai3_noi_nang_nhiet_luong/ready/bai3_noi_nang_nhiet_luong_ke_hoach_bai_day.docx
@@ -1396,6 +1396,93 @@
                 <w:color w:val="000000"/>
                 <w:sz w:val="22"/>
               </w:rPr>
+              <w:t>Tiếp nhận nhiệm vụ:</w:t>
+            </w:r>
+            <w:r>
+              <w:rPr>
+                <w:rFonts w:ascii="Times New Roman" w:hAnsi="Times New Roman"/>
+                <w:color w:val="000000"/>
+                <w:sz w:val="22"/>
+              </w:rPr>
+              <w:t xml:space="preserve"> Học sinh tiếp nhận nhiệm vụ học tập từ giáo viên.</w:t>
+            </w:r>
+          </w:p>
+        </w:tc>
+      </w:tr>
+      <w:tr>
+        <w:trPr>
+          <w:cantSplit/>
+        </w:trPr>
+        <w:tc>
+          <w:tcPr>
+            <w:tcW w:type="dxa" w:w="4535"/>
+            <w:tcMar>
+              <w:top w:w="114" w:type="dxa"/>
+              <w:bottom w:w="114" w:type="dxa"/>
+              <w:left w:w="170" w:type="dxa"/>
+              <w:right w:w="170" w:type="dxa"/>
+            </w:tcMar>
+            <w:tcBorders>
+              <w:top w:val="single" w:sz="4" w:space="0" w:color="BFBFBF"/>
+              <w:left w:val="single" w:sz="4" w:space="0" w:color="BFBFBF"/>
+              <w:bottom w:val="single" w:sz="4" w:space="0" w:color="BFBFBF"/>
+              <w:right w:val="single" w:sz="4" w:space="0" w:color="BFBFBF"/>
+            </w:tcBorders>
+          </w:tcPr>
+          <w:p>
+            <w:pPr>
+              <w:spacing w:before="40" w:after="40" w:line="276" w:lineRule="auto"/>
+              <w:jc w:val="left"/>
+            </w:pPr>
+            <w:r/>
+            <w:r>
+              <w:rPr>
+                <w:rFonts w:ascii="Times New Roman" w:hAnsi="Times New Roman"/>
+                <w:b/>
+                <w:color w:val="000000"/>
+                <w:sz w:val="22"/>
+              </w:rPr>
+              <w:t>Theo dõi, hỗ trợ:</w:t>
+            </w:r>
+            <w:r>
+              <w:rPr>
+                <w:rFonts w:ascii="Times New Roman" w:hAnsi="Times New Roman"/>
+                <w:color w:val="000000"/>
+                <w:sz w:val="22"/>
+              </w:rPr>
+              <w:t xml:space="preserve"> Giáo viên theo dõi, quan sát và hỗ trợ gợi ý các nhóm khi cần thiết.</w:t>
+            </w:r>
+          </w:p>
+        </w:tc>
+        <w:tc>
+          <w:tcPr>
+            <w:tcW w:type="dxa" w:w="4535"/>
+            <w:tcMar>
+              <w:top w:w="114" w:type="dxa"/>
+              <w:bottom w:w="114" w:type="dxa"/>
+              <w:left w:w="170" w:type="dxa"/>
+              <w:right w:w="170" w:type="dxa"/>
+            </w:tcMar>
+            <w:tcBorders>
+              <w:top w:val="single" w:sz="4" w:space="0" w:color="BFBFBF"/>
+              <w:left w:val="single" w:sz="4" w:space="0" w:color="BFBFBF"/>
+              <w:bottom w:val="single" w:sz="4" w:space="0" w:color="BFBFBF"/>
+              <w:right w:val="single" w:sz="4" w:space="0" w:color="BFBFBF"/>
+            </w:tcBorders>
+          </w:tcPr>
+          <w:p>
+            <w:pPr>
+              <w:spacing w:before="40" w:after="40" w:line="276" w:lineRule="auto"/>
+              <w:jc w:val="left"/>
+            </w:pPr>
+            <w:r/>
+            <w:r>
+              <w:rPr>
+                <w:rFonts w:ascii="Times New Roman" w:hAnsi="Times New Roman"/>
+                <w:b/>
+                <w:color w:val="000000"/>
+                <w:sz w:val="22"/>
+              </w:rPr>
               <w:t>Thực hiện nhiệm vụ:</w:t>
             </w:r>
           </w:p>
@@ -1480,22 +1567,7 @@
                 <w:color w:val="000000"/>
                 <w:sz w:val="22"/>
               </w:rPr>
-              <w:t>Kết luận:</w:t>
-            </w:r>
-          </w:p>
-          <w:p>
-            <w:pPr>
-              <w:spacing w:before="40" w:after="40" w:line="276" w:lineRule="auto"/>
-              <w:ind w:left="170" w:hanging="113"/>
-              <w:jc w:val="left"/>
-            </w:pPr>
-            <w:r>
-              <w:rPr>
-                <w:rFonts w:ascii="Times New Roman" w:hAnsi="Times New Roman"/>
-                <w:color w:val="000000"/>
-                <w:sz w:val="22"/>
-              </w:rPr>
-              <w:t xml:space="preserve">- </w:t>
+              <w:t>Tổ chức báo cáo:</w:t>
             </w:r>
             <w:r>
               <w:rPr>
@@ -1503,7 +1575,7 @@
                 <w:color w:val="000000"/>
                 <w:sz w:val="22"/>
               </w:rPr>
-              <w:t>GV chốt: *“Cơ năng cọ xát đã biến đổi thành nhiệt năng làm tay ấm lên. Quá trình này được mô tả thế nào qua khái niệm nội năng? Bài học hôm nay sẽ giúp chúng ta trả lời.”*</w:t>
+              <w:t xml:space="preserve"> Giáo viên điều hành, gọi đại diện báo cáo kết quả, tổ chức nhận xét phản biện chéo giữa các học sinh.</w:t>
             </w:r>
           </w:p>
         </w:tc>
@@ -1583,6 +1655,108 @@
                 <w:sz w:val="22"/>
               </w:rPr>
               <w:t>Cả lớp lắng nghe, ghi nhận bài học mới.</w:t>
+            </w:r>
+          </w:p>
+        </w:tc>
+      </w:tr>
+      <w:tr>
+        <w:trPr>
+          <w:cantSplit/>
+        </w:trPr>
+        <w:tc>
+          <w:tcPr>
+            <w:tcW w:type="dxa" w:w="4535"/>
+            <w:tcMar>
+              <w:top w:w="114" w:type="dxa"/>
+              <w:bottom w:w="114" w:type="dxa"/>
+              <w:left w:w="170" w:type="dxa"/>
+              <w:right w:w="170" w:type="dxa"/>
+            </w:tcMar>
+            <w:tcBorders>
+              <w:top w:val="single" w:sz="4" w:space="0" w:color="BFBFBF"/>
+              <w:left w:val="single" w:sz="4" w:space="0" w:color="BFBFBF"/>
+              <w:bottom w:val="single" w:sz="4" w:space="0" w:color="BFBFBF"/>
+              <w:right w:val="single" w:sz="4" w:space="0" w:color="BFBFBF"/>
+            </w:tcBorders>
+          </w:tcPr>
+          <w:p>
+            <w:pPr>
+              <w:spacing w:before="40" w:after="40" w:line="276" w:lineRule="auto"/>
+              <w:jc w:val="left"/>
+            </w:pPr>
+            <w:r/>
+            <w:r>
+              <w:rPr>
+                <w:rFonts w:ascii="Times New Roman" w:hAnsi="Times New Roman"/>
+                <w:b/>
+                <w:color w:val="000000"/>
+                <w:sz w:val="22"/>
+              </w:rPr>
+              <w:t>Kết luận, nhận định:</w:t>
+            </w:r>
+          </w:p>
+          <w:p>
+            <w:pPr>
+              <w:spacing w:before="40" w:after="40" w:line="276" w:lineRule="auto"/>
+              <w:ind w:left="170" w:hanging="113"/>
+              <w:jc w:val="left"/>
+            </w:pPr>
+            <w:r>
+              <w:rPr>
+                <w:rFonts w:ascii="Times New Roman" w:hAnsi="Times New Roman"/>
+                <w:color w:val="000000"/>
+                <w:sz w:val="22"/>
+              </w:rPr>
+              <w:t xml:space="preserve">- </w:t>
+            </w:r>
+            <w:r>
+              <w:rPr>
+                <w:rFonts w:ascii="Times New Roman" w:hAnsi="Times New Roman"/>
+                <w:color w:val="000000"/>
+                <w:sz w:val="22"/>
+              </w:rPr>
+              <w:t>GV chốt: *“Cơ năng cọ xát đã biến đổi thành nhiệt năng làm tay ấm lên. Quá trình này được mô tả thế nào qua khái niệm nội năng? Bài học hôm nay sẽ giúp chúng ta trả lời.”*</w:t>
+            </w:r>
+          </w:p>
+        </w:tc>
+        <w:tc>
+          <w:tcPr>
+            <w:tcW w:type="dxa" w:w="4535"/>
+            <w:tcMar>
+              <w:top w:w="114" w:type="dxa"/>
+              <w:bottom w:w="114" w:type="dxa"/>
+              <w:left w:w="170" w:type="dxa"/>
+              <w:right w:w="170" w:type="dxa"/>
+            </w:tcMar>
+            <w:tcBorders>
+              <w:top w:val="single" w:sz="4" w:space="0" w:color="BFBFBF"/>
+              <w:left w:val="single" w:sz="4" w:space="0" w:color="BFBFBF"/>
+              <w:bottom w:val="single" w:sz="4" w:space="0" w:color="BFBFBF"/>
+              <w:right w:val="single" w:sz="4" w:space="0" w:color="BFBFBF"/>
+            </w:tcBorders>
+          </w:tcPr>
+          <w:p>
+            <w:pPr>
+              <w:spacing w:before="40" w:after="40" w:line="276" w:lineRule="auto"/>
+              <w:jc w:val="left"/>
+            </w:pPr>
+            <w:r/>
+            <w:r>
+              <w:rPr>
+                <w:rFonts w:ascii="Times New Roman" w:hAnsi="Times New Roman"/>
+                <w:b/>
+                <w:color w:val="000000"/>
+                <w:sz w:val="22"/>
+              </w:rPr>
+              <w:t>Ghi nhận kiến thức:</w:t>
+            </w:r>
+            <w:r>
+              <w:rPr>
+                <w:rFonts w:ascii="Times New Roman" w:hAnsi="Times New Roman"/>
+                <w:color w:val="000000"/>
+                <w:sz w:val="22"/>
+              </w:rPr>
+              <w:t xml:space="preserve"> Học sinh đối chiếu, sửa đổi kết quả bài làm và ghi nhận kiến thức cốt lõi vào vở.</w:t>
             </w:r>
           </w:p>
         </w:tc>
@@ -1812,7 +1986,7 @@
                 <w:color w:val="000000"/>
                 <w:sz w:val="22"/>
               </w:rPr>
-              <w:t>Nội dung 1: Nội năng &amp; Nguyên lí I (ĐVKT 1)</w:t>
+              <w:t>Chuyển giao nhiệm vụ:</w:t>
             </w:r>
           </w:p>
         </w:tc>
@@ -1845,22 +2019,7 @@
                 <w:color w:val="000000"/>
                 <w:sz w:val="22"/>
               </w:rPr>
-              <w:t>Thực hiện nhiệm vụ:</w:t>
-            </w:r>
-          </w:p>
-          <w:p>
-            <w:pPr>
-              <w:spacing w:before="40" w:after="40" w:line="276" w:lineRule="auto"/>
-              <w:ind w:left="170" w:hanging="113"/>
-              <w:jc w:val="left"/>
-            </w:pPr>
-            <w:r>
-              <w:rPr>
-                <w:rFonts w:ascii="Times New Roman" w:hAnsi="Times New Roman"/>
-                <w:color w:val="000000"/>
-                <w:sz w:val="22"/>
-              </w:rPr>
-              <w:t xml:space="preserve">- </w:t>
+              <w:t>Tiếp nhận nhiệm vụ:</w:t>
             </w:r>
             <w:r>
               <w:rPr>
@@ -1868,31 +2027,66 @@
                 <w:color w:val="000000"/>
                 <w:sz w:val="22"/>
               </w:rPr>
-              <w:t>HS quan sát mô phỏng/thí nghiệm ống ete đậy nút cao su của GV.</w:t>
+              <w:t xml:space="preserve"> Học sinh tiếp nhận nhiệm vụ học tập từ giáo viên.</w:t>
             </w:r>
           </w:p>
+        </w:tc>
+      </w:tr>
+      <w:tr>
+        <w:trPr>
+          <w:cantSplit/>
+        </w:trPr>
+        <w:tc>
+          <w:tcPr>
+            <w:tcW w:type="dxa" w:w="4535"/>
+            <w:tcMar>
+              <w:top w:w="114" w:type="dxa"/>
+              <w:bottom w:w="114" w:type="dxa"/>
+              <w:left w:w="170" w:type="dxa"/>
+              <w:right w:w="170" w:type="dxa"/>
+            </w:tcMar>
+            <w:tcBorders>
+              <w:top w:val="single" w:sz="4" w:space="0" w:color="BFBFBF"/>
+              <w:left w:val="single" w:sz="4" w:space="0" w:color="BFBFBF"/>
+              <w:bottom w:val="single" w:sz="4" w:space="0" w:color="BFBFBF"/>
+              <w:right w:val="single" w:sz="4" w:space="0" w:color="BFBFBF"/>
+            </w:tcBorders>
+          </w:tcPr>
           <w:p>
             <w:pPr>
               <w:spacing w:before="40" w:after="40" w:line="276" w:lineRule="auto"/>
-              <w:ind w:left="170" w:hanging="113"/>
               <w:jc w:val="left"/>
             </w:pPr>
+            <w:r/>
             <w:r>
               <w:rPr>
                 <w:rFonts w:ascii="Times New Roman" w:hAnsi="Times New Roman"/>
+                <w:b/>
                 <w:color w:val="000000"/>
                 <w:sz w:val="22"/>
               </w:rPr>
-              <w:t xml:space="preserve">- </w:t>
+              <w:t>Nội dung 1: Nội năng &amp; Nguyên lí I (ĐVKT 1)</w:t>
             </w:r>
-            <w:r>
-              <w:rPr>
-                <w:rFonts w:ascii="Times New Roman" w:hAnsi="Times New Roman"/>
-                <w:color w:val="000000"/>
-                <w:sz w:val="22"/>
-              </w:rPr>
-              <w:t>Trao đổi cặp đôi giải thích hiện tượng và điền khuyết lý thuyết vào PHT.</w:t>
-            </w:r>
+          </w:p>
+        </w:tc>
+        <w:tc>
+          <w:tcPr>
+            <w:tcW w:type="dxa" w:w="4535"/>
+            <w:tcMar>
+              <w:top w:w="114" w:type="dxa"/>
+              <w:bottom w:w="114" w:type="dxa"/>
+              <w:left w:w="170" w:type="dxa"/>
+              <w:right w:w="170" w:type="dxa"/>
+            </w:tcMar>
+            <w:tcBorders>
+              <w:top w:val="single" w:sz="4" w:space="0" w:color="BFBFBF"/>
+              <w:left w:val="single" w:sz="4" w:space="0" w:color="BFBFBF"/>
+              <w:bottom w:val="single" w:sz="4" w:space="0" w:color="BFBFBF"/>
+              <w:right w:val="single" w:sz="4" w:space="0" w:color="BFBFBF"/>
+            </w:tcBorders>
+          </w:tcPr>
+          <w:p>
+            <w:r/>
           </w:p>
         </w:tc>
       </w:tr>
@@ -2033,7 +2227,257 @@
                 <w:color w:val="000000"/>
                 <w:sz w:val="22"/>
               </w:rPr>
-              <w:t>Kết luận:</w:t>
+              <w:t>Theo dõi, hỗ trợ:</w:t>
+            </w:r>
+            <w:r>
+              <w:rPr>
+                <w:rFonts w:ascii="Times New Roman" w:hAnsi="Times New Roman"/>
+                <w:color w:val="000000"/>
+                <w:sz w:val="22"/>
+              </w:rPr>
+              <w:t xml:space="preserve"> Giáo viên theo dõi, quan sát và hỗ trợ gợi ý các nhóm khi cần thiết.</w:t>
+            </w:r>
+          </w:p>
+        </w:tc>
+        <w:tc>
+          <w:tcPr>
+            <w:tcW w:type="dxa" w:w="4535"/>
+            <w:tcMar>
+              <w:top w:w="114" w:type="dxa"/>
+              <w:bottom w:w="114" w:type="dxa"/>
+              <w:left w:w="170" w:type="dxa"/>
+              <w:right w:w="170" w:type="dxa"/>
+            </w:tcMar>
+            <w:tcBorders>
+              <w:top w:val="single" w:sz="4" w:space="0" w:color="BFBFBF"/>
+              <w:left w:val="single" w:sz="4" w:space="0" w:color="BFBFBF"/>
+              <w:bottom w:val="single" w:sz="4" w:space="0" w:color="BFBFBF"/>
+              <w:right w:val="single" w:sz="4" w:space="0" w:color="BFBFBF"/>
+            </w:tcBorders>
+          </w:tcPr>
+          <w:p>
+            <w:pPr>
+              <w:spacing w:before="40" w:after="40" w:line="276" w:lineRule="auto"/>
+              <w:jc w:val="left"/>
+            </w:pPr>
+            <w:r/>
+            <w:r>
+              <w:rPr>
+                <w:rFonts w:ascii="Times New Roman" w:hAnsi="Times New Roman"/>
+                <w:b/>
+                <w:color w:val="000000"/>
+                <w:sz w:val="22"/>
+              </w:rPr>
+              <w:t>Thực hiện nhiệm vụ:</w:t>
+            </w:r>
+          </w:p>
+          <w:p>
+            <w:pPr>
+              <w:spacing w:before="40" w:after="40" w:line="276" w:lineRule="auto"/>
+              <w:ind w:left="170" w:hanging="113"/>
+              <w:jc w:val="left"/>
+            </w:pPr>
+            <w:r>
+              <w:rPr>
+                <w:rFonts w:ascii="Times New Roman" w:hAnsi="Times New Roman"/>
+                <w:color w:val="000000"/>
+                <w:sz w:val="22"/>
+              </w:rPr>
+              <w:t xml:space="preserve">- </w:t>
+            </w:r>
+            <w:r>
+              <w:rPr>
+                <w:rFonts w:ascii="Times New Roman" w:hAnsi="Times New Roman"/>
+                <w:color w:val="000000"/>
+                <w:sz w:val="22"/>
+              </w:rPr>
+              <w:t>HS quan sát mô phỏng/thí nghiệm ống ete đậy nút cao su của GV.</w:t>
+            </w:r>
+          </w:p>
+          <w:p>
+            <w:pPr>
+              <w:spacing w:before="40" w:after="40" w:line="276" w:lineRule="auto"/>
+              <w:ind w:left="170" w:hanging="113"/>
+              <w:jc w:val="left"/>
+            </w:pPr>
+            <w:r>
+              <w:rPr>
+                <w:rFonts w:ascii="Times New Roman" w:hAnsi="Times New Roman"/>
+                <w:color w:val="000000"/>
+                <w:sz w:val="22"/>
+              </w:rPr>
+              <w:t xml:space="preserve">- </w:t>
+            </w:r>
+            <w:r>
+              <w:rPr>
+                <w:rFonts w:ascii="Times New Roman" w:hAnsi="Times New Roman"/>
+                <w:color w:val="000000"/>
+                <w:sz w:val="22"/>
+              </w:rPr>
+              <w:t>Trao đổi cặp đôi giải thích hiện tượng và điền khuyết lý thuyết vào PHT.</w:t>
+            </w:r>
+          </w:p>
+        </w:tc>
+      </w:tr>
+      <w:tr>
+        <w:trPr>
+          <w:cantSplit/>
+        </w:trPr>
+        <w:tc>
+          <w:tcPr>
+            <w:tcW w:type="dxa" w:w="4535"/>
+            <w:tcMar>
+              <w:top w:w="114" w:type="dxa"/>
+              <w:bottom w:w="114" w:type="dxa"/>
+              <w:left w:w="170" w:type="dxa"/>
+              <w:right w:w="170" w:type="dxa"/>
+            </w:tcMar>
+            <w:tcBorders>
+              <w:top w:val="single" w:sz="4" w:space="0" w:color="BFBFBF"/>
+              <w:left w:val="single" w:sz="4" w:space="0" w:color="BFBFBF"/>
+              <w:bottom w:val="single" w:sz="4" w:space="0" w:color="BFBFBF"/>
+              <w:right w:val="single" w:sz="4" w:space="0" w:color="BFBFBF"/>
+            </w:tcBorders>
+          </w:tcPr>
+          <w:p>
+            <w:pPr>
+              <w:spacing w:before="40" w:after="40" w:line="276" w:lineRule="auto"/>
+              <w:jc w:val="left"/>
+            </w:pPr>
+            <w:r/>
+            <w:r>
+              <w:rPr>
+                <w:rFonts w:ascii="Times New Roman" w:hAnsi="Times New Roman"/>
+                <w:b/>
+                <w:color w:val="000000"/>
+                <w:sz w:val="22"/>
+              </w:rPr>
+              <w:t>Tổ chức báo cáo:</w:t>
+            </w:r>
+            <w:r>
+              <w:rPr>
+                <w:rFonts w:ascii="Times New Roman" w:hAnsi="Times New Roman"/>
+                <w:color w:val="000000"/>
+                <w:sz w:val="22"/>
+              </w:rPr>
+              <w:t xml:space="preserve"> Giáo viên điều hành, gọi đại diện báo cáo kết quả, tổ chức nhận xét phản biện chéo giữa các học sinh.</w:t>
+            </w:r>
+          </w:p>
+        </w:tc>
+        <w:tc>
+          <w:tcPr>
+            <w:tcW w:type="dxa" w:w="4535"/>
+            <w:tcMar>
+              <w:top w:w="114" w:type="dxa"/>
+              <w:bottom w:w="114" w:type="dxa"/>
+              <w:left w:w="170" w:type="dxa"/>
+              <w:right w:w="170" w:type="dxa"/>
+            </w:tcMar>
+            <w:tcBorders>
+              <w:top w:val="single" w:sz="4" w:space="0" w:color="BFBFBF"/>
+              <w:left w:val="single" w:sz="4" w:space="0" w:color="BFBFBF"/>
+              <w:bottom w:val="single" w:sz="4" w:space="0" w:color="BFBFBF"/>
+              <w:right w:val="single" w:sz="4" w:space="0" w:color="BFBFBF"/>
+            </w:tcBorders>
+          </w:tcPr>
+          <w:p>
+            <w:pPr>
+              <w:spacing w:before="40" w:after="40" w:line="276" w:lineRule="auto"/>
+              <w:jc w:val="left"/>
+            </w:pPr>
+            <w:r/>
+            <w:r>
+              <w:rPr>
+                <w:rFonts w:ascii="Times New Roman" w:hAnsi="Times New Roman"/>
+                <w:b/>
+                <w:color w:val="000000"/>
+                <w:sz w:val="22"/>
+              </w:rPr>
+              <w:t>Báo cáo, thảo luận:</w:t>
+            </w:r>
+          </w:p>
+          <w:p>
+            <w:pPr>
+              <w:spacing w:before="40" w:after="40" w:line="276" w:lineRule="auto"/>
+              <w:ind w:left="170" w:hanging="113"/>
+              <w:jc w:val="left"/>
+            </w:pPr>
+            <w:r>
+              <w:rPr>
+                <w:rFonts w:ascii="Times New Roman" w:hAnsi="Times New Roman"/>
+                <w:color w:val="000000"/>
+                <w:sz w:val="22"/>
+              </w:rPr>
+              <w:t xml:space="preserve">- </w:t>
+            </w:r>
+            <w:r>
+              <w:rPr>
+                <w:rFonts w:ascii="Times New Roman" w:hAnsi="Times New Roman"/>
+                <w:color w:val="000000"/>
+                <w:sz w:val="22"/>
+              </w:rPr>
+              <w:t>Đại diện HS đứng lên đọc từ khóa điền khuyết.</w:t>
+            </w:r>
+          </w:p>
+          <w:p>
+            <w:pPr>
+              <w:spacing w:before="40" w:after="40" w:line="276" w:lineRule="auto"/>
+              <w:ind w:left="170" w:hanging="113"/>
+              <w:jc w:val="left"/>
+            </w:pPr>
+            <w:r>
+              <w:rPr>
+                <w:rFonts w:ascii="Times New Roman" w:hAnsi="Times New Roman"/>
+                <w:color w:val="000000"/>
+                <w:sz w:val="22"/>
+              </w:rPr>
+              <w:t xml:space="preserve">- </w:t>
+            </w:r>
+            <w:r>
+              <w:rPr>
+                <w:rFonts w:ascii="Times New Roman" w:hAnsi="Times New Roman"/>
+                <w:color w:val="000000"/>
+                <w:sz w:val="22"/>
+              </w:rPr>
+              <w:t>HS khác nhận xét chéo.</w:t>
+            </w:r>
+          </w:p>
+        </w:tc>
+      </w:tr>
+      <w:tr>
+        <w:trPr>
+          <w:cantSplit/>
+        </w:trPr>
+        <w:tc>
+          <w:tcPr>
+            <w:tcW w:type="dxa" w:w="4535"/>
+            <w:tcMar>
+              <w:top w:w="114" w:type="dxa"/>
+              <w:bottom w:w="114" w:type="dxa"/>
+              <w:left w:w="170" w:type="dxa"/>
+              <w:right w:w="170" w:type="dxa"/>
+            </w:tcMar>
+            <w:tcBorders>
+              <w:top w:val="single" w:sz="4" w:space="0" w:color="BFBFBF"/>
+              <w:left w:val="single" w:sz="4" w:space="0" w:color="BFBFBF"/>
+              <w:bottom w:val="single" w:sz="4" w:space="0" w:color="BFBFBF"/>
+              <w:right w:val="single" w:sz="4" w:space="0" w:color="BFBFBF"/>
+            </w:tcBorders>
+          </w:tcPr>
+          <w:p>
+            <w:pPr>
+              <w:spacing w:before="40" w:after="40" w:line="276" w:lineRule="auto"/>
+              <w:jc w:val="left"/>
+            </w:pPr>
+            <w:r/>
+            <w:r>
+              <w:rPr>
+                <w:rFonts w:ascii="Times New Roman" w:hAnsi="Times New Roman"/>
+                <w:b/>
+                <w:color w:val="000000"/>
+                <w:sz w:val="22"/>
+              </w:rPr>
+              <w:t>Kết luận, nhận định:</w:t>
             </w:r>
           </w:p>
           <w:p>
@@ -2146,22 +2590,7 @@
                 <w:color w:val="000000"/>
                 <w:sz w:val="22"/>
               </w:rPr>
-              <w:t>Báo cáo, thảo luận:</w:t>
-            </w:r>
-          </w:p>
-          <w:p>
-            <w:pPr>
-              <w:spacing w:before="40" w:after="40" w:line="276" w:lineRule="auto"/>
-              <w:ind w:left="170" w:hanging="113"/>
-              <w:jc w:val="left"/>
-            </w:pPr>
-            <w:r>
-              <w:rPr>
-                <w:rFonts w:ascii="Times New Roman" w:hAnsi="Times New Roman"/>
-                <w:color w:val="000000"/>
-                <w:sz w:val="22"/>
-              </w:rPr>
-              <w:t xml:space="preserve">- </w:t>
+              <w:t>Ghi nhận kiến thức:</w:t>
             </w:r>
             <w:r>
               <w:rPr>
@@ -2169,30 +2598,7 @@
                 <w:color w:val="000000"/>
                 <w:sz w:val="22"/>
               </w:rPr>
-              <w:t>Đại diện HS đứng lên đọc từ khóa điền khuyết.</w:t>
-            </w:r>
-          </w:p>
-          <w:p>
-            <w:pPr>
-              <w:spacing w:before="40" w:after="40" w:line="276" w:lineRule="auto"/>
-              <w:ind w:left="170" w:hanging="113"/>
-              <w:jc w:val="left"/>
-            </w:pPr>
-            <w:r>
-              <w:rPr>
-                <w:rFonts w:ascii="Times New Roman" w:hAnsi="Times New Roman"/>
-                <w:color w:val="000000"/>
-                <w:sz w:val="22"/>
-              </w:rPr>
-              <w:t xml:space="preserve">- </w:t>
-            </w:r>
-            <w:r>
-              <w:rPr>
-                <w:rFonts w:ascii="Times New Roman" w:hAnsi="Times New Roman"/>
-                <w:color w:val="000000"/>
-                <w:sz w:val="22"/>
-              </w:rPr>
-              <w:t>HS khác nhận xét chéo.</w:t>
+              <w:t xml:space="preserve"> Học sinh đối chiếu, sửa đổi kết quả bài làm và ghi nhận kiến thức cốt lõi vào vở.</w:t>
             </w:r>
           </w:p>
         </w:tc>
@@ -3002,6 +3408,93 @@
                 <w:color w:val="000000"/>
                 <w:sz w:val="22"/>
               </w:rPr>
+              <w:t>Tiếp nhận nhiệm vụ:</w:t>
+            </w:r>
+            <w:r>
+              <w:rPr>
+                <w:rFonts w:ascii="Times New Roman" w:hAnsi="Times New Roman"/>
+                <w:color w:val="000000"/>
+                <w:sz w:val="22"/>
+              </w:rPr>
+              <w:t xml:space="preserve"> Học sinh tiếp nhận nhiệm vụ học tập từ giáo viên.</w:t>
+            </w:r>
+          </w:p>
+        </w:tc>
+      </w:tr>
+      <w:tr>
+        <w:trPr>
+          <w:cantSplit/>
+        </w:trPr>
+        <w:tc>
+          <w:tcPr>
+            <w:tcW w:type="dxa" w:w="4535"/>
+            <w:tcMar>
+              <w:top w:w="114" w:type="dxa"/>
+              <w:bottom w:w="114" w:type="dxa"/>
+              <w:left w:w="170" w:type="dxa"/>
+              <w:right w:w="170" w:type="dxa"/>
+            </w:tcMar>
+            <w:tcBorders>
+              <w:top w:val="single" w:sz="4" w:space="0" w:color="BFBFBF"/>
+              <w:left w:val="single" w:sz="4" w:space="0" w:color="BFBFBF"/>
+              <w:bottom w:val="single" w:sz="4" w:space="0" w:color="BFBFBF"/>
+              <w:right w:val="single" w:sz="4" w:space="0" w:color="BFBFBF"/>
+            </w:tcBorders>
+          </w:tcPr>
+          <w:p>
+            <w:pPr>
+              <w:spacing w:before="40" w:after="40" w:line="276" w:lineRule="auto"/>
+              <w:jc w:val="left"/>
+            </w:pPr>
+            <w:r/>
+            <w:r>
+              <w:rPr>
+                <w:rFonts w:ascii="Times New Roman" w:hAnsi="Times New Roman"/>
+                <w:b/>
+                <w:color w:val="000000"/>
+                <w:sz w:val="22"/>
+              </w:rPr>
+              <w:t>Theo dõi, hỗ trợ:</w:t>
+            </w:r>
+            <w:r>
+              <w:rPr>
+                <w:rFonts w:ascii="Times New Roman" w:hAnsi="Times New Roman"/>
+                <w:color w:val="000000"/>
+                <w:sz w:val="22"/>
+              </w:rPr>
+              <w:t xml:space="preserve"> Giáo viên theo dõi, quan sát và hỗ trợ gợi ý các nhóm khi cần thiết.</w:t>
+            </w:r>
+          </w:p>
+        </w:tc>
+        <w:tc>
+          <w:tcPr>
+            <w:tcW w:type="dxa" w:w="4535"/>
+            <w:tcMar>
+              <w:top w:w="114" w:type="dxa"/>
+              <w:bottom w:w="114" w:type="dxa"/>
+              <w:left w:w="170" w:type="dxa"/>
+              <w:right w:w="170" w:type="dxa"/>
+            </w:tcMar>
+            <w:tcBorders>
+              <w:top w:val="single" w:sz="4" w:space="0" w:color="BFBFBF"/>
+              <w:left w:val="single" w:sz="4" w:space="0" w:color="BFBFBF"/>
+              <w:bottom w:val="single" w:sz="4" w:space="0" w:color="BFBFBF"/>
+              <w:right w:val="single" w:sz="4" w:space="0" w:color="BFBFBF"/>
+            </w:tcBorders>
+          </w:tcPr>
+          <w:p>
+            <w:pPr>
+              <w:spacing w:before="40" w:after="40" w:line="276" w:lineRule="auto"/>
+              <w:jc w:val="left"/>
+            </w:pPr>
+            <w:r/>
+            <w:r>
+              <w:rPr>
+                <w:rFonts w:ascii="Times New Roman" w:hAnsi="Times New Roman"/>
+                <w:b/>
+                <w:color w:val="000000"/>
+                <w:sz w:val="22"/>
+              </w:rPr>
               <w:t>Thực hiện nhiệm vụ:</w:t>
             </w:r>
           </w:p>
@@ -3137,22 +3630,7 @@
                 <w:color w:val="000000"/>
                 <w:sz w:val="22"/>
               </w:rPr>
-              <w:t>Kết luận:</w:t>
-            </w:r>
-          </w:p>
-          <w:p>
-            <w:pPr>
-              <w:spacing w:before="40" w:after="40" w:line="276" w:lineRule="auto"/>
-              <w:ind w:left="170" w:hanging="113"/>
-              <w:jc w:val="left"/>
-            </w:pPr>
-            <w:r>
-              <w:rPr>
-                <w:rFonts w:ascii="Times New Roman" w:hAnsi="Times New Roman"/>
-                <w:color w:val="000000"/>
-                <w:sz w:val="22"/>
-              </w:rPr>
-              <w:t xml:space="preserve">- </w:t>
+              <w:t>Tổ chức báo cáo:</w:t>
             </w:r>
             <w:r>
               <w:rPr>
@@ -3160,41 +3638,7 @@
                 <w:color w:val="000000"/>
                 <w:sz w:val="22"/>
               </w:rPr>
-              <w:t xml:space="preserve">GV chuẩn hóa đáp án: </w:t>
-            </w:r>
-            <w:r>
-              <w:rPr>
-                <w:rFonts w:ascii="Times New Roman" w:hAnsi="Times New Roman"/>
-                <w:i/>
-                <w:color w:val="000000"/>
-                <w:sz w:val="22"/>
-              </w:rPr>
-              <w:t>Δ U = 200 - 120 = 80 J</w:t>
-            </w:r>
-            <w:r>
-              <w:rPr>
-                <w:rFonts w:ascii="Times New Roman" w:hAnsi="Times New Roman"/>
-                <w:color w:val="000000"/>
-                <w:sz w:val="22"/>
-              </w:rPr>
-              <w:t xml:space="preserve">. Nội năng khí tăng </w:t>
-            </w:r>
-            <w:r>
-              <w:rPr>
-                <w:rFonts w:ascii="Times New Roman" w:hAnsi="Times New Roman"/>
-                <w:i/>
-                <w:color w:val="000000"/>
-                <w:sz w:val="22"/>
-              </w:rPr>
-              <w:t>80 J</w:t>
-            </w:r>
-            <w:r>
-              <w:rPr>
-                <w:rFonts w:ascii="Times New Roman" w:hAnsi="Times New Roman"/>
-                <w:color w:val="000000"/>
-                <w:sz w:val="22"/>
-              </w:rPr>
-              <w:t>.</w:t>
+              <w:t xml:space="preserve"> Giáo viên điều hành, gọi đại diện báo cáo kết quả, tổ chức nhận xét phản biện chéo giữa các học sinh.</w:t>
             </w:r>
           </w:p>
         </w:tc>
@@ -3308,6 +3752,142 @@
                 <w:sz w:val="22"/>
               </w:rPr>
               <w:t>.</w:t>
+            </w:r>
+          </w:p>
+        </w:tc>
+      </w:tr>
+      <w:tr>
+        <w:trPr>
+          <w:cantSplit/>
+        </w:trPr>
+        <w:tc>
+          <w:tcPr>
+            <w:tcW w:type="dxa" w:w="4535"/>
+            <w:tcMar>
+              <w:top w:w="114" w:type="dxa"/>
+              <w:bottom w:w="114" w:type="dxa"/>
+              <w:left w:w="170" w:type="dxa"/>
+              <w:right w:w="170" w:type="dxa"/>
+            </w:tcMar>
+            <w:tcBorders>
+              <w:top w:val="single" w:sz="4" w:space="0" w:color="BFBFBF"/>
+              <w:left w:val="single" w:sz="4" w:space="0" w:color="BFBFBF"/>
+              <w:bottom w:val="single" w:sz="4" w:space="0" w:color="BFBFBF"/>
+              <w:right w:val="single" w:sz="4" w:space="0" w:color="BFBFBF"/>
+            </w:tcBorders>
+          </w:tcPr>
+          <w:p>
+            <w:pPr>
+              <w:spacing w:before="40" w:after="40" w:line="276" w:lineRule="auto"/>
+              <w:jc w:val="left"/>
+            </w:pPr>
+            <w:r/>
+            <w:r>
+              <w:rPr>
+                <w:rFonts w:ascii="Times New Roman" w:hAnsi="Times New Roman"/>
+                <w:b/>
+                <w:color w:val="000000"/>
+                <w:sz w:val="22"/>
+              </w:rPr>
+              <w:t>Kết luận, nhận định:</w:t>
+            </w:r>
+          </w:p>
+          <w:p>
+            <w:pPr>
+              <w:spacing w:before="40" w:after="40" w:line="276" w:lineRule="auto"/>
+              <w:ind w:left="170" w:hanging="113"/>
+              <w:jc w:val="left"/>
+            </w:pPr>
+            <w:r>
+              <w:rPr>
+                <w:rFonts w:ascii="Times New Roman" w:hAnsi="Times New Roman"/>
+                <w:color w:val="000000"/>
+                <w:sz w:val="22"/>
+              </w:rPr>
+              <w:t xml:space="preserve">- </w:t>
+            </w:r>
+            <w:r>
+              <w:rPr>
+                <w:rFonts w:ascii="Times New Roman" w:hAnsi="Times New Roman"/>
+                <w:color w:val="000000"/>
+                <w:sz w:val="22"/>
+              </w:rPr>
+              <w:t xml:space="preserve">GV chuẩn hóa đáp án: </w:t>
+            </w:r>
+            <w:r>
+              <w:rPr>
+                <w:rFonts w:ascii="Times New Roman" w:hAnsi="Times New Roman"/>
+                <w:i/>
+                <w:color w:val="000000"/>
+                <w:sz w:val="22"/>
+              </w:rPr>
+              <w:t>Δ U = 200 - 120 = 80 J</w:t>
+            </w:r>
+            <w:r>
+              <w:rPr>
+                <w:rFonts w:ascii="Times New Roman" w:hAnsi="Times New Roman"/>
+                <w:color w:val="000000"/>
+                <w:sz w:val="22"/>
+              </w:rPr>
+              <w:t xml:space="preserve">. Nội năng khí tăng </w:t>
+            </w:r>
+            <w:r>
+              <w:rPr>
+                <w:rFonts w:ascii="Times New Roman" w:hAnsi="Times New Roman"/>
+                <w:i/>
+                <w:color w:val="000000"/>
+                <w:sz w:val="22"/>
+              </w:rPr>
+              <w:t>80 J</w:t>
+            </w:r>
+            <w:r>
+              <w:rPr>
+                <w:rFonts w:ascii="Times New Roman" w:hAnsi="Times New Roman"/>
+                <w:color w:val="000000"/>
+                <w:sz w:val="22"/>
+              </w:rPr>
+              <w:t>.</w:t>
+            </w:r>
+          </w:p>
+        </w:tc>
+        <w:tc>
+          <w:tcPr>
+            <w:tcW w:type="dxa" w:w="4535"/>
+            <w:tcMar>
+              <w:top w:w="114" w:type="dxa"/>
+              <w:bottom w:w="114" w:type="dxa"/>
+              <w:left w:w="170" w:type="dxa"/>
+              <w:right w:w="170" w:type="dxa"/>
+            </w:tcMar>
+            <w:tcBorders>
+              <w:top w:val="single" w:sz="4" w:space="0" w:color="BFBFBF"/>
+              <w:left w:val="single" w:sz="4" w:space="0" w:color="BFBFBF"/>
+              <w:bottom w:val="single" w:sz="4" w:space="0" w:color="BFBFBF"/>
+              <w:right w:val="single" w:sz="4" w:space="0" w:color="BFBFBF"/>
+            </w:tcBorders>
+          </w:tcPr>
+          <w:p>
+            <w:pPr>
+              <w:spacing w:before="40" w:after="40" w:line="276" w:lineRule="auto"/>
+              <w:jc w:val="left"/>
+            </w:pPr>
+            <w:r/>
+            <w:r>
+              <w:rPr>
+                <w:rFonts w:ascii="Times New Roman" w:hAnsi="Times New Roman"/>
+                <w:b/>
+                <w:color w:val="000000"/>
+                <w:sz w:val="22"/>
+              </w:rPr>
+              <w:t>Ghi nhận kiến thức:</w:t>
+            </w:r>
+            <w:r>
+              <w:rPr>
+                <w:rFonts w:ascii="Times New Roman" w:hAnsi="Times New Roman"/>
+                <w:color w:val="000000"/>
+                <w:sz w:val="22"/>
+              </w:rPr>
+              <w:t xml:space="preserve"> Học sinh đối chiếu, sửa đổi kết quả bài làm và ghi nhận kiến thức cốt lõi vào vở.</w:t>
             </w:r>
           </w:p>
         </w:tc>
@@ -3616,6 +4196,93 @@
                 <w:color w:val="000000"/>
                 <w:sz w:val="22"/>
               </w:rPr>
+              <w:t>Tiếp nhận nhiệm vụ:</w:t>
+            </w:r>
+            <w:r>
+              <w:rPr>
+                <w:rFonts w:ascii="Times New Roman" w:hAnsi="Times New Roman"/>
+                <w:color w:val="000000"/>
+                <w:sz w:val="22"/>
+              </w:rPr>
+              <w:t xml:space="preserve"> Học sinh tiếp nhận nhiệm vụ học tập từ giáo viên.</w:t>
+            </w:r>
+          </w:p>
+        </w:tc>
+      </w:tr>
+      <w:tr>
+        <w:trPr>
+          <w:cantSplit/>
+        </w:trPr>
+        <w:tc>
+          <w:tcPr>
+            <w:tcW w:type="dxa" w:w="4535"/>
+            <w:tcMar>
+              <w:top w:w="114" w:type="dxa"/>
+              <w:bottom w:w="114" w:type="dxa"/>
+              <w:left w:w="170" w:type="dxa"/>
+              <w:right w:w="170" w:type="dxa"/>
+            </w:tcMar>
+            <w:tcBorders>
+              <w:top w:val="single" w:sz="4" w:space="0" w:color="BFBFBF"/>
+              <w:left w:val="single" w:sz="4" w:space="0" w:color="BFBFBF"/>
+              <w:bottom w:val="single" w:sz="4" w:space="0" w:color="BFBFBF"/>
+              <w:right w:val="single" w:sz="4" w:space="0" w:color="BFBFBF"/>
+            </w:tcBorders>
+          </w:tcPr>
+          <w:p>
+            <w:pPr>
+              <w:spacing w:before="40" w:after="40" w:line="276" w:lineRule="auto"/>
+              <w:jc w:val="left"/>
+            </w:pPr>
+            <w:r/>
+            <w:r>
+              <w:rPr>
+                <w:rFonts w:ascii="Times New Roman" w:hAnsi="Times New Roman"/>
+                <w:b/>
+                <w:color w:val="000000"/>
+                <w:sz w:val="22"/>
+              </w:rPr>
+              <w:t>Theo dõi, hỗ trợ:</w:t>
+            </w:r>
+            <w:r>
+              <w:rPr>
+                <w:rFonts w:ascii="Times New Roman" w:hAnsi="Times New Roman"/>
+                <w:color w:val="000000"/>
+                <w:sz w:val="22"/>
+              </w:rPr>
+              <w:t xml:space="preserve"> Giáo viên theo dõi, quan sát và hỗ trợ gợi ý các nhóm khi cần thiết.</w:t>
+            </w:r>
+          </w:p>
+        </w:tc>
+        <w:tc>
+          <w:tcPr>
+            <w:tcW w:type="dxa" w:w="4535"/>
+            <w:tcMar>
+              <w:top w:w="114" w:type="dxa"/>
+              <w:bottom w:w="114" w:type="dxa"/>
+              <w:left w:w="170" w:type="dxa"/>
+              <w:right w:w="170" w:type="dxa"/>
+            </w:tcMar>
+            <w:tcBorders>
+              <w:top w:val="single" w:sz="4" w:space="0" w:color="BFBFBF"/>
+              <w:left w:val="single" w:sz="4" w:space="0" w:color="BFBFBF"/>
+              <w:bottom w:val="single" w:sz="4" w:space="0" w:color="BFBFBF"/>
+              <w:right w:val="single" w:sz="4" w:space="0" w:color="BFBFBF"/>
+            </w:tcBorders>
+          </w:tcPr>
+          <w:p>
+            <w:pPr>
+              <w:spacing w:before="40" w:after="40" w:line="276" w:lineRule="auto"/>
+              <w:jc w:val="left"/>
+            </w:pPr>
+            <w:r/>
+            <w:r>
+              <w:rPr>
+                <w:rFonts w:ascii="Times New Roman" w:hAnsi="Times New Roman"/>
+                <w:b/>
+                <w:color w:val="000000"/>
+                <w:sz w:val="22"/>
+              </w:rPr>
               <w:t>Thực hiện nhiệm vụ:</w:t>
             </w:r>
           </w:p>
@@ -3751,7 +4418,167 @@
                 <w:color w:val="000000"/>
                 <w:sz w:val="22"/>
               </w:rPr>
-              <w:t>Kết luận:</w:t>
+              <w:t>Tổ chức báo cáo:</w:t>
+            </w:r>
+            <w:r>
+              <w:rPr>
+                <w:rFonts w:ascii="Times New Roman" w:hAnsi="Times New Roman"/>
+                <w:color w:val="000000"/>
+                <w:sz w:val="22"/>
+              </w:rPr>
+              <w:t xml:space="preserve"> Giáo viên điều hành, gọi đại diện báo cáo kết quả, tổ chức nhận xét phản biện chéo giữa các học sinh.</w:t>
+            </w:r>
+          </w:p>
+        </w:tc>
+        <w:tc>
+          <w:tcPr>
+            <w:tcW w:type="dxa" w:w="4535"/>
+            <w:tcMar>
+              <w:top w:w="114" w:type="dxa"/>
+              <w:bottom w:w="114" w:type="dxa"/>
+              <w:left w:w="170" w:type="dxa"/>
+              <w:right w:w="170" w:type="dxa"/>
+            </w:tcMar>
+            <w:tcBorders>
+              <w:top w:val="single" w:sz="4" w:space="0" w:color="BFBFBF"/>
+              <w:left w:val="single" w:sz="4" w:space="0" w:color="BFBFBF"/>
+              <w:bottom w:val="single" w:sz="4" w:space="0" w:color="BFBFBF"/>
+              <w:right w:val="single" w:sz="4" w:space="0" w:color="BFBFBF"/>
+            </w:tcBorders>
+          </w:tcPr>
+          <w:p>
+            <w:pPr>
+              <w:spacing w:before="40" w:after="40" w:line="276" w:lineRule="auto"/>
+              <w:jc w:val="left"/>
+            </w:pPr>
+            <w:r/>
+            <w:r>
+              <w:rPr>
+                <w:rFonts w:ascii="Times New Roman" w:hAnsi="Times New Roman"/>
+                <w:b/>
+                <w:color w:val="000000"/>
+                <w:sz w:val="22"/>
+              </w:rPr>
+              <w:t>Báo cáo, thảo luận:</w:t>
+            </w:r>
+          </w:p>
+        </w:tc>
+      </w:tr>
+      <w:tr>
+        <w:trPr>
+          <w:cantSplit/>
+        </w:trPr>
+        <w:tc>
+          <w:tcPr>
+            <w:tcW w:type="dxa" w:w="4535"/>
+            <w:tcMar>
+              <w:top w:w="114" w:type="dxa"/>
+              <w:bottom w:w="114" w:type="dxa"/>
+              <w:left w:w="170" w:type="dxa"/>
+              <w:right w:w="170" w:type="dxa"/>
+            </w:tcMar>
+            <w:tcBorders>
+              <w:top w:val="single" w:sz="4" w:space="0" w:color="BFBFBF"/>
+              <w:left w:val="single" w:sz="4" w:space="0" w:color="BFBFBF"/>
+              <w:bottom w:val="single" w:sz="4" w:space="0" w:color="BFBFBF"/>
+              <w:right w:val="single" w:sz="4" w:space="0" w:color="BFBFBF"/>
+            </w:tcBorders>
+          </w:tcPr>
+          <w:p>
+            <w:r/>
+          </w:p>
+        </w:tc>
+        <w:tc>
+          <w:tcPr>
+            <w:tcW w:type="dxa" w:w="4535"/>
+            <w:tcMar>
+              <w:top w:w="114" w:type="dxa"/>
+              <w:bottom w:w="114" w:type="dxa"/>
+              <w:left w:w="170" w:type="dxa"/>
+              <w:right w:w="170" w:type="dxa"/>
+            </w:tcMar>
+            <w:tcBorders>
+              <w:top w:val="single" w:sz="4" w:space="0" w:color="BFBFBF"/>
+              <w:left w:val="single" w:sz="4" w:space="0" w:color="BFBFBF"/>
+              <w:bottom w:val="single" w:sz="4" w:space="0" w:color="BFBFBF"/>
+              <w:right w:val="single" w:sz="4" w:space="0" w:color="BFBFBF"/>
+            </w:tcBorders>
+          </w:tcPr>
+          <w:p>
+            <w:pPr>
+              <w:spacing w:before="40" w:after="40" w:line="276" w:lineRule="auto"/>
+              <w:jc w:val="left"/>
+            </w:pPr>
+            <w:r/>
+            <w:r>
+              <w:rPr>
+                <w:rFonts w:ascii="Times New Roman" w:hAnsi="Times New Roman"/>
+                <w:b/>
+                <w:color w:val="000000"/>
+                <w:sz w:val="22"/>
+              </w:rPr>
+              <w:t>Báo cáo:</w:t>
+            </w:r>
+          </w:p>
+          <w:p>
+            <w:pPr>
+              <w:spacing w:before="40" w:after="40" w:line="276" w:lineRule="auto"/>
+              <w:ind w:left="170" w:hanging="113"/>
+              <w:jc w:val="left"/>
+            </w:pPr>
+            <w:r>
+              <w:rPr>
+                <w:rFonts w:ascii="Times New Roman" w:hAnsi="Times New Roman"/>
+                <w:color w:val="000000"/>
+                <w:sz w:val="22"/>
+              </w:rPr>
+              <w:t xml:space="preserve">- </w:t>
+            </w:r>
+            <w:r>
+              <w:rPr>
+                <w:rFonts w:ascii="Times New Roman" w:hAnsi="Times New Roman"/>
+                <w:color w:val="000000"/>
+                <w:sz w:val="22"/>
+              </w:rPr>
+              <w:t>HS nộp lại PHT trước khi ra về.</w:t>
+            </w:r>
+          </w:p>
+        </w:tc>
+      </w:tr>
+      <w:tr>
+        <w:trPr>
+          <w:cantSplit/>
+        </w:trPr>
+        <w:tc>
+          <w:tcPr>
+            <w:tcW w:type="dxa" w:w="4535"/>
+            <w:tcMar>
+              <w:top w:w="114" w:type="dxa"/>
+              <w:bottom w:w="114" w:type="dxa"/>
+              <w:left w:w="170" w:type="dxa"/>
+              <w:right w:w="170" w:type="dxa"/>
+            </w:tcMar>
+            <w:tcBorders>
+              <w:top w:val="single" w:sz="4" w:space="0" w:color="BFBFBF"/>
+              <w:left w:val="single" w:sz="4" w:space="0" w:color="BFBFBF"/>
+              <w:bottom w:val="single" w:sz="4" w:space="0" w:color="BFBFBF"/>
+              <w:right w:val="single" w:sz="4" w:space="0" w:color="BFBFBF"/>
+            </w:tcBorders>
+          </w:tcPr>
+          <w:p>
+            <w:pPr>
+              <w:spacing w:before="40" w:after="40" w:line="276" w:lineRule="auto"/>
+              <w:jc w:val="left"/>
+            </w:pPr>
+            <w:r/>
+            <w:r>
+              <w:rPr>
+                <w:rFonts w:ascii="Times New Roman" w:hAnsi="Times New Roman"/>
+                <w:b/>
+                <w:color w:val="000000"/>
+                <w:sz w:val="22"/>
+              </w:rPr>
+              <w:t>Kết luận, nhận định:</w:t>
             </w:r>
           </w:p>
           <w:p>
@@ -3807,22 +4634,7 @@
                 <w:color w:val="000000"/>
                 <w:sz w:val="22"/>
               </w:rPr>
-              <w:t>Báo cáo:</w:t>
-            </w:r>
-          </w:p>
-          <w:p>
-            <w:pPr>
-              <w:spacing w:before="40" w:after="40" w:line="276" w:lineRule="auto"/>
-              <w:ind w:left="170" w:hanging="113"/>
-              <w:jc w:val="left"/>
-            </w:pPr>
-            <w:r>
-              <w:rPr>
-                <w:rFonts w:ascii="Times New Roman" w:hAnsi="Times New Roman"/>
-                <w:color w:val="000000"/>
-                <w:sz w:val="22"/>
-              </w:rPr>
-              <w:t xml:space="preserve">- </w:t>
+              <w:t>Ghi nhận kiến thức:</w:t>
             </w:r>
             <w:r>
               <w:rPr>
@@ -3830,7 +4642,7 @@
                 <w:color w:val="000000"/>
                 <w:sz w:val="22"/>
               </w:rPr>
-              <w:t>HS nộp lại PHT trước khi ra về.</w:t>
+              <w:t xml:space="preserve"> Học sinh đối chiếu, sửa đổi kết quả bài làm và ghi nhận kiến thức cốt lõi vào vở.</w:t>
             </w:r>
           </w:p>
         </w:tc>

</xml_diff>

<commit_message>
Expand Activity 2 into 5 distinct sub-activities with chronological 4-step tables
</commit_message>
<xml_diff>
--- a/agent soạn tài liệu/output/bai3_noi_nang_nhiet_luong/ready/bai3_noi_nang_nhiet_luong_ke_hoach_bai_day.docx
+++ b/agent soạn tài liệu/output/bai3_noi_nang_nhiet_luong/ready/bai3_noi_nang_nhiet_luong_ke_hoach_bai_day.docx
@@ -1830,7 +1830,7 @@
           <w:color w:val="000000"/>
           <w:sz w:val="26"/>
         </w:rPr>
-        <w:t xml:space="preserve"> HS định nghĩa được nội năng, hiểu rõ Nguyên lí I và quy ước dấu, biết công thức tính nhiệt lượng.</w:t>
+        <w:t xml:space="preserve"> HS định nghĩa được khái niệm nội năng, phân tích được các cách làm biến đổi nội năng, phát biểu và vận dụng được Nguyên lí I Nhiệt động lực học, hiểu được công thức tính nhiệt lượng và ý nghĩa vật lý của nhiệt dung riêng.</w:t>
       </w:r>
     </w:p>
     <w:p>
@@ -1865,7 +1865,179 @@
           <w:color w:val="000000"/>
           <w:sz w:val="26"/>
         </w:rPr>
-        <w:t xml:space="preserve"> Điền đầy đủ kiến thức trọng tâm ĐVKT 1 và ĐVKT 2 trên PHT.</w:t>
+        <w:t xml:space="preserve"> Lời giải các nhiệm vụ học tập từ ĐVKT 2.1 đến ĐVKT 2.5 đầy đủ trên Phiếu học tập.</w:t>
+      </w:r>
+    </w:p>
+    <w:p>
+      <w:pPr>
+        <w:pStyle w:val="Heading3"/>
+        <w:keepNext/>
+        <w:spacing w:before="120" w:after="60"/>
+        <w:ind w:left="0" w:firstLine="0"/>
+      </w:pPr>
+      <w:r>
+        <w:rPr>
+          <w:rFonts w:ascii="Times New Roman" w:hAnsi="Times New Roman"/>
+          <w:b w:val="0"/>
+          <w:i/>
+          <w:color w:val="000000"/>
+          <w:sz w:val="26"/>
+        </w:rPr>
+        <w:t>2.1. Đơn vị kiến thức 1: Khái niệm nội năng của vật</w:t>
+      </w:r>
+    </w:p>
+    <w:p>
+      <w:pPr>
+        <w:spacing w:before="60" w:after="60" w:line="312" w:lineRule="auto"/>
+        <w:ind w:left="283" w:hanging="170"/>
+        <w:jc w:val="both"/>
+      </w:pPr>
+      <w:r>
+        <w:rPr>
+          <w:rFonts w:ascii="Times New Roman" w:hAnsi="Times New Roman"/>
+          <w:color w:val="000000"/>
+          <w:sz w:val="26"/>
+        </w:rPr>
+        <w:t xml:space="preserve">- </w:t>
+      </w:r>
+      <w:r>
+        <w:rPr>
+          <w:rFonts w:ascii="Times New Roman" w:hAnsi="Times New Roman"/>
+          <w:b w:val="0"/>
+          <w:i w:val="0"/>
+          <w:color w:val="000000"/>
+          <w:sz w:val="26"/>
+        </w:rPr>
+        <w:t xml:space="preserve">  </w:t>
+      </w:r>
+      <w:r>
+        <w:rPr>
+          <w:rFonts w:ascii="Times New Roman" w:hAnsi="Times New Roman"/>
+          <w:b/>
+          <w:i w:val="0"/>
+          <w:color w:val="000000"/>
+          <w:sz w:val="26"/>
+        </w:rPr>
+        <w:t>Mục tiêu:</w:t>
+      </w:r>
+      <w:r>
+        <w:rPr>
+          <w:rFonts w:ascii="Times New Roman" w:hAnsi="Times New Roman"/>
+          <w:b w:val="0"/>
+          <w:i w:val="0"/>
+          <w:color w:val="000000"/>
+          <w:sz w:val="26"/>
+        </w:rPr>
+        <w:t xml:space="preserve"> HS định nghĩa được nội năng dưới góc độ động học phân tử là tổng động năng và thế năng của các phân tử cấu tạo nên vật: </w:t>
+      </w:r>
+      <w:r>
+        <w:rPr>
+          <w:rFonts w:ascii="Times New Roman" w:hAnsi="Times New Roman"/>
+          <w:i/>
+          <w:color w:val="000000"/>
+          <w:sz w:val="26"/>
+        </w:rPr>
+        <w:t>U = E_đ + E_t</w:t>
+      </w:r>
+      <w:r>
+        <w:rPr>
+          <w:rFonts w:ascii="Times New Roman" w:hAnsi="Times New Roman"/>
+          <w:b w:val="0"/>
+          <w:i w:val="0"/>
+          <w:color w:val="000000"/>
+          <w:sz w:val="26"/>
+        </w:rPr>
+        <w:t>.</w:t>
+      </w:r>
+    </w:p>
+    <w:p>
+      <w:pPr>
+        <w:spacing w:before="60" w:after="60" w:line="312" w:lineRule="auto"/>
+        <w:ind w:left="283" w:hanging="170"/>
+        <w:jc w:val="both"/>
+      </w:pPr>
+      <w:r>
+        <w:rPr>
+          <w:rFonts w:ascii="Times New Roman" w:hAnsi="Times New Roman"/>
+          <w:color w:val="000000"/>
+          <w:sz w:val="26"/>
+        </w:rPr>
+        <w:t xml:space="preserve">- </w:t>
+      </w:r>
+      <w:r>
+        <w:rPr>
+          <w:rFonts w:ascii="Times New Roman" w:hAnsi="Times New Roman"/>
+          <w:b w:val="0"/>
+          <w:i w:val="0"/>
+          <w:color w:val="000000"/>
+          <w:sz w:val="26"/>
+        </w:rPr>
+        <w:t xml:space="preserve">  </w:t>
+      </w:r>
+      <w:r>
+        <w:rPr>
+          <w:rFonts w:ascii="Times New Roman" w:hAnsi="Times New Roman"/>
+          <w:b/>
+          <w:i w:val="0"/>
+          <w:color w:val="000000"/>
+          <w:sz w:val="26"/>
+        </w:rPr>
+        <w:t>Nội dung:</w:t>
+      </w:r>
+      <w:r>
+        <w:rPr>
+          <w:rFonts w:ascii="Times New Roman" w:hAnsi="Times New Roman"/>
+          <w:b w:val="0"/>
+          <w:i w:val="0"/>
+          <w:color w:val="000000"/>
+          <w:sz w:val="26"/>
+        </w:rPr>
+        <w:t xml:space="preserve"> Tìm hiểu khái niệm nội năng và các đại lượng ảnh hưởng.</w:t>
+      </w:r>
+    </w:p>
+    <w:p>
+      <w:pPr>
+        <w:spacing w:before="60" w:after="60" w:line="312" w:lineRule="auto"/>
+        <w:ind w:left="283" w:hanging="170"/>
+        <w:jc w:val="both"/>
+      </w:pPr>
+      <w:r>
+        <w:rPr>
+          <w:rFonts w:ascii="Times New Roman" w:hAnsi="Times New Roman"/>
+          <w:color w:val="000000"/>
+          <w:sz w:val="26"/>
+        </w:rPr>
+        <w:t xml:space="preserve">- </w:t>
+      </w:r>
+      <w:r>
+        <w:rPr>
+          <w:rFonts w:ascii="Times New Roman" w:hAnsi="Times New Roman"/>
+          <w:b w:val="0"/>
+          <w:i w:val="0"/>
+          <w:color w:val="000000"/>
+          <w:sz w:val="26"/>
+        </w:rPr>
+        <w:t xml:space="preserve">  </w:t>
+      </w:r>
+      <w:r>
+        <w:rPr>
+          <w:rFonts w:ascii="Times New Roman" w:hAnsi="Times New Roman"/>
+          <w:b/>
+          <w:i w:val="0"/>
+          <w:color w:val="000000"/>
+          <w:sz w:val="26"/>
+        </w:rPr>
+        <w:t>Sản phẩm:</w:t>
+      </w:r>
+      <w:r>
+        <w:rPr>
+          <w:rFonts w:ascii="Times New Roman" w:hAnsi="Times New Roman"/>
+          <w:b w:val="0"/>
+          <w:i w:val="0"/>
+          <w:color w:val="000000"/>
+          <w:sz w:val="26"/>
+        </w:rPr>
+        <w:t xml:space="preserve"> Định nghĩa nội năng được hoàn thiện trên PHT.</w:t>
       </w:r>
     </w:p>
     <w:tbl>
@@ -1989,6 +2161,29 @@
               <w:t>Chuyển giao nhiệm vụ:</w:t>
             </w:r>
           </w:p>
+          <w:p>
+            <w:pPr>
+              <w:spacing w:before="40" w:after="40" w:line="276" w:lineRule="auto"/>
+              <w:ind w:left="170" w:hanging="113"/>
+              <w:jc w:val="left"/>
+            </w:pPr>
+            <w:r>
+              <w:rPr>
+                <w:rFonts w:ascii="Times New Roman" w:hAnsi="Times New Roman"/>
+                <w:color w:val="000000"/>
+                <w:sz w:val="22"/>
+              </w:rPr>
+              <w:t xml:space="preserve">- </w:t>
+            </w:r>
+            <w:r>
+              <w:rPr>
+                <w:rFonts w:ascii="Times New Roman" w:hAnsi="Times New Roman"/>
+                <w:color w:val="000000"/>
+                <w:sz w:val="22"/>
+              </w:rPr>
+              <w:t>GV yêu cầu HS nghiên cứu cá nhân mục I SGK và trả lời câu hỏi: *“Các phân tử cấu tạo nên vật chuyển động không ngừng và có lực liên kết phân tử. Vậy chúng sở hữu những dạng năng lượng nào ở cấp độ vi mô? Tổng các năng lượng này gọi là gì?”*</w:t>
+            </w:r>
+          </w:p>
         </w:tc>
         <w:tc>
           <w:tcPr>
@@ -2065,168 +2260,6 @@
                 <w:color w:val="000000"/>
                 <w:sz w:val="22"/>
               </w:rPr>
-              <w:t>Nội dung 1: Nội năng &amp; Nguyên lí I (ĐVKT 1)</w:t>
-            </w:r>
-          </w:p>
-        </w:tc>
-        <w:tc>
-          <w:tcPr>
-            <w:tcW w:type="dxa" w:w="4535"/>
-            <w:tcMar>
-              <w:top w:w="114" w:type="dxa"/>
-              <w:bottom w:w="114" w:type="dxa"/>
-              <w:left w:w="170" w:type="dxa"/>
-              <w:right w:w="170" w:type="dxa"/>
-            </w:tcMar>
-            <w:tcBorders>
-              <w:top w:val="single" w:sz="4" w:space="0" w:color="BFBFBF"/>
-              <w:left w:val="single" w:sz="4" w:space="0" w:color="BFBFBF"/>
-              <w:bottom w:val="single" w:sz="4" w:space="0" w:color="BFBFBF"/>
-              <w:right w:val="single" w:sz="4" w:space="0" w:color="BFBFBF"/>
-            </w:tcBorders>
-          </w:tcPr>
-          <w:p>
-            <w:r/>
-          </w:p>
-        </w:tc>
-      </w:tr>
-      <w:tr>
-        <w:trPr>
-          <w:cantSplit/>
-        </w:trPr>
-        <w:tc>
-          <w:tcPr>
-            <w:tcW w:type="dxa" w:w="4535"/>
-            <w:tcMar>
-              <w:top w:w="114" w:type="dxa"/>
-              <w:bottom w:w="114" w:type="dxa"/>
-              <w:left w:w="170" w:type="dxa"/>
-              <w:right w:w="170" w:type="dxa"/>
-            </w:tcMar>
-            <w:tcBorders>
-              <w:top w:val="single" w:sz="4" w:space="0" w:color="BFBFBF"/>
-              <w:left w:val="single" w:sz="4" w:space="0" w:color="BFBFBF"/>
-              <w:bottom w:val="single" w:sz="4" w:space="0" w:color="BFBFBF"/>
-              <w:right w:val="single" w:sz="4" w:space="0" w:color="BFBFBF"/>
-            </w:tcBorders>
-          </w:tcPr>
-          <w:p>
-            <w:pPr>
-              <w:spacing w:before="40" w:after="40" w:line="276" w:lineRule="auto"/>
-              <w:jc w:val="left"/>
-            </w:pPr>
-            <w:r/>
-            <w:r>
-              <w:rPr>
-                <w:rFonts w:ascii="Times New Roman" w:hAnsi="Times New Roman"/>
-                <w:b/>
-                <w:color w:val="000000"/>
-                <w:sz w:val="22"/>
-              </w:rPr>
-              <w:t>Chuyển giao nhiệm vụ:</w:t>
-            </w:r>
-          </w:p>
-          <w:p>
-            <w:pPr>
-              <w:spacing w:before="40" w:after="40" w:line="276" w:lineRule="auto"/>
-              <w:ind w:left="170" w:hanging="113"/>
-              <w:jc w:val="left"/>
-            </w:pPr>
-            <w:r>
-              <w:rPr>
-                <w:rFonts w:ascii="Times New Roman" w:hAnsi="Times New Roman"/>
-                <w:color w:val="000000"/>
-                <w:sz w:val="22"/>
-              </w:rPr>
-              <w:t xml:space="preserve">- </w:t>
-            </w:r>
-            <w:r>
-              <w:rPr>
-                <w:rFonts w:ascii="Times New Roman" w:hAnsi="Times New Roman"/>
-                <w:color w:val="000000"/>
-                <w:sz w:val="22"/>
-              </w:rPr>
-              <w:t>GV yêu cầu thảo luận cặp đôi hoàn thành Nhiệm vụ 1 trong PHT (ete trong ống nghiệm bật nút).</w:t>
-            </w:r>
-          </w:p>
-          <w:p>
-            <w:pPr>
-              <w:spacing w:before="40" w:after="40" w:line="276" w:lineRule="auto"/>
-              <w:ind w:left="170" w:hanging="113"/>
-              <w:jc w:val="left"/>
-            </w:pPr>
-            <w:r>
-              <w:rPr>
-                <w:rFonts w:ascii="Times New Roman" w:hAnsi="Times New Roman"/>
-                <w:color w:val="000000"/>
-                <w:sz w:val="22"/>
-              </w:rPr>
-              <w:t xml:space="preserve">- </w:t>
-            </w:r>
-            <w:r>
-              <w:rPr>
-                <w:rFonts w:ascii="Times New Roman" w:hAnsi="Times New Roman"/>
-                <w:color w:val="000000"/>
-                <w:sz w:val="22"/>
-              </w:rPr>
-              <w:t>Yêu cầu nghiên cứu SGK để hoàn thành phần điền khuyết lý thuyết ĐVKT 1.</w:t>
-            </w:r>
-          </w:p>
-        </w:tc>
-        <w:tc>
-          <w:tcPr>
-            <w:tcW w:type="dxa" w:w="4535"/>
-            <w:tcMar>
-              <w:top w:w="114" w:type="dxa"/>
-              <w:bottom w:w="114" w:type="dxa"/>
-              <w:left w:w="170" w:type="dxa"/>
-              <w:right w:w="170" w:type="dxa"/>
-            </w:tcMar>
-            <w:tcBorders>
-              <w:top w:val="single" w:sz="4" w:space="0" w:color="BFBFBF"/>
-              <w:left w:val="single" w:sz="4" w:space="0" w:color="BFBFBF"/>
-              <w:bottom w:val="single" w:sz="4" w:space="0" w:color="BFBFBF"/>
-              <w:right w:val="single" w:sz="4" w:space="0" w:color="BFBFBF"/>
-            </w:tcBorders>
-          </w:tcPr>
-          <w:p>
-            <w:r/>
-          </w:p>
-        </w:tc>
-      </w:tr>
-      <w:tr>
-        <w:trPr>
-          <w:cantSplit/>
-        </w:trPr>
-        <w:tc>
-          <w:tcPr>
-            <w:tcW w:type="dxa" w:w="4535"/>
-            <w:tcMar>
-              <w:top w:w="114" w:type="dxa"/>
-              <w:bottom w:w="114" w:type="dxa"/>
-              <w:left w:w="170" w:type="dxa"/>
-              <w:right w:w="170" w:type="dxa"/>
-            </w:tcMar>
-            <w:tcBorders>
-              <w:top w:val="single" w:sz="4" w:space="0" w:color="BFBFBF"/>
-              <w:left w:val="single" w:sz="4" w:space="0" w:color="BFBFBF"/>
-              <w:bottom w:val="single" w:sz="4" w:space="0" w:color="BFBFBF"/>
-              <w:right w:val="single" w:sz="4" w:space="0" w:color="BFBFBF"/>
-            </w:tcBorders>
-          </w:tcPr>
-          <w:p>
-            <w:pPr>
-              <w:spacing w:before="40" w:after="40" w:line="276" w:lineRule="auto"/>
-              <w:jc w:val="left"/>
-            </w:pPr>
-            <w:r/>
-            <w:r>
-              <w:rPr>
-                <w:rFonts w:ascii="Times New Roman" w:hAnsi="Times New Roman"/>
-                <w:b/>
-                <w:color w:val="000000"/>
-                <w:sz w:val="22"/>
-              </w:rPr>
               <w:t>Theo dõi, hỗ trợ:</w:t>
             </w:r>
             <w:r>
@@ -2235,7 +2268,7 @@
                 <w:color w:val="000000"/>
                 <w:sz w:val="22"/>
               </w:rPr>
-              <w:t xml:space="preserve"> Giáo viên theo dõi, quan sát và hỗ trợ gợi ý các nhóm khi cần thiết.</w:t>
+              <w:t xml:space="preserve"> Giáo viên theo dõi, hướng dẫn HS liên hệ giữa chuyển động nhiệt với động năng phân tử, lực liên kết phân tử với thế năng phân tử.</w:t>
             </w:r>
           </w:p>
         </w:tc>
@@ -2270,51 +2303,13 @@
               </w:rPr>
               <w:t>Thực hiện nhiệm vụ:</w:t>
             </w:r>
-          </w:p>
-          <w:p>
-            <w:pPr>
-              <w:spacing w:before="40" w:after="40" w:line="276" w:lineRule="auto"/>
-              <w:ind w:left="170" w:hanging="113"/>
-              <w:jc w:val="left"/>
-            </w:pPr>
             <w:r>
               <w:rPr>
                 <w:rFonts w:ascii="Times New Roman" w:hAnsi="Times New Roman"/>
                 <w:color w:val="000000"/>
                 <w:sz w:val="22"/>
               </w:rPr>
-              <w:t xml:space="preserve">- </w:t>
-            </w:r>
-            <w:r>
-              <w:rPr>
-                <w:rFonts w:ascii="Times New Roman" w:hAnsi="Times New Roman"/>
-                <w:color w:val="000000"/>
-                <w:sz w:val="22"/>
-              </w:rPr>
-              <w:t>HS quan sát mô phỏng/thí nghiệm ống ete đậy nút cao su của GV.</w:t>
-            </w:r>
-          </w:p>
-          <w:p>
-            <w:pPr>
-              <w:spacing w:before="40" w:after="40" w:line="276" w:lineRule="auto"/>
-              <w:ind w:left="170" w:hanging="113"/>
-              <w:jc w:val="left"/>
-            </w:pPr>
-            <w:r>
-              <w:rPr>
-                <w:rFonts w:ascii="Times New Roman" w:hAnsi="Times New Roman"/>
-                <w:color w:val="000000"/>
-                <w:sz w:val="22"/>
-              </w:rPr>
-              <w:t xml:space="preserve">- </w:t>
-            </w:r>
-            <w:r>
-              <w:rPr>
-                <w:rFonts w:ascii="Times New Roman" w:hAnsi="Times New Roman"/>
-                <w:color w:val="000000"/>
-                <w:sz w:val="22"/>
-              </w:rPr>
-              <w:t>Trao đổi cặp đôi giải thích hiện tượng và điền khuyết lý thuyết vào PHT.</w:t>
+              <w:t xml:space="preserve"> HS nghiên cứu cá nhân mục I SGK, thảo luận cặp đôi để chỉ ra động năng và thế năng phân tử cấu tạo nên nội năng.</w:t>
             </w:r>
           </w:p>
         </w:tc>
@@ -2360,7 +2355,7 @@
                 <w:color w:val="000000"/>
                 <w:sz w:val="22"/>
               </w:rPr>
-              <w:t xml:space="preserve"> Giáo viên điều hành, gọi đại diện báo cáo kết quả, tổ chức nhận xét phản biện chéo giữa các học sinh.</w:t>
+              <w:t xml:space="preserve"> GV gọi đại diện HS phát biểu giải thích nội năng của vật.</w:t>
             </w:r>
           </w:p>
         </w:tc>
@@ -2395,20 +2390,22 @@
               </w:rPr>
               <w:t>Báo cáo, thảo luận:</w:t>
             </w:r>
-          </w:p>
-          <w:p>
-            <w:pPr>
-              <w:spacing w:before="40" w:after="40" w:line="276" w:lineRule="auto"/>
-              <w:ind w:left="170" w:hanging="113"/>
-              <w:jc w:val="left"/>
-            </w:pPr>
             <w:r>
               <w:rPr>
                 <w:rFonts w:ascii="Times New Roman" w:hAnsi="Times New Roman"/>
                 <w:color w:val="000000"/>
                 <w:sz w:val="22"/>
               </w:rPr>
-              <w:t xml:space="preserve">- </w:t>
+              <w:t xml:space="preserve"> HS trình bày định nghĩa nội năng: </w:t>
+            </w:r>
+            <w:r>
+              <w:rPr>
+                <w:rFonts w:ascii="Times New Roman" w:hAnsi="Times New Roman"/>
+                <w:i/>
+                <w:color w:val="000000"/>
+                <w:sz w:val="22"/>
+              </w:rPr>
+              <w:t>U = E_đ + E_t</w:t>
             </w:r>
             <w:r>
               <w:rPr>
@@ -2416,30 +2413,7 @@
                 <w:color w:val="000000"/>
                 <w:sz w:val="22"/>
               </w:rPr>
-              <w:t>Đại diện HS đứng lên đọc từ khóa điền khuyết.</w:t>
-            </w:r>
-          </w:p>
-          <w:p>
-            <w:pPr>
-              <w:spacing w:before="40" w:after="40" w:line="276" w:lineRule="auto"/>
-              <w:ind w:left="170" w:hanging="113"/>
-              <w:jc w:val="left"/>
-            </w:pPr>
-            <w:r>
-              <w:rPr>
-                <w:rFonts w:ascii="Times New Roman" w:hAnsi="Times New Roman"/>
-                <w:color w:val="000000"/>
-                <w:sz w:val="22"/>
-              </w:rPr>
-              <w:t xml:space="preserve">- </w:t>
-            </w:r>
-            <w:r>
-              <w:rPr>
-                <w:rFonts w:ascii="Times New Roman" w:hAnsi="Times New Roman"/>
-                <w:color w:val="000000"/>
-                <w:sz w:val="22"/>
-              </w:rPr>
-              <w:t>HS khác nhận xét chéo.</w:t>
+              <w:t>.</w:t>
             </w:r>
           </w:p>
         </w:tc>
@@ -2500,7 +2474,7 @@
                 <w:color w:val="000000"/>
                 <w:sz w:val="22"/>
               </w:rPr>
-              <w:t xml:space="preserve">GV chuẩn hóa định nghĩa nội năng: </w:t>
+              <w:t xml:space="preserve">GV chốt kiến thức: Nội năng </w:t>
             </w:r>
             <w:r>
               <w:rPr>
@@ -2509,7 +2483,58 @@
                 <w:color w:val="000000"/>
                 <w:sz w:val="22"/>
               </w:rPr>
-              <w:t>U = E_đ + E_t</w:t>
+              <w:t>U</w:t>
+            </w:r>
+            <w:r>
+              <w:rPr>
+                <w:rFonts w:ascii="Times New Roman" w:hAnsi="Times New Roman"/>
+                <w:color w:val="000000"/>
+                <w:sz w:val="22"/>
+              </w:rPr>
+              <w:t xml:space="preserve"> phụ thuộc vào nhiệt độ </w:t>
+            </w:r>
+            <w:r>
+              <w:rPr>
+                <w:rFonts w:ascii="Times New Roman" w:hAnsi="Times New Roman"/>
+                <w:i/>
+                <w:color w:val="000000"/>
+                <w:sz w:val="22"/>
+              </w:rPr>
+              <w:t>T</w:t>
+            </w:r>
+            <w:r>
+              <w:rPr>
+                <w:rFonts w:ascii="Times New Roman" w:hAnsi="Times New Roman"/>
+                <w:color w:val="000000"/>
+                <w:sz w:val="22"/>
+              </w:rPr>
+              <w:t xml:space="preserve"> và thể tích </w:t>
+            </w:r>
+            <w:r>
+              <w:rPr>
+                <w:rFonts w:ascii="Times New Roman" w:hAnsi="Times New Roman"/>
+                <w:i/>
+                <w:color w:val="000000"/>
+                <w:sz w:val="22"/>
+              </w:rPr>
+              <w:t>V</w:t>
+            </w:r>
+            <w:r>
+              <w:rPr>
+                <w:rFonts w:ascii="Times New Roman" w:hAnsi="Times New Roman"/>
+                <w:color w:val="000000"/>
+                <w:sz w:val="22"/>
+              </w:rPr>
+              <w:t xml:space="preserve"> của vật: </w:t>
+            </w:r>
+            <w:r>
+              <w:rPr>
+                <w:rFonts w:ascii="Times New Roman" w:hAnsi="Times New Roman"/>
+                <w:i/>
+                <w:color w:val="000000"/>
+                <w:sz w:val="22"/>
+              </w:rPr>
+              <w:t>U = f(T, V)</w:t>
             </w:r>
             <w:r>
               <w:rPr>
@@ -2518,46 +2543,6 @@
                 <w:sz w:val="22"/>
               </w:rPr>
               <w:t>.</w:t>
-            </w:r>
-          </w:p>
-          <w:p>
-            <w:pPr>
-              <w:spacing w:before="40" w:after="40" w:line="276" w:lineRule="auto"/>
-              <w:ind w:left="170" w:hanging="113"/>
-              <w:jc w:val="left"/>
-            </w:pPr>
-            <w:r>
-              <w:rPr>
-                <w:rFonts w:ascii="Times New Roman" w:hAnsi="Times New Roman"/>
-                <w:color w:val="000000"/>
-                <w:sz w:val="22"/>
-              </w:rPr>
-              <w:t xml:space="preserve">- </w:t>
-            </w:r>
-            <w:r>
-              <w:rPr>
-                <w:rFonts w:ascii="Times New Roman" w:hAnsi="Times New Roman"/>
-                <w:color w:val="000000"/>
-                <w:sz w:val="22"/>
-              </w:rPr>
-              <w:t xml:space="preserve">Chốt Nguyên lí I: </w:t>
-            </w:r>
-            <w:r>
-              <w:rPr>
-                <w:rFonts w:ascii="Times New Roman" w:hAnsi="Times New Roman"/>
-                <w:i/>
-                <w:color w:val="000000"/>
-                <w:sz w:val="22"/>
-              </w:rPr>
-              <w:t>Δ U = A + Q</w:t>
-            </w:r>
-            <w:r>
-              <w:rPr>
-                <w:rFonts w:ascii="Times New Roman" w:hAnsi="Times New Roman"/>
-                <w:color w:val="000000"/>
-                <w:sz w:val="22"/>
-              </w:rPr>
-              <w:t xml:space="preserve"> và vẽ bảng quy ước dấu lên bảng.</w:t>
             </w:r>
           </w:p>
         </w:tc>
@@ -2598,18 +2583,186 @@
                 <w:color w:val="000000"/>
                 <w:sz w:val="22"/>
               </w:rPr>
-              <w:t xml:space="preserve"> Học sinh đối chiếu, sửa đổi kết quả bài làm và ghi nhận kiến thức cốt lõi vào vở.</w:t>
+              <w:t xml:space="preserve"> Học sinh lắng nghe nhận xét, đối chiếu lời giải và ghi chép kiến thức cốt lõi.</w:t>
             </w:r>
           </w:p>
         </w:tc>
       </w:tr>
+    </w:tbl>
+    <w:p/>
+    <w:p>
+      <w:pPr>
+        <w:pStyle w:val="Heading3"/>
+        <w:keepNext/>
+        <w:spacing w:before="120" w:after="60"/>
+        <w:ind w:left="0" w:firstLine="0"/>
+      </w:pPr>
+      <w:r>
+        <w:rPr>
+          <w:rFonts w:ascii="Times New Roman" w:hAnsi="Times New Roman"/>
+          <w:b w:val="0"/>
+          <w:i/>
+          <w:color w:val="000000"/>
+          <w:sz w:val="26"/>
+        </w:rPr>
+        <w:t>2.2. Đơn vị kiến thức 2: Các cách làm biến đổi nội năng</w:t>
+      </w:r>
+    </w:p>
+    <w:p>
+      <w:pPr>
+        <w:spacing w:before="60" w:after="60" w:line="312" w:lineRule="auto"/>
+        <w:ind w:left="283" w:hanging="170"/>
+        <w:jc w:val="both"/>
+      </w:pPr>
+      <w:r>
+        <w:rPr>
+          <w:rFonts w:ascii="Times New Roman" w:hAnsi="Times New Roman"/>
+          <w:color w:val="000000"/>
+          <w:sz w:val="26"/>
+        </w:rPr>
+        <w:t xml:space="preserve">- </w:t>
+      </w:r>
+      <w:r>
+        <w:rPr>
+          <w:rFonts w:ascii="Times New Roman" w:hAnsi="Times New Roman"/>
+          <w:b w:val="0"/>
+          <w:i w:val="0"/>
+          <w:color w:val="000000"/>
+          <w:sz w:val="26"/>
+        </w:rPr>
+        <w:t xml:space="preserve">  </w:t>
+      </w:r>
+      <w:r>
+        <w:rPr>
+          <w:rFonts w:ascii="Times New Roman" w:hAnsi="Times New Roman"/>
+          <w:b/>
+          <w:i w:val="0"/>
+          <w:color w:val="000000"/>
+          <w:sz w:val="26"/>
+        </w:rPr>
+        <w:t>Mục tiêu:</w:t>
+      </w:r>
+      <w:r>
+        <w:rPr>
+          <w:rFonts w:ascii="Times New Roman" w:hAnsi="Times New Roman"/>
+          <w:b w:val="0"/>
+          <w:i w:val="0"/>
+          <w:color w:val="000000"/>
+          <w:sz w:val="26"/>
+        </w:rPr>
+        <w:t xml:space="preserve"> Chỉ ra được hai cách làm biến đổi nội năng là thực hiện công và truyền nhiệt thông qua thí nghiệm thực tế cọ xát/đun nóng ống ete.</w:t>
+      </w:r>
+    </w:p>
+    <w:p>
+      <w:pPr>
+        <w:spacing w:before="60" w:after="60" w:line="312" w:lineRule="auto"/>
+        <w:ind w:left="283" w:hanging="170"/>
+        <w:jc w:val="both"/>
+      </w:pPr>
+      <w:r>
+        <w:rPr>
+          <w:rFonts w:ascii="Times New Roman" w:hAnsi="Times New Roman"/>
+          <w:color w:val="000000"/>
+          <w:sz w:val="26"/>
+        </w:rPr>
+        <w:t xml:space="preserve">- </w:t>
+      </w:r>
+      <w:r>
+        <w:rPr>
+          <w:rFonts w:ascii="Times New Roman" w:hAnsi="Times New Roman"/>
+          <w:b w:val="0"/>
+          <w:i w:val="0"/>
+          <w:color w:val="000000"/>
+          <w:sz w:val="26"/>
+        </w:rPr>
+        <w:t xml:space="preserve">  </w:t>
+      </w:r>
+      <w:r>
+        <w:rPr>
+          <w:rFonts w:ascii="Times New Roman" w:hAnsi="Times New Roman"/>
+          <w:b/>
+          <w:i w:val="0"/>
+          <w:color w:val="000000"/>
+          <w:sz w:val="26"/>
+        </w:rPr>
+        <w:t>Nội dung:</w:t>
+      </w:r>
+      <w:r>
+        <w:rPr>
+          <w:rFonts w:ascii="Times New Roman" w:hAnsi="Times New Roman"/>
+          <w:b w:val="0"/>
+          <w:i w:val="0"/>
+          <w:color w:val="000000"/>
+          <w:sz w:val="26"/>
+        </w:rPr>
+        <w:t xml:space="preserve"> Phân tích thí nghiệm ống nghiệm ete đậy nút cọ xát.</w:t>
+      </w:r>
+    </w:p>
+    <w:p>
+      <w:pPr>
+        <w:spacing w:before="60" w:after="60" w:line="312" w:lineRule="auto"/>
+        <w:ind w:left="283" w:hanging="170"/>
+        <w:jc w:val="both"/>
+      </w:pPr>
+      <w:r>
+        <w:rPr>
+          <w:rFonts w:ascii="Times New Roman" w:hAnsi="Times New Roman"/>
+          <w:color w:val="000000"/>
+          <w:sz w:val="26"/>
+        </w:rPr>
+        <w:t xml:space="preserve">- </w:t>
+      </w:r>
+      <w:r>
+        <w:rPr>
+          <w:rFonts w:ascii="Times New Roman" w:hAnsi="Times New Roman"/>
+          <w:b w:val="0"/>
+          <w:i w:val="0"/>
+          <w:color w:val="000000"/>
+          <w:sz w:val="26"/>
+        </w:rPr>
+        <w:t xml:space="preserve">  </w:t>
+      </w:r>
+      <w:r>
+        <w:rPr>
+          <w:rFonts w:ascii="Times New Roman" w:hAnsi="Times New Roman"/>
+          <w:b/>
+          <w:i w:val="0"/>
+          <w:color w:val="000000"/>
+          <w:sz w:val="26"/>
+        </w:rPr>
+        <w:t>Sản phẩm:</w:t>
+      </w:r>
+      <w:r>
+        <w:rPr>
+          <w:rFonts w:ascii="Times New Roman" w:hAnsi="Times New Roman"/>
+          <w:b w:val="0"/>
+          <w:i w:val="0"/>
+          <w:color w:val="000000"/>
+          <w:sz w:val="26"/>
+        </w:rPr>
+        <w:t xml:space="preserve"> Sự phân biệt rõ ràng hai cách làm biến đổi nội năng.</w:t>
+      </w:r>
+    </w:p>
+    <w:tbl>
+      <w:tblPr>
+        <w:tblW w:type="auto" w:w="0"/>
+        <w:jc w:val="center"/>
+        <w:tblLayout w:type="fixed"/>
+        <w:tblLook w:firstColumn="1" w:firstRow="1" w:lastColumn="0" w:lastRow="0" w:noHBand="0" w:noVBand="1" w:val="04A0"/>
+        <w:tblW w:w="9072" w:type="dxa"/>
+      </w:tblPr>
+      <w:tblGrid>
+        <w:gridCol w:w="4535"/>
+        <w:gridCol w:w="4535"/>
+      </w:tblGrid>
       <w:tr>
         <w:trPr>
-          <w:cantSplit/>
+          <w:tblHeader/>
         </w:trPr>
         <w:tc>
           <w:tcPr>
             <w:tcW w:type="dxa" w:w="4535"/>
+            <w:shd w:fill="D9D9D9"/>
             <w:tcMar>
               <w:top w:w="114" w:type="dxa"/>
               <w:bottom w:w="114" w:type="dxa"/>
@@ -2625,8 +2778,8 @@
           </w:tcPr>
           <w:p>
             <w:pPr>
-              <w:spacing w:before="40" w:after="40" w:line="276" w:lineRule="auto"/>
-              <w:jc w:val="left"/>
+              <w:spacing w:before="40" w:after="40"/>
+              <w:jc w:val="center"/>
             </w:pPr>
             <w:r/>
             <w:r>
@@ -2636,13 +2789,14 @@
                 <w:color w:val="000000"/>
                 <w:sz w:val="22"/>
               </w:rPr>
-              <w:t>Nội dung 2: Nhiệt lượng &amp; Công thức tính (ĐVKT 2)</w:t>
+              <w:t>Hoạt động của Giáo viên</w:t>
             </w:r>
           </w:p>
         </w:tc>
         <w:tc>
           <w:tcPr>
             <w:tcW w:type="dxa" w:w="4535"/>
+            <w:shd w:fill="D9D9D9"/>
             <w:tcMar>
               <w:top w:w="114" w:type="dxa"/>
               <w:bottom w:w="114" w:type="dxa"/>
@@ -2658,8 +2812,8 @@
           </w:tcPr>
           <w:p>
             <w:pPr>
-              <w:spacing w:before="40" w:after="40" w:line="276" w:lineRule="auto"/>
-              <w:jc w:val="left"/>
+              <w:spacing w:before="40" w:after="40"/>
+              <w:jc w:val="center"/>
             </w:pPr>
             <w:r/>
             <w:r>
@@ -2669,110 +2823,7 @@
                 <w:color w:val="000000"/>
                 <w:sz w:val="22"/>
               </w:rPr>
-              <w:t>Thực hiện nhiệm vụ:</w:t>
-            </w:r>
-          </w:p>
-          <w:p>
-            <w:pPr>
-              <w:spacing w:before="40" w:after="40" w:line="276" w:lineRule="auto"/>
-              <w:ind w:left="170" w:hanging="113"/>
-              <w:jc w:val="left"/>
-            </w:pPr>
-            <w:r>
-              <w:rPr>
-                <w:rFonts w:ascii="Times New Roman" w:hAnsi="Times New Roman"/>
-                <w:color w:val="000000"/>
-                <w:sz w:val="22"/>
-              </w:rPr>
-              <w:t xml:space="preserve">- </w:t>
-            </w:r>
-            <w:r>
-              <w:rPr>
-                <w:rFonts w:ascii="Times New Roman" w:hAnsi="Times New Roman"/>
-                <w:color w:val="000000"/>
-                <w:sz w:val="22"/>
-              </w:rPr>
-              <w:t>HS quan sát bảng số liệu so sánh nước/rượu.</w:t>
-            </w:r>
-          </w:p>
-          <w:p>
-            <w:pPr>
-              <w:spacing w:before="40" w:after="40" w:line="276" w:lineRule="auto"/>
-              <w:ind w:left="170" w:hanging="113"/>
-              <w:jc w:val="left"/>
-            </w:pPr>
-            <w:r>
-              <w:rPr>
-                <w:rFonts w:ascii="Times New Roman" w:hAnsi="Times New Roman"/>
-                <w:color w:val="000000"/>
-                <w:sz w:val="22"/>
-              </w:rPr>
-              <w:t xml:space="preserve">- </w:t>
-            </w:r>
-            <w:r>
-              <w:rPr>
-                <w:rFonts w:ascii="Times New Roman" w:hAnsi="Times New Roman"/>
-                <w:color w:val="000000"/>
-                <w:sz w:val="22"/>
-              </w:rPr>
-              <w:t>Suy nghĩ giải thích vai trò đặc trưng của đại lượng Nhiệt dung riêng (</w:t>
-            </w:r>
-            <w:r>
-              <w:rPr>
-                <w:rFonts w:ascii="Times New Roman" w:hAnsi="Times New Roman"/>
-                <w:i/>
-                <w:color w:val="000000"/>
-                <w:sz w:val="22"/>
-              </w:rPr>
-              <w:t>c</w:t>
-            </w:r>
-            <w:r>
-              <w:rPr>
-                <w:rFonts w:ascii="Times New Roman" w:hAnsi="Times New Roman"/>
-                <w:color w:val="000000"/>
-                <w:sz w:val="22"/>
-              </w:rPr>
-              <w:t>).</w:t>
-            </w:r>
-          </w:p>
-          <w:p>
-            <w:pPr>
-              <w:spacing w:before="40" w:after="40" w:line="276" w:lineRule="auto"/>
-              <w:ind w:left="170" w:hanging="113"/>
-              <w:jc w:val="left"/>
-            </w:pPr>
-            <w:r>
-              <w:rPr>
-                <w:rFonts w:ascii="Times New Roman" w:hAnsi="Times New Roman"/>
-                <w:color w:val="000000"/>
-                <w:sz w:val="22"/>
-              </w:rPr>
-              <w:t xml:space="preserve">- </w:t>
-            </w:r>
-            <w:r>
-              <w:rPr>
-                <w:rFonts w:ascii="Times New Roman" w:hAnsi="Times New Roman"/>
-                <w:color w:val="000000"/>
-                <w:sz w:val="22"/>
-              </w:rPr>
-              <w:t xml:space="preserve">Điền khuyết công thức </w:t>
-            </w:r>
-            <w:r>
-              <w:rPr>
-                <w:rFonts w:ascii="Times New Roman" w:hAnsi="Times New Roman"/>
-                <w:i/>
-                <w:color w:val="000000"/>
-                <w:sz w:val="22"/>
-              </w:rPr>
-              <w:t>Q = mcΔ t</w:t>
-            </w:r>
-            <w:r>
-              <w:rPr>
-                <w:rFonts w:ascii="Times New Roman" w:hAnsi="Times New Roman"/>
-                <w:color w:val="000000"/>
-                <w:sz w:val="22"/>
-              </w:rPr>
-              <w:t xml:space="preserve"> vào PHT.</w:t>
+              <w:t>Hoạt động của Học sinh</w:t>
             </w:r>
           </w:p>
         </w:tc>
@@ -2833,30 +2884,7 @@
                 <w:color w:val="000000"/>
                 <w:sz w:val="22"/>
               </w:rPr>
-              <w:t>GV giới thiệu thực nghiệm đun nóng nước và rượu trên slide.</w:t>
-            </w:r>
-          </w:p>
-          <w:p>
-            <w:pPr>
-              <w:spacing w:before="40" w:after="40" w:line="276" w:lineRule="auto"/>
-              <w:ind w:left="170" w:hanging="113"/>
-              <w:jc w:val="left"/>
-            </w:pPr>
-            <w:r>
-              <w:rPr>
-                <w:rFonts w:ascii="Times New Roman" w:hAnsi="Times New Roman"/>
-                <w:color w:val="000000"/>
-                <w:sz w:val="22"/>
-              </w:rPr>
-              <w:t xml:space="preserve">- </w:t>
-            </w:r>
-            <w:r>
-              <w:rPr>
-                <w:rFonts w:ascii="Times New Roman" w:hAnsi="Times New Roman"/>
-                <w:color w:val="000000"/>
-                <w:sz w:val="22"/>
-              </w:rPr>
-              <w:t>Yêu cầu HS hoàn thành phần điền khuyết công thức tính nhiệt lượng ĐVKT 2.</w:t>
+              <w:t>GV yêu cầu HS quan sát thí nghiệm đun nóng ống ete đậy nút cao su/hoặc cọ xát dây cọ xát ống nghiệm và đặt câu hỏi: *“Khi cọ xát hoặc đun nóng ống nghiệm, vì sao nút cao su lại bật ra? Nội năng của ete đã thay đổi bằng những cách nào? Nêu sự khác biệt giữa hai cách đó?”*</w:t>
             </w:r>
           </w:p>
         </w:tc>
@@ -2877,7 +2905,28 @@
             </w:tcBorders>
           </w:tcPr>
           <w:p>
+            <w:pPr>
+              <w:spacing w:before="40" w:after="40" w:line="276" w:lineRule="auto"/>
+              <w:jc w:val="left"/>
+            </w:pPr>
             <w:r/>
+            <w:r>
+              <w:rPr>
+                <w:rFonts w:ascii="Times New Roman" w:hAnsi="Times New Roman"/>
+                <w:b/>
+                <w:color w:val="000000"/>
+                <w:sz w:val="22"/>
+              </w:rPr>
+              <w:t>Tiếp nhận nhiệm vụ:</w:t>
+            </w:r>
+            <w:r>
+              <w:rPr>
+                <w:rFonts w:ascii="Times New Roman" w:hAnsi="Times New Roman"/>
+                <w:color w:val="000000"/>
+                <w:sz w:val="22"/>
+              </w:rPr>
+              <w:t xml:space="preserve"> Học sinh tiếp nhận nhiệm vụ học tập từ giáo viên.</w:t>
+            </w:r>
           </w:p>
         </w:tc>
       </w:tr>
@@ -2914,7 +2963,181 @@
                 <w:color w:val="000000"/>
                 <w:sz w:val="22"/>
               </w:rPr>
-              <w:t>Kết luận:</w:t>
+              <w:t>Theo dõi, hỗ trợ:</w:t>
+            </w:r>
+            <w:r>
+              <w:rPr>
+                <w:rFonts w:ascii="Times New Roman" w:hAnsi="Times New Roman"/>
+                <w:color w:val="000000"/>
+                <w:sz w:val="22"/>
+              </w:rPr>
+              <w:t xml:space="preserve"> Giáo viên đôn đốc, gợi ý sự chuyển hóa cơ năng -&gt; nội năng (thực hiện công) và nhiệt năng truyền trực tiếp -&gt; nội năng (truyền nhiệt).</w:t>
+            </w:r>
+          </w:p>
+        </w:tc>
+        <w:tc>
+          <w:tcPr>
+            <w:tcW w:type="dxa" w:w="4535"/>
+            <w:tcMar>
+              <w:top w:w="114" w:type="dxa"/>
+              <w:bottom w:w="114" w:type="dxa"/>
+              <w:left w:w="170" w:type="dxa"/>
+              <w:right w:w="170" w:type="dxa"/>
+            </w:tcMar>
+            <w:tcBorders>
+              <w:top w:val="single" w:sz="4" w:space="0" w:color="BFBFBF"/>
+              <w:left w:val="single" w:sz="4" w:space="0" w:color="BFBFBF"/>
+              <w:bottom w:val="single" w:sz="4" w:space="0" w:color="BFBFBF"/>
+              <w:right w:val="single" w:sz="4" w:space="0" w:color="BFBFBF"/>
+            </w:tcBorders>
+          </w:tcPr>
+          <w:p>
+            <w:pPr>
+              <w:spacing w:before="40" w:after="40" w:line="276" w:lineRule="auto"/>
+              <w:jc w:val="left"/>
+            </w:pPr>
+            <w:r/>
+            <w:r>
+              <w:rPr>
+                <w:rFonts w:ascii="Times New Roman" w:hAnsi="Times New Roman"/>
+                <w:b/>
+                <w:color w:val="000000"/>
+                <w:sz w:val="22"/>
+              </w:rPr>
+              <w:t>Thực hiện nhiệm vụ:</w:t>
+            </w:r>
+            <w:r>
+              <w:rPr>
+                <w:rFonts w:ascii="Times New Roman" w:hAnsi="Times New Roman"/>
+                <w:color w:val="000000"/>
+                <w:sz w:val="22"/>
+              </w:rPr>
+              <w:t xml:space="preserve"> HS thảo luận nhóm nhỏ để phân tích hai quá trình vật lý xảy ra trong thí nghiệm ống ete và điền khuyết lý thuyết vào PHT.</w:t>
+            </w:r>
+          </w:p>
+        </w:tc>
+      </w:tr>
+      <w:tr>
+        <w:trPr>
+          <w:cantSplit/>
+        </w:trPr>
+        <w:tc>
+          <w:tcPr>
+            <w:tcW w:type="dxa" w:w="4535"/>
+            <w:tcMar>
+              <w:top w:w="114" w:type="dxa"/>
+              <w:bottom w:w="114" w:type="dxa"/>
+              <w:left w:w="170" w:type="dxa"/>
+              <w:right w:w="170" w:type="dxa"/>
+            </w:tcMar>
+            <w:tcBorders>
+              <w:top w:val="single" w:sz="4" w:space="0" w:color="BFBFBF"/>
+              <w:left w:val="single" w:sz="4" w:space="0" w:color="BFBFBF"/>
+              <w:bottom w:val="single" w:sz="4" w:space="0" w:color="BFBFBF"/>
+              <w:right w:val="single" w:sz="4" w:space="0" w:color="BFBFBF"/>
+            </w:tcBorders>
+          </w:tcPr>
+          <w:p>
+            <w:pPr>
+              <w:spacing w:before="40" w:after="40" w:line="276" w:lineRule="auto"/>
+              <w:jc w:val="left"/>
+            </w:pPr>
+            <w:r/>
+            <w:r>
+              <w:rPr>
+                <w:rFonts w:ascii="Times New Roman" w:hAnsi="Times New Roman"/>
+                <w:b/>
+                <w:color w:val="000000"/>
+                <w:sz w:val="22"/>
+              </w:rPr>
+              <w:t>Tổ chức báo cáo:</w:t>
+            </w:r>
+            <w:r>
+              <w:rPr>
+                <w:rFonts w:ascii="Times New Roman" w:hAnsi="Times New Roman"/>
+                <w:color w:val="000000"/>
+                <w:sz w:val="22"/>
+              </w:rPr>
+              <w:t xml:space="preserve"> GV gọi đại diện nhóm phân tích các cách làm biến đổi nội năng của hệ.</w:t>
+            </w:r>
+          </w:p>
+        </w:tc>
+        <w:tc>
+          <w:tcPr>
+            <w:tcW w:type="dxa" w:w="4535"/>
+            <w:tcMar>
+              <w:top w:w="114" w:type="dxa"/>
+              <w:bottom w:w="114" w:type="dxa"/>
+              <w:left w:w="170" w:type="dxa"/>
+              <w:right w:w="170" w:type="dxa"/>
+            </w:tcMar>
+            <w:tcBorders>
+              <w:top w:val="single" w:sz="4" w:space="0" w:color="BFBFBF"/>
+              <w:left w:val="single" w:sz="4" w:space="0" w:color="BFBFBF"/>
+              <w:bottom w:val="single" w:sz="4" w:space="0" w:color="BFBFBF"/>
+              <w:right w:val="single" w:sz="4" w:space="0" w:color="BFBFBF"/>
+            </w:tcBorders>
+          </w:tcPr>
+          <w:p>
+            <w:pPr>
+              <w:spacing w:before="40" w:after="40" w:line="276" w:lineRule="auto"/>
+              <w:jc w:val="left"/>
+            </w:pPr>
+            <w:r/>
+            <w:r>
+              <w:rPr>
+                <w:rFonts w:ascii="Times New Roman" w:hAnsi="Times New Roman"/>
+                <w:b/>
+                <w:color w:val="000000"/>
+                <w:sz w:val="22"/>
+              </w:rPr>
+              <w:t>Báo cáo, thảo luận:</w:t>
+            </w:r>
+            <w:r>
+              <w:rPr>
+                <w:rFonts w:ascii="Times New Roman" w:hAnsi="Times New Roman"/>
+                <w:color w:val="000000"/>
+                <w:sz w:val="22"/>
+              </w:rPr>
+              <w:t xml:space="preserve"> Đại diện nhóm trình bày sự khác biệt giữa thực hiện công (có sự chuyển hóa năng lượng) và truyền nhiệt (không có sự chuyển hóa năng lượng, chỉ có sự truyền năng lượng).</w:t>
+            </w:r>
+          </w:p>
+        </w:tc>
+      </w:tr>
+      <w:tr>
+        <w:trPr>
+          <w:cantSplit/>
+        </w:trPr>
+        <w:tc>
+          <w:tcPr>
+            <w:tcW w:type="dxa" w:w="4535"/>
+            <w:tcMar>
+              <w:top w:w="114" w:type="dxa"/>
+              <w:bottom w:w="114" w:type="dxa"/>
+              <w:left w:w="170" w:type="dxa"/>
+              <w:right w:w="170" w:type="dxa"/>
+            </w:tcMar>
+            <w:tcBorders>
+              <w:top w:val="single" w:sz="4" w:space="0" w:color="BFBFBF"/>
+              <w:left w:val="single" w:sz="4" w:space="0" w:color="BFBFBF"/>
+              <w:bottom w:val="single" w:sz="4" w:space="0" w:color="BFBFBF"/>
+              <w:right w:val="single" w:sz="4" w:space="0" w:color="BFBFBF"/>
+            </w:tcBorders>
+          </w:tcPr>
+          <w:p>
+            <w:pPr>
+              <w:spacing w:before="40" w:after="40" w:line="276" w:lineRule="auto"/>
+              <w:jc w:val="left"/>
+            </w:pPr>
+            <w:r/>
+            <w:r>
+              <w:rPr>
+                <w:rFonts w:ascii="Times New Roman" w:hAnsi="Times New Roman"/>
+                <w:b/>
+                <w:color w:val="000000"/>
+                <w:sz w:val="22"/>
+              </w:rPr>
+              <w:t>Kết luận, nhận định:</w:t>
             </w:r>
           </w:p>
           <w:p>
@@ -2937,7 +3160,368 @@
                 <w:color w:val="000000"/>
                 <w:sz w:val="22"/>
               </w:rPr>
-              <w:t>GV chốt công thức tính nhiệt lượng và ý nghĩa đơn vị của nhiệt dung riêng (</w:t>
+              <w:t>GV chuẩn hóa kiến thức về hai cách làm biến đổi nội năng (Thực hiện công và Truyền nhiệt).</w:t>
+            </w:r>
+          </w:p>
+        </w:tc>
+        <w:tc>
+          <w:tcPr>
+            <w:tcW w:type="dxa" w:w="4535"/>
+            <w:tcMar>
+              <w:top w:w="114" w:type="dxa"/>
+              <w:bottom w:w="114" w:type="dxa"/>
+              <w:left w:w="170" w:type="dxa"/>
+              <w:right w:w="170" w:type="dxa"/>
+            </w:tcMar>
+            <w:tcBorders>
+              <w:top w:val="single" w:sz="4" w:space="0" w:color="BFBFBF"/>
+              <w:left w:val="single" w:sz="4" w:space="0" w:color="BFBFBF"/>
+              <w:bottom w:val="single" w:sz="4" w:space="0" w:color="BFBFBF"/>
+              <w:right w:val="single" w:sz="4" w:space="0" w:color="BFBFBF"/>
+            </w:tcBorders>
+          </w:tcPr>
+          <w:p>
+            <w:pPr>
+              <w:spacing w:before="40" w:after="40" w:line="276" w:lineRule="auto"/>
+              <w:jc w:val="left"/>
+            </w:pPr>
+            <w:r/>
+            <w:r>
+              <w:rPr>
+                <w:rFonts w:ascii="Times New Roman" w:hAnsi="Times New Roman"/>
+                <w:b/>
+                <w:color w:val="000000"/>
+                <w:sz w:val="22"/>
+              </w:rPr>
+              <w:t>Ghi nhận kiến thức:</w:t>
+            </w:r>
+            <w:r>
+              <w:rPr>
+                <w:rFonts w:ascii="Times New Roman" w:hAnsi="Times New Roman"/>
+                <w:color w:val="000000"/>
+                <w:sz w:val="22"/>
+              </w:rPr>
+              <w:t xml:space="preserve"> Học sinh lắng nghe nhận xét, đối chiếu lời giải và ghi chép kiến thức cốt lõi.</w:t>
+            </w:r>
+          </w:p>
+        </w:tc>
+      </w:tr>
+    </w:tbl>
+    <w:p/>
+    <w:p>
+      <w:pPr>
+        <w:pStyle w:val="Heading3"/>
+        <w:keepNext/>
+        <w:spacing w:before="120" w:after="60"/>
+        <w:ind w:left="0" w:firstLine="0"/>
+      </w:pPr>
+      <w:r>
+        <w:rPr>
+          <w:rFonts w:ascii="Times New Roman" w:hAnsi="Times New Roman"/>
+          <w:b w:val="0"/>
+          <w:i/>
+          <w:color w:val="000000"/>
+          <w:sz w:val="26"/>
+        </w:rPr>
+        <w:t>2.3. Đơn vị kiến thức 3: Nguyên lí I Nhiệt động lực học</w:t>
+      </w:r>
+    </w:p>
+    <w:p>
+      <w:pPr>
+        <w:spacing w:before="60" w:after="60" w:line="312" w:lineRule="auto"/>
+        <w:ind w:left="283" w:hanging="170"/>
+        <w:jc w:val="both"/>
+      </w:pPr>
+      <w:r>
+        <w:rPr>
+          <w:rFonts w:ascii="Times New Roman" w:hAnsi="Times New Roman"/>
+          <w:color w:val="000000"/>
+          <w:sz w:val="26"/>
+        </w:rPr>
+        <w:t xml:space="preserve">- </w:t>
+      </w:r>
+      <w:r>
+        <w:rPr>
+          <w:rFonts w:ascii="Times New Roman" w:hAnsi="Times New Roman"/>
+          <w:b w:val="0"/>
+          <w:i w:val="0"/>
+          <w:color w:val="000000"/>
+          <w:sz w:val="26"/>
+        </w:rPr>
+        <w:t xml:space="preserve">  </w:t>
+      </w:r>
+      <w:r>
+        <w:rPr>
+          <w:rFonts w:ascii="Times New Roman" w:hAnsi="Times New Roman"/>
+          <w:b/>
+          <w:i w:val="0"/>
+          <w:color w:val="000000"/>
+          <w:sz w:val="26"/>
+        </w:rPr>
+        <w:t>Mục tiêu:</w:t>
+      </w:r>
+      <w:r>
+        <w:rPr>
+          <w:rFonts w:ascii="Times New Roman" w:hAnsi="Times New Roman"/>
+          <w:b w:val="0"/>
+          <w:i w:val="0"/>
+          <w:color w:val="000000"/>
+          <w:sz w:val="26"/>
+        </w:rPr>
+        <w:t xml:space="preserve"> Phát biểu được Nguyên lí I Nhiệt động lực học (</w:t>
+      </w:r>
+      <w:r>
+        <w:rPr>
+          <w:rFonts w:ascii="Times New Roman" w:hAnsi="Times New Roman"/>
+          <w:i/>
+          <w:color w:val="000000"/>
+          <w:sz w:val="26"/>
+        </w:rPr>
+        <w:t>Δ U = A + Q</w:t>
+      </w:r>
+      <w:r>
+        <w:rPr>
+          <w:rFonts w:ascii="Times New Roman" w:hAnsi="Times New Roman"/>
+          <w:b w:val="0"/>
+          <w:i w:val="0"/>
+          <w:color w:val="000000"/>
+          <w:sz w:val="26"/>
+        </w:rPr>
+        <w:t>) và giải thích đúng quy ước dấu của các đại lượng.</w:t>
+      </w:r>
+    </w:p>
+    <w:p>
+      <w:pPr>
+        <w:spacing w:before="60" w:after="60" w:line="312" w:lineRule="auto"/>
+        <w:ind w:left="283" w:hanging="170"/>
+        <w:jc w:val="both"/>
+      </w:pPr>
+      <w:r>
+        <w:rPr>
+          <w:rFonts w:ascii="Times New Roman" w:hAnsi="Times New Roman"/>
+          <w:color w:val="000000"/>
+          <w:sz w:val="26"/>
+        </w:rPr>
+        <w:t xml:space="preserve">- </w:t>
+      </w:r>
+      <w:r>
+        <w:rPr>
+          <w:rFonts w:ascii="Times New Roman" w:hAnsi="Times New Roman"/>
+          <w:b w:val="0"/>
+          <w:i w:val="0"/>
+          <w:color w:val="000000"/>
+          <w:sz w:val="26"/>
+        </w:rPr>
+        <w:t xml:space="preserve">  </w:t>
+      </w:r>
+      <w:r>
+        <w:rPr>
+          <w:rFonts w:ascii="Times New Roman" w:hAnsi="Times New Roman"/>
+          <w:b/>
+          <w:i w:val="0"/>
+          <w:color w:val="000000"/>
+          <w:sz w:val="26"/>
+        </w:rPr>
+        <w:t>Nội dung:</w:t>
+      </w:r>
+      <w:r>
+        <w:rPr>
+          <w:rFonts w:ascii="Times New Roman" w:hAnsi="Times New Roman"/>
+          <w:b w:val="0"/>
+          <w:i w:val="0"/>
+          <w:color w:val="000000"/>
+          <w:sz w:val="26"/>
+        </w:rPr>
+        <w:t xml:space="preserve"> Tìm hiểu biểu thức toán học và bảng quy ước dấu.</w:t>
+      </w:r>
+    </w:p>
+    <w:p>
+      <w:pPr>
+        <w:spacing w:before="60" w:after="60" w:line="312" w:lineRule="auto"/>
+        <w:ind w:left="283" w:hanging="170"/>
+        <w:jc w:val="both"/>
+      </w:pPr>
+      <w:r>
+        <w:rPr>
+          <w:rFonts w:ascii="Times New Roman" w:hAnsi="Times New Roman"/>
+          <w:color w:val="000000"/>
+          <w:sz w:val="26"/>
+        </w:rPr>
+        <w:t xml:space="preserve">- </w:t>
+      </w:r>
+      <w:r>
+        <w:rPr>
+          <w:rFonts w:ascii="Times New Roman" w:hAnsi="Times New Roman"/>
+          <w:b w:val="0"/>
+          <w:i w:val="0"/>
+          <w:color w:val="000000"/>
+          <w:sz w:val="26"/>
+        </w:rPr>
+        <w:t xml:space="preserve">  </w:t>
+      </w:r>
+      <w:r>
+        <w:rPr>
+          <w:rFonts w:ascii="Times New Roman" w:hAnsi="Times New Roman"/>
+          <w:b/>
+          <w:i w:val="0"/>
+          <w:color w:val="000000"/>
+          <w:sz w:val="26"/>
+        </w:rPr>
+        <w:t>Sản phẩm:</w:t>
+      </w:r>
+      <w:r>
+        <w:rPr>
+          <w:rFonts w:ascii="Times New Roman" w:hAnsi="Times New Roman"/>
+          <w:b w:val="0"/>
+          <w:i w:val="0"/>
+          <w:color w:val="000000"/>
+          <w:sz w:val="26"/>
+        </w:rPr>
+        <w:t xml:space="preserve"> Ghi nhận biểu thức và bảng quy ước dấu chuẩn xác trên PHT.</w:t>
+      </w:r>
+    </w:p>
+    <w:tbl>
+      <w:tblPr>
+        <w:tblW w:type="auto" w:w="0"/>
+        <w:jc w:val="center"/>
+        <w:tblLayout w:type="fixed"/>
+        <w:tblLook w:firstColumn="1" w:firstRow="1" w:lastColumn="0" w:lastRow="0" w:noHBand="0" w:noVBand="1" w:val="04A0"/>
+        <w:tblW w:w="9072" w:type="dxa"/>
+      </w:tblPr>
+      <w:tblGrid>
+        <w:gridCol w:w="4535"/>
+        <w:gridCol w:w="4535"/>
+      </w:tblGrid>
+      <w:tr>
+        <w:trPr>
+          <w:tblHeader/>
+        </w:trPr>
+        <w:tc>
+          <w:tcPr>
+            <w:tcW w:type="dxa" w:w="4535"/>
+            <w:shd w:fill="D9D9D9"/>
+            <w:tcMar>
+              <w:top w:w="114" w:type="dxa"/>
+              <w:bottom w:w="114" w:type="dxa"/>
+              <w:left w:w="170" w:type="dxa"/>
+              <w:right w:w="170" w:type="dxa"/>
+            </w:tcMar>
+            <w:tcBorders>
+              <w:top w:val="single" w:sz="4" w:space="0" w:color="BFBFBF"/>
+              <w:left w:val="single" w:sz="4" w:space="0" w:color="BFBFBF"/>
+              <w:bottom w:val="single" w:sz="4" w:space="0" w:color="BFBFBF"/>
+              <w:right w:val="single" w:sz="4" w:space="0" w:color="BFBFBF"/>
+            </w:tcBorders>
+          </w:tcPr>
+          <w:p>
+            <w:pPr>
+              <w:spacing w:before="40" w:after="40"/>
+              <w:jc w:val="center"/>
+            </w:pPr>
+            <w:r/>
+            <w:r>
+              <w:rPr>
+                <w:rFonts w:ascii="Times New Roman" w:hAnsi="Times New Roman"/>
+                <w:b/>
+                <w:color w:val="000000"/>
+                <w:sz w:val="22"/>
+              </w:rPr>
+              <w:t>Hoạt động của Giáo viên</w:t>
+            </w:r>
+          </w:p>
+        </w:tc>
+        <w:tc>
+          <w:tcPr>
+            <w:tcW w:type="dxa" w:w="4535"/>
+            <w:shd w:fill="D9D9D9"/>
+            <w:tcMar>
+              <w:top w:w="114" w:type="dxa"/>
+              <w:bottom w:w="114" w:type="dxa"/>
+              <w:left w:w="170" w:type="dxa"/>
+              <w:right w:w="170" w:type="dxa"/>
+            </w:tcMar>
+            <w:tcBorders>
+              <w:top w:val="single" w:sz="4" w:space="0" w:color="BFBFBF"/>
+              <w:left w:val="single" w:sz="4" w:space="0" w:color="BFBFBF"/>
+              <w:bottom w:val="single" w:sz="4" w:space="0" w:color="BFBFBF"/>
+              <w:right w:val="single" w:sz="4" w:space="0" w:color="BFBFBF"/>
+            </w:tcBorders>
+          </w:tcPr>
+          <w:p>
+            <w:pPr>
+              <w:spacing w:before="40" w:after="40"/>
+              <w:jc w:val="center"/>
+            </w:pPr>
+            <w:r/>
+            <w:r>
+              <w:rPr>
+                <w:rFonts w:ascii="Times New Roman" w:hAnsi="Times New Roman"/>
+                <w:b/>
+                <w:color w:val="000000"/>
+                <w:sz w:val="22"/>
+              </w:rPr>
+              <w:t>Hoạt động của Học sinh</w:t>
+            </w:r>
+          </w:p>
+        </w:tc>
+      </w:tr>
+      <w:tr>
+        <w:trPr>
+          <w:cantSplit/>
+        </w:trPr>
+        <w:tc>
+          <w:tcPr>
+            <w:tcW w:type="dxa" w:w="4535"/>
+            <w:tcMar>
+              <w:top w:w="114" w:type="dxa"/>
+              <w:bottom w:w="114" w:type="dxa"/>
+              <w:left w:w="170" w:type="dxa"/>
+              <w:right w:w="170" w:type="dxa"/>
+            </w:tcMar>
+            <w:tcBorders>
+              <w:top w:val="single" w:sz="4" w:space="0" w:color="BFBFBF"/>
+              <w:left w:val="single" w:sz="4" w:space="0" w:color="BFBFBF"/>
+              <w:bottom w:val="single" w:sz="4" w:space="0" w:color="BFBFBF"/>
+              <w:right w:val="single" w:sz="4" w:space="0" w:color="BFBFBF"/>
+            </w:tcBorders>
+          </w:tcPr>
+          <w:p>
+            <w:pPr>
+              <w:spacing w:before="40" w:after="40" w:line="276" w:lineRule="auto"/>
+              <w:jc w:val="left"/>
+            </w:pPr>
+            <w:r/>
+            <w:r>
+              <w:rPr>
+                <w:rFonts w:ascii="Times New Roman" w:hAnsi="Times New Roman"/>
+                <w:b/>
+                <w:color w:val="000000"/>
+                <w:sz w:val="22"/>
+              </w:rPr>
+              <w:t>Chuyển giao nhiệm vụ:</w:t>
+            </w:r>
+          </w:p>
+          <w:p>
+            <w:pPr>
+              <w:spacing w:before="40" w:after="40" w:line="276" w:lineRule="auto"/>
+              <w:ind w:left="170" w:hanging="113"/>
+              <w:jc w:val="left"/>
+            </w:pPr>
+            <w:r>
+              <w:rPr>
+                <w:rFonts w:ascii="Times New Roman" w:hAnsi="Times New Roman"/>
+                <w:color w:val="000000"/>
+                <w:sz w:val="22"/>
+              </w:rPr>
+              <w:t xml:space="preserve">- </w:t>
+            </w:r>
+            <w:r>
+              <w:rPr>
+                <w:rFonts w:ascii="Times New Roman" w:hAnsi="Times New Roman"/>
+                <w:color w:val="000000"/>
+                <w:sz w:val="22"/>
+              </w:rPr>
+              <w:t xml:space="preserve">GV yêu cầu HS kết hợp hai quá trình thực hiện công và truyền nhiệt để viết biểu thức liên hệ độ biến thiên nội năng </w:t>
             </w:r>
             <w:r>
               <w:rPr>
@@ -2946,7 +3530,196 @@
                 <w:color w:val="000000"/>
                 <w:sz w:val="22"/>
               </w:rPr>
-              <w:t>J/kg.K</w:t>
+              <w:t>Δ U</w:t>
+            </w:r>
+            <w:r>
+              <w:rPr>
+                <w:rFonts w:ascii="Times New Roman" w:hAnsi="Times New Roman"/>
+                <w:color w:val="000000"/>
+                <w:sz w:val="22"/>
+              </w:rPr>
+              <w:t xml:space="preserve"> với công </w:t>
+            </w:r>
+            <w:r>
+              <w:rPr>
+                <w:rFonts w:ascii="Times New Roman" w:hAnsi="Times New Roman"/>
+                <w:i/>
+                <w:color w:val="000000"/>
+                <w:sz w:val="22"/>
+              </w:rPr>
+              <w:t>A</w:t>
+            </w:r>
+            <w:r>
+              <w:rPr>
+                <w:rFonts w:ascii="Times New Roman" w:hAnsi="Times New Roman"/>
+                <w:color w:val="000000"/>
+                <w:sz w:val="22"/>
+              </w:rPr>
+              <w:t xml:space="preserve"> và nhiệt lượng </w:t>
+            </w:r>
+            <w:r>
+              <w:rPr>
+                <w:rFonts w:ascii="Times New Roman" w:hAnsi="Times New Roman"/>
+                <w:i/>
+                <w:color w:val="000000"/>
+                <w:sz w:val="22"/>
+              </w:rPr>
+              <w:t>Q</w:t>
+            </w:r>
+            <w:r>
+              <w:rPr>
+                <w:rFonts w:ascii="Times New Roman" w:hAnsi="Times New Roman"/>
+                <w:color w:val="000000"/>
+                <w:sz w:val="22"/>
+              </w:rPr>
+              <w:t>. Yêu cầu nghiên cứu bảng quy ước dấu trong SGK.</w:t>
+            </w:r>
+          </w:p>
+        </w:tc>
+        <w:tc>
+          <w:tcPr>
+            <w:tcW w:type="dxa" w:w="4535"/>
+            <w:tcMar>
+              <w:top w:w="114" w:type="dxa"/>
+              <w:bottom w:w="114" w:type="dxa"/>
+              <w:left w:w="170" w:type="dxa"/>
+              <w:right w:w="170" w:type="dxa"/>
+            </w:tcMar>
+            <w:tcBorders>
+              <w:top w:val="single" w:sz="4" w:space="0" w:color="BFBFBF"/>
+              <w:left w:val="single" w:sz="4" w:space="0" w:color="BFBFBF"/>
+              <w:bottom w:val="single" w:sz="4" w:space="0" w:color="BFBFBF"/>
+              <w:right w:val="single" w:sz="4" w:space="0" w:color="BFBFBF"/>
+            </w:tcBorders>
+          </w:tcPr>
+          <w:p>
+            <w:pPr>
+              <w:spacing w:before="40" w:after="40" w:line="276" w:lineRule="auto"/>
+              <w:jc w:val="left"/>
+            </w:pPr>
+            <w:r/>
+            <w:r>
+              <w:rPr>
+                <w:rFonts w:ascii="Times New Roman" w:hAnsi="Times New Roman"/>
+                <w:b/>
+                <w:color w:val="000000"/>
+                <w:sz w:val="22"/>
+              </w:rPr>
+              <w:t>Tiếp nhận nhiệm vụ:</w:t>
+            </w:r>
+            <w:r>
+              <w:rPr>
+                <w:rFonts w:ascii="Times New Roman" w:hAnsi="Times New Roman"/>
+                <w:color w:val="000000"/>
+                <w:sz w:val="22"/>
+              </w:rPr>
+              <w:t xml:space="preserve"> Học sinh tiếp nhận nhiệm vụ học tập từ giáo viên.</w:t>
+            </w:r>
+          </w:p>
+        </w:tc>
+      </w:tr>
+      <w:tr>
+        <w:trPr>
+          <w:cantSplit/>
+        </w:trPr>
+        <w:tc>
+          <w:tcPr>
+            <w:tcW w:type="dxa" w:w="4535"/>
+            <w:tcMar>
+              <w:top w:w="114" w:type="dxa"/>
+              <w:bottom w:w="114" w:type="dxa"/>
+              <w:left w:w="170" w:type="dxa"/>
+              <w:right w:w="170" w:type="dxa"/>
+            </w:tcMar>
+            <w:tcBorders>
+              <w:top w:val="single" w:sz="4" w:space="0" w:color="BFBFBF"/>
+              <w:left w:val="single" w:sz="4" w:space="0" w:color="BFBFBF"/>
+              <w:bottom w:val="single" w:sz="4" w:space="0" w:color="BFBFBF"/>
+              <w:right w:val="single" w:sz="4" w:space="0" w:color="BFBFBF"/>
+            </w:tcBorders>
+          </w:tcPr>
+          <w:p>
+            <w:pPr>
+              <w:spacing w:before="40" w:after="40" w:line="276" w:lineRule="auto"/>
+              <w:jc w:val="left"/>
+            </w:pPr>
+            <w:r/>
+            <w:r>
+              <w:rPr>
+                <w:rFonts w:ascii="Times New Roman" w:hAnsi="Times New Roman"/>
+                <w:b/>
+                <w:color w:val="000000"/>
+                <w:sz w:val="22"/>
+              </w:rPr>
+              <w:t>Theo dõi, hỗ trợ:</w:t>
+            </w:r>
+            <w:r>
+              <w:rPr>
+                <w:rFonts w:ascii="Times New Roman" w:hAnsi="Times New Roman"/>
+                <w:color w:val="000000"/>
+                <w:sz w:val="22"/>
+              </w:rPr>
+              <w:t xml:space="preserve"> GV hỗ trợ HS ghi nhớ quy ước dấu: Hệ nhận nhiệt (</w:t>
+            </w:r>
+            <w:r>
+              <w:rPr>
+                <w:rFonts w:ascii="Times New Roman" w:hAnsi="Times New Roman"/>
+                <w:i/>
+                <w:color w:val="000000"/>
+                <w:sz w:val="22"/>
+              </w:rPr>
+              <w:t>Q &gt; 0</w:t>
+            </w:r>
+            <w:r>
+              <w:rPr>
+                <w:rFonts w:ascii="Times New Roman" w:hAnsi="Times New Roman"/>
+                <w:color w:val="000000"/>
+                <w:sz w:val="22"/>
+              </w:rPr>
+              <w:t>)/nhận công (</w:t>
+            </w:r>
+            <w:r>
+              <w:rPr>
+                <w:rFonts w:ascii="Times New Roman" w:hAnsi="Times New Roman"/>
+                <w:i/>
+                <w:color w:val="000000"/>
+                <w:sz w:val="22"/>
+              </w:rPr>
+              <w:t>A &gt; 0</w:t>
+            </w:r>
+            <w:r>
+              <w:rPr>
+                <w:rFonts w:ascii="Times New Roman" w:hAnsi="Times New Roman"/>
+                <w:color w:val="000000"/>
+                <w:sz w:val="22"/>
+              </w:rPr>
+              <w:t>); hệ tỏa nhiệt (</w:t>
+            </w:r>
+            <w:r>
+              <w:rPr>
+                <w:rFonts w:ascii="Times New Roman" w:hAnsi="Times New Roman"/>
+                <w:i/>
+                <w:color w:val="000000"/>
+                <w:sz w:val="22"/>
+              </w:rPr>
+              <w:t>Q &lt; 0</w:t>
+            </w:r>
+            <w:r>
+              <w:rPr>
+                <w:rFonts w:ascii="Times New Roman" w:hAnsi="Times New Roman"/>
+                <w:color w:val="000000"/>
+                <w:sz w:val="22"/>
+              </w:rPr>
+              <w:t>)/thực hiện công (</w:t>
+            </w:r>
+            <w:r>
+              <w:rPr>
+                <w:rFonts w:ascii="Times New Roman" w:hAnsi="Times New Roman"/>
+                <w:i/>
+                <w:color w:val="000000"/>
+                <w:sz w:val="22"/>
+              </w:rPr>
+              <w:t>A &lt; 0</w:t>
             </w:r>
             <w:r>
               <w:rPr>
@@ -2987,7 +3760,157 @@
                 <w:color w:val="000000"/>
                 <w:sz w:val="22"/>
               </w:rPr>
+              <w:t>Thực hiện nhiệm vụ:</w:t>
+            </w:r>
+            <w:r>
+              <w:rPr>
+                <w:rFonts w:ascii="Times New Roman" w:hAnsi="Times New Roman"/>
+                <w:color w:val="000000"/>
+                <w:sz w:val="22"/>
+              </w:rPr>
+              <w:t xml:space="preserve"> HS làm việc cá nhân hoàn thành hệ thức </w:t>
+            </w:r>
+            <w:r>
+              <w:rPr>
+                <w:rFonts w:ascii="Times New Roman" w:hAnsi="Times New Roman"/>
+                <w:i/>
+                <w:color w:val="000000"/>
+                <w:sz w:val="22"/>
+              </w:rPr>
+              <w:t>Δ U = A + Q</w:t>
+            </w:r>
+            <w:r>
+              <w:rPr>
+                <w:rFonts w:ascii="Times New Roman" w:hAnsi="Times New Roman"/>
+                <w:color w:val="000000"/>
+                <w:sz w:val="22"/>
+              </w:rPr>
+              <w:t xml:space="preserve"> và vẽ bảng quy ước dấu vào PHT.</w:t>
+            </w:r>
+          </w:p>
+        </w:tc>
+      </w:tr>
+      <w:tr>
+        <w:trPr>
+          <w:cantSplit/>
+        </w:trPr>
+        <w:tc>
+          <w:tcPr>
+            <w:tcW w:type="dxa" w:w="4535"/>
+            <w:tcMar>
+              <w:top w:w="114" w:type="dxa"/>
+              <w:bottom w:w="114" w:type="dxa"/>
+              <w:left w:w="170" w:type="dxa"/>
+              <w:right w:w="170" w:type="dxa"/>
+            </w:tcMar>
+            <w:tcBorders>
+              <w:top w:val="single" w:sz="4" w:space="0" w:color="BFBFBF"/>
+              <w:left w:val="single" w:sz="4" w:space="0" w:color="BFBFBF"/>
+              <w:bottom w:val="single" w:sz="4" w:space="0" w:color="BFBFBF"/>
+              <w:right w:val="single" w:sz="4" w:space="0" w:color="BFBFBF"/>
+            </w:tcBorders>
+          </w:tcPr>
+          <w:p>
+            <w:pPr>
+              <w:spacing w:before="40" w:after="40" w:line="276" w:lineRule="auto"/>
+              <w:jc w:val="left"/>
+            </w:pPr>
+            <w:r/>
+            <w:r>
+              <w:rPr>
+                <w:rFonts w:ascii="Times New Roman" w:hAnsi="Times New Roman"/>
+                <w:b/>
+                <w:color w:val="000000"/>
+                <w:sz w:val="22"/>
+              </w:rPr>
+              <w:t>Tổ chức báo cáo:</w:t>
+            </w:r>
+            <w:r>
+              <w:rPr>
+                <w:rFonts w:ascii="Times New Roman" w:hAnsi="Times New Roman"/>
+                <w:color w:val="000000"/>
+                <w:sz w:val="22"/>
+              </w:rPr>
+              <w:t xml:space="preserve"> GV gọi HS lên bảng viết biểu thức và vẽ bảng quy ước dấu.</w:t>
+            </w:r>
+          </w:p>
+        </w:tc>
+        <w:tc>
+          <w:tcPr>
+            <w:tcW w:type="dxa" w:w="4535"/>
+            <w:tcMar>
+              <w:top w:w="114" w:type="dxa"/>
+              <w:bottom w:w="114" w:type="dxa"/>
+              <w:left w:w="170" w:type="dxa"/>
+              <w:right w:w="170" w:type="dxa"/>
+            </w:tcMar>
+            <w:tcBorders>
+              <w:top w:val="single" w:sz="4" w:space="0" w:color="BFBFBF"/>
+              <w:left w:val="single" w:sz="4" w:space="0" w:color="BFBFBF"/>
+              <w:bottom w:val="single" w:sz="4" w:space="0" w:color="BFBFBF"/>
+              <w:right w:val="single" w:sz="4" w:space="0" w:color="BFBFBF"/>
+            </w:tcBorders>
+          </w:tcPr>
+          <w:p>
+            <w:pPr>
+              <w:spacing w:before="40" w:after="40" w:line="276" w:lineRule="auto"/>
+              <w:jc w:val="left"/>
+            </w:pPr>
+            <w:r/>
+            <w:r>
+              <w:rPr>
+                <w:rFonts w:ascii="Times New Roman" w:hAnsi="Times New Roman"/>
+                <w:b/>
+                <w:color w:val="000000"/>
+                <w:sz w:val="22"/>
+              </w:rPr>
               <w:t>Báo cáo, thảo luận:</w:t>
+            </w:r>
+            <w:r>
+              <w:rPr>
+                <w:rFonts w:ascii="Times New Roman" w:hAnsi="Times New Roman"/>
+                <w:color w:val="000000"/>
+                <w:sz w:val="22"/>
+              </w:rPr>
+              <w:t xml:space="preserve"> HS lên bảng trình bày, các HS khác nhận xét chéo.</w:t>
+            </w:r>
+          </w:p>
+        </w:tc>
+      </w:tr>
+      <w:tr>
+        <w:trPr>
+          <w:cantSplit/>
+        </w:trPr>
+        <w:tc>
+          <w:tcPr>
+            <w:tcW w:type="dxa" w:w="4535"/>
+            <w:tcMar>
+              <w:top w:w="114" w:type="dxa"/>
+              <w:bottom w:w="114" w:type="dxa"/>
+              <w:left w:w="170" w:type="dxa"/>
+              <w:right w:w="170" w:type="dxa"/>
+            </w:tcMar>
+            <w:tcBorders>
+              <w:top w:val="single" w:sz="4" w:space="0" w:color="BFBFBF"/>
+              <w:left w:val="single" w:sz="4" w:space="0" w:color="BFBFBF"/>
+              <w:bottom w:val="single" w:sz="4" w:space="0" w:color="BFBFBF"/>
+              <w:right w:val="single" w:sz="4" w:space="0" w:color="BFBFBF"/>
+            </w:tcBorders>
+          </w:tcPr>
+          <w:p>
+            <w:pPr>
+              <w:spacing w:before="40" w:after="40" w:line="276" w:lineRule="auto"/>
+              <w:jc w:val="left"/>
+            </w:pPr>
+            <w:r/>
+            <w:r>
+              <w:rPr>
+                <w:rFonts w:ascii="Times New Roman" w:hAnsi="Times New Roman"/>
+                <w:b/>
+                <w:color w:val="000000"/>
+                <w:sz w:val="22"/>
+              </w:rPr>
+              <w:t>Kết luận, nhận định:</w:t>
             </w:r>
           </w:p>
           <w:p>
@@ -3010,7 +3933,364 @@
                 <w:color w:val="000000"/>
                 <w:sz w:val="22"/>
               </w:rPr>
-              <w:t>HS phát biểu phần điền khuyết công thức.</w:t>
+              <w:t>GV chuẩn hóa quy ước dấu và đưa ra ví dụ minh họa trực quan.</w:t>
+            </w:r>
+          </w:p>
+        </w:tc>
+        <w:tc>
+          <w:tcPr>
+            <w:tcW w:type="dxa" w:w="4535"/>
+            <w:tcMar>
+              <w:top w:w="114" w:type="dxa"/>
+              <w:bottom w:w="114" w:type="dxa"/>
+              <w:left w:w="170" w:type="dxa"/>
+              <w:right w:w="170" w:type="dxa"/>
+            </w:tcMar>
+            <w:tcBorders>
+              <w:top w:val="single" w:sz="4" w:space="0" w:color="BFBFBF"/>
+              <w:left w:val="single" w:sz="4" w:space="0" w:color="BFBFBF"/>
+              <w:bottom w:val="single" w:sz="4" w:space="0" w:color="BFBFBF"/>
+              <w:right w:val="single" w:sz="4" w:space="0" w:color="BFBFBF"/>
+            </w:tcBorders>
+          </w:tcPr>
+          <w:p>
+            <w:pPr>
+              <w:spacing w:before="40" w:after="40" w:line="276" w:lineRule="auto"/>
+              <w:jc w:val="left"/>
+            </w:pPr>
+            <w:r/>
+            <w:r>
+              <w:rPr>
+                <w:rFonts w:ascii="Times New Roman" w:hAnsi="Times New Roman"/>
+                <w:b/>
+                <w:color w:val="000000"/>
+                <w:sz w:val="22"/>
+              </w:rPr>
+              <w:t>Ghi nhận kiến thức:</w:t>
+            </w:r>
+            <w:r>
+              <w:rPr>
+                <w:rFonts w:ascii="Times New Roman" w:hAnsi="Times New Roman"/>
+                <w:color w:val="000000"/>
+                <w:sz w:val="22"/>
+              </w:rPr>
+              <w:t xml:space="preserve"> Học sinh lắng nghe nhận xét, đối chiếu lời giải và ghi chép kiến thức cốt lõi.</w:t>
+            </w:r>
+          </w:p>
+        </w:tc>
+      </w:tr>
+    </w:tbl>
+    <w:p/>
+    <w:p>
+      <w:pPr>
+        <w:pStyle w:val="Heading3"/>
+        <w:keepNext/>
+        <w:spacing w:before="120" w:after="60"/>
+        <w:ind w:left="0" w:firstLine="0"/>
+      </w:pPr>
+      <w:r>
+        <w:rPr>
+          <w:rFonts w:ascii="Times New Roman" w:hAnsi="Times New Roman"/>
+          <w:b w:val="0"/>
+          <w:i/>
+          <w:color w:val="000000"/>
+          <w:sz w:val="26"/>
+        </w:rPr>
+        <w:t>2.4. Đơn vị kiến thức 4: Nhiệt lượng và Công thức tính nhiệt lượng</w:t>
+      </w:r>
+    </w:p>
+    <w:p>
+      <w:pPr>
+        <w:spacing w:before="60" w:after="60" w:line="312" w:lineRule="auto"/>
+        <w:ind w:left="283" w:hanging="170"/>
+        <w:jc w:val="both"/>
+      </w:pPr>
+      <w:r>
+        <w:rPr>
+          <w:rFonts w:ascii="Times New Roman" w:hAnsi="Times New Roman"/>
+          <w:color w:val="000000"/>
+          <w:sz w:val="26"/>
+        </w:rPr>
+        <w:t xml:space="preserve">- </w:t>
+      </w:r>
+      <w:r>
+        <w:rPr>
+          <w:rFonts w:ascii="Times New Roman" w:hAnsi="Times New Roman"/>
+          <w:b w:val="0"/>
+          <w:i w:val="0"/>
+          <w:color w:val="000000"/>
+          <w:sz w:val="26"/>
+        </w:rPr>
+        <w:t xml:space="preserve">  </w:t>
+      </w:r>
+      <w:r>
+        <w:rPr>
+          <w:rFonts w:ascii="Times New Roman" w:hAnsi="Times New Roman"/>
+          <w:b/>
+          <w:i w:val="0"/>
+          <w:color w:val="000000"/>
+          <w:sz w:val="26"/>
+        </w:rPr>
+        <w:t>Mục tiêu:</w:t>
+      </w:r>
+      <w:r>
+        <w:rPr>
+          <w:rFonts w:ascii="Times New Roman" w:hAnsi="Times New Roman"/>
+          <w:b w:val="0"/>
+          <w:i w:val="0"/>
+          <w:color w:val="000000"/>
+          <w:sz w:val="26"/>
+        </w:rPr>
+        <w:t xml:space="preserve"> Phát biểu được định nghĩa nhiệt lượng và công thức tính nhiệt lượng thu vào/tỏa ra khi thay đổi nhiệt độ: </w:t>
+      </w:r>
+      <w:r>
+        <w:rPr>
+          <w:rFonts w:ascii="Times New Roman" w:hAnsi="Times New Roman"/>
+          <w:i/>
+          <w:color w:val="000000"/>
+          <w:sz w:val="26"/>
+        </w:rPr>
+        <w:t>Q = mcΔ t</w:t>
+      </w:r>
+      <w:r>
+        <w:rPr>
+          <w:rFonts w:ascii="Times New Roman" w:hAnsi="Times New Roman"/>
+          <w:b w:val="0"/>
+          <w:i w:val="0"/>
+          <w:color w:val="000000"/>
+          <w:sz w:val="26"/>
+        </w:rPr>
+        <w:t>.</w:t>
+      </w:r>
+    </w:p>
+    <w:p>
+      <w:pPr>
+        <w:spacing w:before="60" w:after="60" w:line="312" w:lineRule="auto"/>
+        <w:ind w:left="283" w:hanging="170"/>
+        <w:jc w:val="both"/>
+      </w:pPr>
+      <w:r>
+        <w:rPr>
+          <w:rFonts w:ascii="Times New Roman" w:hAnsi="Times New Roman"/>
+          <w:color w:val="000000"/>
+          <w:sz w:val="26"/>
+        </w:rPr>
+        <w:t xml:space="preserve">- </w:t>
+      </w:r>
+      <w:r>
+        <w:rPr>
+          <w:rFonts w:ascii="Times New Roman" w:hAnsi="Times New Roman"/>
+          <w:b w:val="0"/>
+          <w:i w:val="0"/>
+          <w:color w:val="000000"/>
+          <w:sz w:val="26"/>
+        </w:rPr>
+        <w:t xml:space="preserve">  </w:t>
+      </w:r>
+      <w:r>
+        <w:rPr>
+          <w:rFonts w:ascii="Times New Roman" w:hAnsi="Times New Roman"/>
+          <w:b/>
+          <w:i w:val="0"/>
+          <w:color w:val="000000"/>
+          <w:sz w:val="26"/>
+        </w:rPr>
+        <w:t>Nội dung:</w:t>
+      </w:r>
+      <w:r>
+        <w:rPr>
+          <w:rFonts w:ascii="Times New Roman" w:hAnsi="Times New Roman"/>
+          <w:b w:val="0"/>
+          <w:i w:val="0"/>
+          <w:color w:val="000000"/>
+          <w:sz w:val="26"/>
+        </w:rPr>
+        <w:t xml:space="preserve"> Tìm hiểu công thức tính nhiệt lượng và các đại lượng trong công thức.</w:t>
+      </w:r>
+    </w:p>
+    <w:p>
+      <w:pPr>
+        <w:spacing w:before="60" w:after="60" w:line="312" w:lineRule="auto"/>
+        <w:ind w:left="283" w:hanging="170"/>
+        <w:jc w:val="both"/>
+      </w:pPr>
+      <w:r>
+        <w:rPr>
+          <w:rFonts w:ascii="Times New Roman" w:hAnsi="Times New Roman"/>
+          <w:color w:val="000000"/>
+          <w:sz w:val="26"/>
+        </w:rPr>
+        <w:t xml:space="preserve">- </w:t>
+      </w:r>
+      <w:r>
+        <w:rPr>
+          <w:rFonts w:ascii="Times New Roman" w:hAnsi="Times New Roman"/>
+          <w:b w:val="0"/>
+          <w:i w:val="0"/>
+          <w:color w:val="000000"/>
+          <w:sz w:val="26"/>
+        </w:rPr>
+        <w:t xml:space="preserve">  </w:t>
+      </w:r>
+      <w:r>
+        <w:rPr>
+          <w:rFonts w:ascii="Times New Roman" w:hAnsi="Times New Roman"/>
+          <w:b/>
+          <w:i w:val="0"/>
+          <w:color w:val="000000"/>
+          <w:sz w:val="26"/>
+        </w:rPr>
+        <w:t>Sản phẩm:</w:t>
+      </w:r>
+      <w:r>
+        <w:rPr>
+          <w:rFonts w:ascii="Times New Roman" w:hAnsi="Times New Roman"/>
+          <w:b w:val="0"/>
+          <w:i w:val="0"/>
+          <w:color w:val="000000"/>
+          <w:sz w:val="26"/>
+        </w:rPr>
+        <w:t xml:space="preserve"> Công thức </w:t>
+      </w:r>
+      <w:r>
+        <w:rPr>
+          <w:rFonts w:ascii="Times New Roman" w:hAnsi="Times New Roman"/>
+          <w:i/>
+          <w:color w:val="000000"/>
+          <w:sz w:val="26"/>
+        </w:rPr>
+        <w:t>Q = mcΔ t</w:t>
+      </w:r>
+      <w:r>
+        <w:rPr>
+          <w:rFonts w:ascii="Times New Roman" w:hAnsi="Times New Roman"/>
+          <w:b w:val="0"/>
+          <w:i w:val="0"/>
+          <w:color w:val="000000"/>
+          <w:sz w:val="26"/>
+        </w:rPr>
+        <w:t xml:space="preserve"> và đơn vị của các đại lượng.</w:t>
+      </w:r>
+    </w:p>
+    <w:tbl>
+      <w:tblPr>
+        <w:tblW w:type="auto" w:w="0"/>
+        <w:jc w:val="center"/>
+        <w:tblLayout w:type="fixed"/>
+        <w:tblLook w:firstColumn="1" w:firstRow="1" w:lastColumn="0" w:lastRow="0" w:noHBand="0" w:noVBand="1" w:val="04A0"/>
+        <w:tblW w:w="9072" w:type="dxa"/>
+      </w:tblPr>
+      <w:tblGrid>
+        <w:gridCol w:w="4535"/>
+        <w:gridCol w:w="4535"/>
+      </w:tblGrid>
+      <w:tr>
+        <w:trPr>
+          <w:tblHeader/>
+        </w:trPr>
+        <w:tc>
+          <w:tcPr>
+            <w:tcW w:type="dxa" w:w="4535"/>
+            <w:shd w:fill="D9D9D9"/>
+            <w:tcMar>
+              <w:top w:w="114" w:type="dxa"/>
+              <w:bottom w:w="114" w:type="dxa"/>
+              <w:left w:w="170" w:type="dxa"/>
+              <w:right w:w="170" w:type="dxa"/>
+            </w:tcMar>
+            <w:tcBorders>
+              <w:top w:val="single" w:sz="4" w:space="0" w:color="BFBFBF"/>
+              <w:left w:val="single" w:sz="4" w:space="0" w:color="BFBFBF"/>
+              <w:bottom w:val="single" w:sz="4" w:space="0" w:color="BFBFBF"/>
+              <w:right w:val="single" w:sz="4" w:space="0" w:color="BFBFBF"/>
+            </w:tcBorders>
+          </w:tcPr>
+          <w:p>
+            <w:pPr>
+              <w:spacing w:before="40" w:after="40"/>
+              <w:jc w:val="center"/>
+            </w:pPr>
+            <w:r/>
+            <w:r>
+              <w:rPr>
+                <w:rFonts w:ascii="Times New Roman" w:hAnsi="Times New Roman"/>
+                <w:b/>
+                <w:color w:val="000000"/>
+                <w:sz w:val="22"/>
+              </w:rPr>
+              <w:t>Hoạt động của Giáo viên</w:t>
+            </w:r>
+          </w:p>
+        </w:tc>
+        <w:tc>
+          <w:tcPr>
+            <w:tcW w:type="dxa" w:w="4535"/>
+            <w:shd w:fill="D9D9D9"/>
+            <w:tcMar>
+              <w:top w:w="114" w:type="dxa"/>
+              <w:bottom w:w="114" w:type="dxa"/>
+              <w:left w:w="170" w:type="dxa"/>
+              <w:right w:w="170" w:type="dxa"/>
+            </w:tcMar>
+            <w:tcBorders>
+              <w:top w:val="single" w:sz="4" w:space="0" w:color="BFBFBF"/>
+              <w:left w:val="single" w:sz="4" w:space="0" w:color="BFBFBF"/>
+              <w:bottom w:val="single" w:sz="4" w:space="0" w:color="BFBFBF"/>
+              <w:right w:val="single" w:sz="4" w:space="0" w:color="BFBFBF"/>
+            </w:tcBorders>
+          </w:tcPr>
+          <w:p>
+            <w:pPr>
+              <w:spacing w:before="40" w:after="40"/>
+              <w:jc w:val="center"/>
+            </w:pPr>
+            <w:r/>
+            <w:r>
+              <w:rPr>
+                <w:rFonts w:ascii="Times New Roman" w:hAnsi="Times New Roman"/>
+                <w:b/>
+                <w:color w:val="000000"/>
+                <w:sz w:val="22"/>
+              </w:rPr>
+              <w:t>Hoạt động của Học sinh</w:t>
+            </w:r>
+          </w:p>
+        </w:tc>
+      </w:tr>
+      <w:tr>
+        <w:trPr>
+          <w:cantSplit/>
+        </w:trPr>
+        <w:tc>
+          <w:tcPr>
+            <w:tcW w:type="dxa" w:w="4535"/>
+            <w:tcMar>
+              <w:top w:w="114" w:type="dxa"/>
+              <w:bottom w:w="114" w:type="dxa"/>
+              <w:left w:w="170" w:type="dxa"/>
+              <w:right w:w="170" w:type="dxa"/>
+            </w:tcMar>
+            <w:tcBorders>
+              <w:top w:val="single" w:sz="4" w:space="0" w:color="BFBFBF"/>
+              <w:left w:val="single" w:sz="4" w:space="0" w:color="BFBFBF"/>
+              <w:bottom w:val="single" w:sz="4" w:space="0" w:color="BFBFBF"/>
+              <w:right w:val="single" w:sz="4" w:space="0" w:color="BFBFBF"/>
+            </w:tcBorders>
+          </w:tcPr>
+          <w:p>
+            <w:pPr>
+              <w:spacing w:before="40" w:after="40" w:line="276" w:lineRule="auto"/>
+              <w:jc w:val="left"/>
+            </w:pPr>
+            <w:r/>
+            <w:r>
+              <w:rPr>
+                <w:rFonts w:ascii="Times New Roman" w:hAnsi="Times New Roman"/>
+                <w:b/>
+                <w:color w:val="000000"/>
+                <w:sz w:val="22"/>
+              </w:rPr>
+              <w:t>Chuyển giao nhiệm vụ:</w:t>
             </w:r>
           </w:p>
           <w:p>
@@ -3033,7 +4313,545 @@
                 <w:color w:val="000000"/>
                 <w:sz w:val="22"/>
               </w:rPr>
-              <w:t>Cả lớp đối chiếu vở ghi.</w:t>
+              <w:t>GV đặt vấn đề: *“Khi truyền nhiệt làm vật tăng nhiệt độ, nhiệt lượng thu vào phụ thuộc những yếu tố nào của vật? Hãy nghiên cứu SGK để tìm ra công thức tính nhiệt lượng.”*</w:t>
+            </w:r>
+          </w:p>
+        </w:tc>
+        <w:tc>
+          <w:tcPr>
+            <w:tcW w:type="dxa" w:w="4535"/>
+            <w:tcMar>
+              <w:top w:w="114" w:type="dxa"/>
+              <w:bottom w:w="114" w:type="dxa"/>
+              <w:left w:w="170" w:type="dxa"/>
+              <w:right w:w="170" w:type="dxa"/>
+            </w:tcMar>
+            <w:tcBorders>
+              <w:top w:val="single" w:sz="4" w:space="0" w:color="BFBFBF"/>
+              <w:left w:val="single" w:sz="4" w:space="0" w:color="BFBFBF"/>
+              <w:bottom w:val="single" w:sz="4" w:space="0" w:color="BFBFBF"/>
+              <w:right w:val="single" w:sz="4" w:space="0" w:color="BFBFBF"/>
+            </w:tcBorders>
+          </w:tcPr>
+          <w:p>
+            <w:pPr>
+              <w:spacing w:before="40" w:after="40" w:line="276" w:lineRule="auto"/>
+              <w:jc w:val="left"/>
+            </w:pPr>
+            <w:r/>
+            <w:r>
+              <w:rPr>
+                <w:rFonts w:ascii="Times New Roman" w:hAnsi="Times New Roman"/>
+                <w:b/>
+                <w:color w:val="000000"/>
+                <w:sz w:val="22"/>
+              </w:rPr>
+              <w:t>Tiếp nhận nhiệm vụ:</w:t>
+            </w:r>
+            <w:r>
+              <w:rPr>
+                <w:rFonts w:ascii="Times New Roman" w:hAnsi="Times New Roman"/>
+                <w:color w:val="000000"/>
+                <w:sz w:val="22"/>
+              </w:rPr>
+              <w:t xml:space="preserve"> Học sinh tiếp nhận nhiệm vụ học tập từ giáo viên.</w:t>
+            </w:r>
+          </w:p>
+        </w:tc>
+      </w:tr>
+      <w:tr>
+        <w:trPr>
+          <w:cantSplit/>
+        </w:trPr>
+        <w:tc>
+          <w:tcPr>
+            <w:tcW w:type="dxa" w:w="4535"/>
+            <w:tcMar>
+              <w:top w:w="114" w:type="dxa"/>
+              <w:bottom w:w="114" w:type="dxa"/>
+              <w:left w:w="170" w:type="dxa"/>
+              <w:right w:w="170" w:type="dxa"/>
+            </w:tcMar>
+            <w:tcBorders>
+              <w:top w:val="single" w:sz="4" w:space="0" w:color="BFBFBF"/>
+              <w:left w:val="single" w:sz="4" w:space="0" w:color="BFBFBF"/>
+              <w:bottom w:val="single" w:sz="4" w:space="0" w:color="BFBFBF"/>
+              <w:right w:val="single" w:sz="4" w:space="0" w:color="BFBFBF"/>
+            </w:tcBorders>
+          </w:tcPr>
+          <w:p>
+            <w:pPr>
+              <w:spacing w:before="40" w:after="40" w:line="276" w:lineRule="auto"/>
+              <w:jc w:val="left"/>
+            </w:pPr>
+            <w:r/>
+            <w:r>
+              <w:rPr>
+                <w:rFonts w:ascii="Times New Roman" w:hAnsi="Times New Roman"/>
+                <w:b/>
+                <w:color w:val="000000"/>
+                <w:sz w:val="22"/>
+              </w:rPr>
+              <w:t>Theo dõi, hỗ trợ:</w:t>
+            </w:r>
+            <w:r>
+              <w:rPr>
+                <w:rFonts w:ascii="Times New Roman" w:hAnsi="Times New Roman"/>
+                <w:color w:val="000000"/>
+                <w:sz w:val="22"/>
+              </w:rPr>
+              <w:t xml:space="preserve"> GV hướng dẫn HS phân tích các đại lượng: khối lượng </w:t>
+            </w:r>
+            <w:r>
+              <w:rPr>
+                <w:rFonts w:ascii="Times New Roman" w:hAnsi="Times New Roman"/>
+                <w:i/>
+                <w:color w:val="000000"/>
+                <w:sz w:val="22"/>
+              </w:rPr>
+              <w:t>m</w:t>
+            </w:r>
+            <w:r>
+              <w:rPr>
+                <w:rFonts w:ascii="Times New Roman" w:hAnsi="Times New Roman"/>
+                <w:color w:val="000000"/>
+                <w:sz w:val="22"/>
+              </w:rPr>
+              <w:t xml:space="preserve">, độ tăng nhiệt độ </w:t>
+            </w:r>
+            <w:r>
+              <w:rPr>
+                <w:rFonts w:ascii="Times New Roman" w:hAnsi="Times New Roman"/>
+                <w:i/>
+                <w:color w:val="000000"/>
+                <w:sz w:val="22"/>
+              </w:rPr>
+              <w:t>Δ t</w:t>
+            </w:r>
+            <w:r>
+              <w:rPr>
+                <w:rFonts w:ascii="Times New Roman" w:hAnsi="Times New Roman"/>
+                <w:color w:val="000000"/>
+                <w:sz w:val="22"/>
+              </w:rPr>
+              <w:t>, và chất cấu tạo nên vật.</w:t>
+            </w:r>
+          </w:p>
+        </w:tc>
+        <w:tc>
+          <w:tcPr>
+            <w:tcW w:type="dxa" w:w="4535"/>
+            <w:tcMar>
+              <w:top w:w="114" w:type="dxa"/>
+              <w:bottom w:w="114" w:type="dxa"/>
+              <w:left w:w="170" w:type="dxa"/>
+              <w:right w:w="170" w:type="dxa"/>
+            </w:tcMar>
+            <w:tcBorders>
+              <w:top w:val="single" w:sz="4" w:space="0" w:color="BFBFBF"/>
+              <w:left w:val="single" w:sz="4" w:space="0" w:color="BFBFBF"/>
+              <w:bottom w:val="single" w:sz="4" w:space="0" w:color="BFBFBF"/>
+              <w:right w:val="single" w:sz="4" w:space="0" w:color="BFBFBF"/>
+            </w:tcBorders>
+          </w:tcPr>
+          <w:p>
+            <w:pPr>
+              <w:spacing w:before="40" w:after="40" w:line="276" w:lineRule="auto"/>
+              <w:jc w:val="left"/>
+            </w:pPr>
+            <w:r/>
+            <w:r>
+              <w:rPr>
+                <w:rFonts w:ascii="Times New Roman" w:hAnsi="Times New Roman"/>
+                <w:b/>
+                <w:color w:val="000000"/>
+                <w:sz w:val="22"/>
+              </w:rPr>
+              <w:t>Thực hiện nhiệm vụ:</w:t>
+            </w:r>
+            <w:r>
+              <w:rPr>
+                <w:rFonts w:ascii="Times New Roman" w:hAnsi="Times New Roman"/>
+                <w:color w:val="000000"/>
+                <w:sz w:val="22"/>
+              </w:rPr>
+              <w:t xml:space="preserve"> HS thảo luận cặp đôi hoàn thành phần điền khuyết công thức tính nhiệt lượng trong PHT.</w:t>
+            </w:r>
+          </w:p>
+        </w:tc>
+      </w:tr>
+      <w:tr>
+        <w:trPr>
+          <w:cantSplit/>
+        </w:trPr>
+        <w:tc>
+          <w:tcPr>
+            <w:tcW w:type="dxa" w:w="4535"/>
+            <w:tcMar>
+              <w:top w:w="114" w:type="dxa"/>
+              <w:bottom w:w="114" w:type="dxa"/>
+              <w:left w:w="170" w:type="dxa"/>
+              <w:right w:w="170" w:type="dxa"/>
+            </w:tcMar>
+            <w:tcBorders>
+              <w:top w:val="single" w:sz="4" w:space="0" w:color="BFBFBF"/>
+              <w:left w:val="single" w:sz="4" w:space="0" w:color="BFBFBF"/>
+              <w:bottom w:val="single" w:sz="4" w:space="0" w:color="BFBFBF"/>
+              <w:right w:val="single" w:sz="4" w:space="0" w:color="BFBFBF"/>
+            </w:tcBorders>
+          </w:tcPr>
+          <w:p>
+            <w:pPr>
+              <w:spacing w:before="40" w:after="40" w:line="276" w:lineRule="auto"/>
+              <w:jc w:val="left"/>
+            </w:pPr>
+            <w:r/>
+            <w:r>
+              <w:rPr>
+                <w:rFonts w:ascii="Times New Roman" w:hAnsi="Times New Roman"/>
+                <w:b/>
+                <w:color w:val="000000"/>
+                <w:sz w:val="22"/>
+              </w:rPr>
+              <w:t>Tổ chức báo cáo:</w:t>
+            </w:r>
+            <w:r>
+              <w:rPr>
+                <w:rFonts w:ascii="Times New Roman" w:hAnsi="Times New Roman"/>
+                <w:color w:val="000000"/>
+                <w:sz w:val="22"/>
+              </w:rPr>
+              <w:t xml:space="preserve"> GV gọi HS đọc công thức tính nhiệt lượng phát hiện được.</w:t>
+            </w:r>
+          </w:p>
+        </w:tc>
+        <w:tc>
+          <w:tcPr>
+            <w:tcW w:type="dxa" w:w="4535"/>
+            <w:tcMar>
+              <w:top w:w="114" w:type="dxa"/>
+              <w:bottom w:w="114" w:type="dxa"/>
+              <w:left w:w="170" w:type="dxa"/>
+              <w:right w:w="170" w:type="dxa"/>
+            </w:tcMar>
+            <w:tcBorders>
+              <w:top w:val="single" w:sz="4" w:space="0" w:color="BFBFBF"/>
+              <w:left w:val="single" w:sz="4" w:space="0" w:color="BFBFBF"/>
+              <w:bottom w:val="single" w:sz="4" w:space="0" w:color="BFBFBF"/>
+              <w:right w:val="single" w:sz="4" w:space="0" w:color="BFBFBF"/>
+            </w:tcBorders>
+          </w:tcPr>
+          <w:p>
+            <w:pPr>
+              <w:spacing w:before="40" w:after="40" w:line="276" w:lineRule="auto"/>
+              <w:jc w:val="left"/>
+            </w:pPr>
+            <w:r/>
+            <w:r>
+              <w:rPr>
+                <w:rFonts w:ascii="Times New Roman" w:hAnsi="Times New Roman"/>
+                <w:b/>
+                <w:color w:val="000000"/>
+                <w:sz w:val="22"/>
+              </w:rPr>
+              <w:t>Báo cáo, thảo luận:</w:t>
+            </w:r>
+            <w:r>
+              <w:rPr>
+                <w:rFonts w:ascii="Times New Roman" w:hAnsi="Times New Roman"/>
+                <w:color w:val="000000"/>
+                <w:sz w:val="22"/>
+              </w:rPr>
+              <w:t xml:space="preserve"> HS phát biểu công thức: </w:t>
+            </w:r>
+            <w:r>
+              <w:rPr>
+                <w:rFonts w:ascii="Times New Roman" w:hAnsi="Times New Roman"/>
+                <w:i/>
+                <w:color w:val="000000"/>
+                <w:sz w:val="22"/>
+              </w:rPr>
+              <w:t>Q = mcΔ t</w:t>
+            </w:r>
+            <w:r>
+              <w:rPr>
+                <w:rFonts w:ascii="Times New Roman" w:hAnsi="Times New Roman"/>
+                <w:color w:val="000000"/>
+                <w:sz w:val="22"/>
+              </w:rPr>
+              <w:t>. Giải thích đơn vị của các đại lượng (</w:t>
+            </w:r>
+            <w:r>
+              <w:rPr>
+                <w:rFonts w:ascii="Times New Roman" w:hAnsi="Times New Roman"/>
+                <w:i/>
+                <w:color w:val="000000"/>
+                <w:sz w:val="22"/>
+              </w:rPr>
+              <w:t>Q</w:t>
+            </w:r>
+            <w:r>
+              <w:rPr>
+                <w:rFonts w:ascii="Times New Roman" w:hAnsi="Times New Roman"/>
+                <w:color w:val="000000"/>
+                <w:sz w:val="22"/>
+              </w:rPr>
+              <w:t xml:space="preserve"> tính bằng Jun </w:t>
+            </w:r>
+            <w:r>
+              <w:rPr>
+                <w:rFonts w:ascii="Times New Roman" w:hAnsi="Times New Roman"/>
+                <w:i/>
+                <w:color w:val="000000"/>
+                <w:sz w:val="22"/>
+              </w:rPr>
+              <w:t>J</w:t>
+            </w:r>
+            <w:r>
+              <w:rPr>
+                <w:rFonts w:ascii="Times New Roman" w:hAnsi="Times New Roman"/>
+                <w:color w:val="000000"/>
+                <w:sz w:val="22"/>
+              </w:rPr>
+              <w:t xml:space="preserve">, </w:t>
+            </w:r>
+            <w:r>
+              <w:rPr>
+                <w:rFonts w:ascii="Times New Roman" w:hAnsi="Times New Roman"/>
+                <w:i/>
+                <w:color w:val="000000"/>
+                <w:sz w:val="22"/>
+              </w:rPr>
+              <w:t>m</w:t>
+            </w:r>
+            <w:r>
+              <w:rPr>
+                <w:rFonts w:ascii="Times New Roman" w:hAnsi="Times New Roman"/>
+                <w:color w:val="000000"/>
+                <w:sz w:val="22"/>
+              </w:rPr>
+              <w:t xml:space="preserve"> tính bằng </w:t>
+            </w:r>
+            <w:r>
+              <w:rPr>
+                <w:rFonts w:ascii="Times New Roman" w:hAnsi="Times New Roman"/>
+                <w:i/>
+                <w:color w:val="000000"/>
+                <w:sz w:val="22"/>
+              </w:rPr>
+              <w:t>kg</w:t>
+            </w:r>
+            <w:r>
+              <w:rPr>
+                <w:rFonts w:ascii="Times New Roman" w:hAnsi="Times New Roman"/>
+                <w:color w:val="000000"/>
+                <w:sz w:val="22"/>
+              </w:rPr>
+              <w:t xml:space="preserve">, </w:t>
+            </w:r>
+            <w:r>
+              <w:rPr>
+                <w:rFonts w:ascii="Times New Roman" w:hAnsi="Times New Roman"/>
+                <w:i/>
+                <w:color w:val="000000"/>
+                <w:sz w:val="22"/>
+              </w:rPr>
+              <w:t>Δ t</w:t>
+            </w:r>
+            <w:r>
+              <w:rPr>
+                <w:rFonts w:ascii="Times New Roman" w:hAnsi="Times New Roman"/>
+                <w:color w:val="000000"/>
+                <w:sz w:val="22"/>
+              </w:rPr>
+              <w:t xml:space="preserve"> tính bằng </w:t>
+            </w:r>
+            <w:r>
+              <w:rPr>
+                <w:rFonts w:ascii="Times New Roman" w:hAnsi="Times New Roman"/>
+                <w:i/>
+                <w:color w:val="000000"/>
+                <w:sz w:val="22"/>
+              </w:rPr>
+              <w:t>K</w:t>
+            </w:r>
+            <w:r>
+              <w:rPr>
+                <w:rFonts w:ascii="Times New Roman" w:hAnsi="Times New Roman"/>
+                <w:color w:val="000000"/>
+                <w:sz w:val="22"/>
+              </w:rPr>
+              <w:t xml:space="preserve"> hoặc </w:t>
+            </w:r>
+            <w:r>
+              <w:rPr>
+                <w:rFonts w:ascii="Times New Roman" w:hAnsi="Times New Roman"/>
+                <w:i/>
+                <w:color w:val="000000"/>
+                <w:sz w:val="22"/>
+              </w:rPr>
+              <w:t>^° C</w:t>
+            </w:r>
+            <w:r>
+              <w:rPr>
+                <w:rFonts w:ascii="Times New Roman" w:hAnsi="Times New Roman"/>
+                <w:color w:val="000000"/>
+                <w:sz w:val="22"/>
+              </w:rPr>
+              <w:t>).</w:t>
+            </w:r>
+          </w:p>
+        </w:tc>
+      </w:tr>
+      <w:tr>
+        <w:trPr>
+          <w:cantSplit/>
+        </w:trPr>
+        <w:tc>
+          <w:tcPr>
+            <w:tcW w:type="dxa" w:w="4535"/>
+            <w:tcMar>
+              <w:top w:w="114" w:type="dxa"/>
+              <w:bottom w:w="114" w:type="dxa"/>
+              <w:left w:w="170" w:type="dxa"/>
+              <w:right w:w="170" w:type="dxa"/>
+            </w:tcMar>
+            <w:tcBorders>
+              <w:top w:val="single" w:sz="4" w:space="0" w:color="BFBFBF"/>
+              <w:left w:val="single" w:sz="4" w:space="0" w:color="BFBFBF"/>
+              <w:bottom w:val="single" w:sz="4" w:space="0" w:color="BFBFBF"/>
+              <w:right w:val="single" w:sz="4" w:space="0" w:color="BFBFBF"/>
+            </w:tcBorders>
+          </w:tcPr>
+          <w:p>
+            <w:pPr>
+              <w:spacing w:before="40" w:after="40" w:line="276" w:lineRule="auto"/>
+              <w:jc w:val="left"/>
+            </w:pPr>
+            <w:r/>
+            <w:r>
+              <w:rPr>
+                <w:rFonts w:ascii="Times New Roman" w:hAnsi="Times New Roman"/>
+                <w:b/>
+                <w:color w:val="000000"/>
+                <w:sz w:val="22"/>
+              </w:rPr>
+              <w:t>Kết luận, nhận định:</w:t>
+            </w:r>
+          </w:p>
+          <w:p>
+            <w:pPr>
+              <w:spacing w:before="40" w:after="40" w:line="276" w:lineRule="auto"/>
+              <w:ind w:left="170" w:hanging="113"/>
+              <w:jc w:val="left"/>
+            </w:pPr>
+            <w:r>
+              <w:rPr>
+                <w:rFonts w:ascii="Times New Roman" w:hAnsi="Times New Roman"/>
+                <w:color w:val="000000"/>
+                <w:sz w:val="22"/>
+              </w:rPr>
+              <w:t xml:space="preserve">- </w:t>
+            </w:r>
+            <w:r>
+              <w:rPr>
+                <w:rFonts w:ascii="Times New Roman" w:hAnsi="Times New Roman"/>
+                <w:color w:val="000000"/>
+                <w:sz w:val="22"/>
+              </w:rPr>
+              <w:t xml:space="preserve">GV chốt công thức và lưu ý dấu của </w:t>
+            </w:r>
+            <w:r>
+              <w:rPr>
+                <w:rFonts w:ascii="Times New Roman" w:hAnsi="Times New Roman"/>
+                <w:i/>
+                <w:color w:val="000000"/>
+                <w:sz w:val="22"/>
+              </w:rPr>
+              <w:t>Q</w:t>
+            </w:r>
+            <w:r>
+              <w:rPr>
+                <w:rFonts w:ascii="Times New Roman" w:hAnsi="Times New Roman"/>
+                <w:color w:val="000000"/>
+                <w:sz w:val="22"/>
+              </w:rPr>
+              <w:t xml:space="preserve">: hệ thu nhiệt </w:t>
+            </w:r>
+            <w:r>
+              <w:rPr>
+                <w:rFonts w:ascii="Times New Roman" w:hAnsi="Times New Roman"/>
+                <w:i/>
+                <w:color w:val="000000"/>
+                <w:sz w:val="22"/>
+              </w:rPr>
+              <w:t>Q &gt; 0</w:t>
+            </w:r>
+            <w:r>
+              <w:rPr>
+                <w:rFonts w:ascii="Times New Roman" w:hAnsi="Times New Roman"/>
+                <w:color w:val="000000"/>
+                <w:sz w:val="22"/>
+              </w:rPr>
+              <w:t xml:space="preserve">, hệ tỏa nhiệt </w:t>
+            </w:r>
+            <w:r>
+              <w:rPr>
+                <w:rFonts w:ascii="Times New Roman" w:hAnsi="Times New Roman"/>
+                <w:i/>
+                <w:color w:val="000000"/>
+                <w:sz w:val="22"/>
+              </w:rPr>
+              <w:t>Q &lt; 0</w:t>
+            </w:r>
+            <w:r>
+              <w:rPr>
+                <w:rFonts w:ascii="Times New Roman" w:hAnsi="Times New Roman"/>
+                <w:color w:val="000000"/>
+                <w:sz w:val="22"/>
+              </w:rPr>
+              <w:t>.</w:t>
+            </w:r>
+          </w:p>
+        </w:tc>
+        <w:tc>
+          <w:tcPr>
+            <w:tcW w:type="dxa" w:w="4535"/>
+            <w:tcMar>
+              <w:top w:w="114" w:type="dxa"/>
+              <w:bottom w:w="114" w:type="dxa"/>
+              <w:left w:w="170" w:type="dxa"/>
+              <w:right w:w="170" w:type="dxa"/>
+            </w:tcMar>
+            <w:tcBorders>
+              <w:top w:val="single" w:sz="4" w:space="0" w:color="BFBFBF"/>
+              <w:left w:val="single" w:sz="4" w:space="0" w:color="BFBFBF"/>
+              <w:bottom w:val="single" w:sz="4" w:space="0" w:color="BFBFBF"/>
+              <w:right w:val="single" w:sz="4" w:space="0" w:color="BFBFBF"/>
+            </w:tcBorders>
+          </w:tcPr>
+          <w:p>
+            <w:pPr>
+              <w:spacing w:before="40" w:after="40" w:line="276" w:lineRule="auto"/>
+              <w:jc w:val="left"/>
+            </w:pPr>
+            <w:r/>
+            <w:r>
+              <w:rPr>
+                <w:rFonts w:ascii="Times New Roman" w:hAnsi="Times New Roman"/>
+                <w:b/>
+                <w:color w:val="000000"/>
+                <w:sz w:val="22"/>
+              </w:rPr>
+              <w:t>Ghi nhận kiến thức:</w:t>
+            </w:r>
+            <w:r>
+              <w:rPr>
+                <w:rFonts w:ascii="Times New Roman" w:hAnsi="Times New Roman"/>
+                <w:color w:val="000000"/>
+                <w:sz w:val="22"/>
+              </w:rPr>
+              <w:t xml:space="preserve"> Học sinh lắng nghe nhận xét, đối chiếu lời giải và ghi chép kiến thức cốt lõi.</w:t>
             </w:r>
           </w:p>
         </w:tc>
@@ -3042,10 +4860,36 @@
     <w:p/>
     <w:p>
       <w:pPr>
-        <w:spacing w:before="120" w:after="120" w:line="312" w:lineRule="auto"/>
-        <w:ind w:left="0" w:firstLine="567"/>
+        <w:pStyle w:val="Heading3"/>
+        <w:keepNext/>
+        <w:spacing w:before="120" w:after="60"/>
+        <w:ind w:left="0" w:firstLine="0"/>
+      </w:pPr>
+      <w:r>
+        <w:rPr>
+          <w:rFonts w:ascii="Times New Roman" w:hAnsi="Times New Roman"/>
+          <w:b w:val="0"/>
+          <w:i/>
+          <w:color w:val="000000"/>
+          <w:sz w:val="26"/>
+        </w:rPr>
+        <w:t>2.5. Đơn vị kiến thức 5: Khái niệm nhiệt dung riêng của chất</w:t>
+      </w:r>
+    </w:p>
+    <w:p>
+      <w:pPr>
+        <w:spacing w:before="60" w:after="60" w:line="312" w:lineRule="auto"/>
+        <w:ind w:left="283" w:hanging="170"/>
         <w:jc w:val="both"/>
       </w:pPr>
+      <w:r>
+        <w:rPr>
+          <w:rFonts w:ascii="Times New Roman" w:hAnsi="Times New Roman"/>
+          <w:color w:val="000000"/>
+          <w:sz w:val="26"/>
+        </w:rPr>
+        <w:t xml:space="preserve">- </w:t>
+      </w:r>
       <w:r>
         <w:rPr>
           <w:rFonts w:ascii="Times New Roman" w:hAnsi="Times New Roman"/>
@@ -3054,9 +4898,696 @@
           <w:color w:val="000000"/>
           <w:sz w:val="26"/>
         </w:rPr>
-        <w:t>---</w:t>
+        <w:t xml:space="preserve">  </w:t>
+      </w:r>
+      <w:r>
+        <w:rPr>
+          <w:rFonts w:ascii="Times New Roman" w:hAnsi="Times New Roman"/>
+          <w:b/>
+          <w:i w:val="0"/>
+          <w:color w:val="000000"/>
+          <w:sz w:val="26"/>
+        </w:rPr>
+        <w:t>Mục tiêu:</w:t>
+      </w:r>
+      <w:r>
+        <w:rPr>
+          <w:rFonts w:ascii="Times New Roman" w:hAnsi="Times New Roman"/>
+          <w:b w:val="0"/>
+          <w:i w:val="0"/>
+          <w:color w:val="000000"/>
+          <w:sz w:val="26"/>
+        </w:rPr>
+        <w:t xml:space="preserve"> Nêu được ý nghĩa vật lý đặc trưng của nhiệt dung riêng </w:t>
+      </w:r>
+      <w:r>
+        <w:rPr>
+          <w:rFonts w:ascii="Times New Roman" w:hAnsi="Times New Roman"/>
+          <w:i/>
+          <w:color w:val="000000"/>
+          <w:sz w:val="26"/>
+        </w:rPr>
+        <w:t>c</w:t>
+      </w:r>
+      <w:r>
+        <w:rPr>
+          <w:rFonts w:ascii="Times New Roman" w:hAnsi="Times New Roman"/>
+          <w:b w:val="0"/>
+          <w:i w:val="0"/>
+          <w:color w:val="000000"/>
+          <w:sz w:val="26"/>
+        </w:rPr>
+        <w:t xml:space="preserve"> của các chất khác nhau thông qua bảng số liệu thực nghiệm.</w:t>
       </w:r>
     </w:p>
+    <w:p>
+      <w:pPr>
+        <w:spacing w:before="60" w:after="60" w:line="312" w:lineRule="auto"/>
+        <w:ind w:left="283" w:hanging="170"/>
+        <w:jc w:val="both"/>
+      </w:pPr>
+      <w:r>
+        <w:rPr>
+          <w:rFonts w:ascii="Times New Roman" w:hAnsi="Times New Roman"/>
+          <w:color w:val="000000"/>
+          <w:sz w:val="26"/>
+        </w:rPr>
+        <w:t xml:space="preserve">- </w:t>
+      </w:r>
+      <w:r>
+        <w:rPr>
+          <w:rFonts w:ascii="Times New Roman" w:hAnsi="Times New Roman"/>
+          <w:b w:val="0"/>
+          <w:i w:val="0"/>
+          <w:color w:val="000000"/>
+          <w:sz w:val="26"/>
+        </w:rPr>
+        <w:t xml:space="preserve">  </w:t>
+      </w:r>
+      <w:r>
+        <w:rPr>
+          <w:rFonts w:ascii="Times New Roman" w:hAnsi="Times New Roman"/>
+          <w:b/>
+          <w:i w:val="0"/>
+          <w:color w:val="000000"/>
+          <w:sz w:val="26"/>
+        </w:rPr>
+        <w:t>Nội dung:</w:t>
+      </w:r>
+      <w:r>
+        <w:rPr>
+          <w:rFonts w:ascii="Times New Roman" w:hAnsi="Times New Roman"/>
+          <w:b w:val="0"/>
+          <w:i w:val="0"/>
+          <w:color w:val="000000"/>
+          <w:sz w:val="26"/>
+        </w:rPr>
+        <w:t xml:space="preserve"> Phân tích bảng số liệu so sánh sự tăng nhiệt độ của nước và rượu.</w:t>
+      </w:r>
+    </w:p>
+    <w:p>
+      <w:pPr>
+        <w:spacing w:before="60" w:after="60" w:line="312" w:lineRule="auto"/>
+        <w:ind w:left="283" w:hanging="170"/>
+        <w:jc w:val="both"/>
+      </w:pPr>
+      <w:r>
+        <w:rPr>
+          <w:rFonts w:ascii="Times New Roman" w:hAnsi="Times New Roman"/>
+          <w:color w:val="000000"/>
+          <w:sz w:val="26"/>
+        </w:rPr>
+        <w:t xml:space="preserve">- </w:t>
+      </w:r>
+      <w:r>
+        <w:rPr>
+          <w:rFonts w:ascii="Times New Roman" w:hAnsi="Times New Roman"/>
+          <w:b w:val="0"/>
+          <w:i w:val="0"/>
+          <w:color w:val="000000"/>
+          <w:sz w:val="26"/>
+        </w:rPr>
+        <w:t xml:space="preserve">  </w:t>
+      </w:r>
+      <w:r>
+        <w:rPr>
+          <w:rFonts w:ascii="Times New Roman" w:hAnsi="Times New Roman"/>
+          <w:b/>
+          <w:i w:val="0"/>
+          <w:color w:val="000000"/>
+          <w:sz w:val="26"/>
+        </w:rPr>
+        <w:t>Sản phẩm:</w:t>
+      </w:r>
+      <w:r>
+        <w:rPr>
+          <w:rFonts w:ascii="Times New Roman" w:hAnsi="Times New Roman"/>
+          <w:b w:val="0"/>
+          <w:i w:val="0"/>
+          <w:color w:val="000000"/>
+          <w:sz w:val="26"/>
+        </w:rPr>
+        <w:t xml:space="preserve"> Giải thích được tại sao các chất khác nhau có tốc độ tăng nhiệt độ khác nhau khi nhận cùng nhiệt lượng.</w:t>
+      </w:r>
+    </w:p>
+    <w:tbl>
+      <w:tblPr>
+        <w:tblW w:type="auto" w:w="0"/>
+        <w:jc w:val="center"/>
+        <w:tblLayout w:type="fixed"/>
+        <w:tblLook w:firstColumn="1" w:firstRow="1" w:lastColumn="0" w:lastRow="0" w:noHBand="0" w:noVBand="1" w:val="04A0"/>
+        <w:tblW w:w="9072" w:type="dxa"/>
+      </w:tblPr>
+      <w:tblGrid>
+        <w:gridCol w:w="4535"/>
+        <w:gridCol w:w="4535"/>
+      </w:tblGrid>
+      <w:tr>
+        <w:trPr>
+          <w:tblHeader/>
+        </w:trPr>
+        <w:tc>
+          <w:tcPr>
+            <w:tcW w:type="dxa" w:w="4535"/>
+            <w:shd w:fill="D9D9D9"/>
+            <w:tcMar>
+              <w:top w:w="114" w:type="dxa"/>
+              <w:bottom w:w="114" w:type="dxa"/>
+              <w:left w:w="170" w:type="dxa"/>
+              <w:right w:w="170" w:type="dxa"/>
+            </w:tcMar>
+            <w:tcBorders>
+              <w:top w:val="single" w:sz="4" w:space="0" w:color="BFBFBF"/>
+              <w:left w:val="single" w:sz="4" w:space="0" w:color="BFBFBF"/>
+              <w:bottom w:val="single" w:sz="4" w:space="0" w:color="BFBFBF"/>
+              <w:right w:val="single" w:sz="4" w:space="0" w:color="BFBFBF"/>
+            </w:tcBorders>
+          </w:tcPr>
+          <w:p>
+            <w:pPr>
+              <w:spacing w:before="40" w:after="40"/>
+              <w:jc w:val="center"/>
+            </w:pPr>
+            <w:r/>
+            <w:r>
+              <w:rPr>
+                <w:rFonts w:ascii="Times New Roman" w:hAnsi="Times New Roman"/>
+                <w:b/>
+                <w:color w:val="000000"/>
+                <w:sz w:val="22"/>
+              </w:rPr>
+              <w:t>Hoạt động của Giáo viên</w:t>
+            </w:r>
+          </w:p>
+        </w:tc>
+        <w:tc>
+          <w:tcPr>
+            <w:tcW w:type="dxa" w:w="4535"/>
+            <w:shd w:fill="D9D9D9"/>
+            <w:tcMar>
+              <w:top w:w="114" w:type="dxa"/>
+              <w:bottom w:w="114" w:type="dxa"/>
+              <w:left w:w="170" w:type="dxa"/>
+              <w:right w:w="170" w:type="dxa"/>
+            </w:tcMar>
+            <w:tcBorders>
+              <w:top w:val="single" w:sz="4" w:space="0" w:color="BFBFBF"/>
+              <w:left w:val="single" w:sz="4" w:space="0" w:color="BFBFBF"/>
+              <w:bottom w:val="single" w:sz="4" w:space="0" w:color="BFBFBF"/>
+              <w:right w:val="single" w:sz="4" w:space="0" w:color="BFBFBF"/>
+            </w:tcBorders>
+          </w:tcPr>
+          <w:p>
+            <w:pPr>
+              <w:spacing w:before="40" w:after="40"/>
+              <w:jc w:val="center"/>
+            </w:pPr>
+            <w:r/>
+            <w:r>
+              <w:rPr>
+                <w:rFonts w:ascii="Times New Roman" w:hAnsi="Times New Roman"/>
+                <w:b/>
+                <w:color w:val="000000"/>
+                <w:sz w:val="22"/>
+              </w:rPr>
+              <w:t>Hoạt động của Học sinh</w:t>
+            </w:r>
+          </w:p>
+        </w:tc>
+      </w:tr>
+      <w:tr>
+        <w:trPr>
+          <w:cantSplit/>
+        </w:trPr>
+        <w:tc>
+          <w:tcPr>
+            <w:tcW w:type="dxa" w:w="4535"/>
+            <w:tcMar>
+              <w:top w:w="114" w:type="dxa"/>
+              <w:bottom w:w="114" w:type="dxa"/>
+              <w:left w:w="170" w:type="dxa"/>
+              <w:right w:w="170" w:type="dxa"/>
+            </w:tcMar>
+            <w:tcBorders>
+              <w:top w:val="single" w:sz="4" w:space="0" w:color="BFBFBF"/>
+              <w:left w:val="single" w:sz="4" w:space="0" w:color="BFBFBF"/>
+              <w:bottom w:val="single" w:sz="4" w:space="0" w:color="BFBFBF"/>
+              <w:right w:val="single" w:sz="4" w:space="0" w:color="BFBFBF"/>
+            </w:tcBorders>
+          </w:tcPr>
+          <w:p>
+            <w:pPr>
+              <w:spacing w:before="40" w:after="40" w:line="276" w:lineRule="auto"/>
+              <w:jc w:val="left"/>
+            </w:pPr>
+            <w:r/>
+            <w:r>
+              <w:rPr>
+                <w:rFonts w:ascii="Times New Roman" w:hAnsi="Times New Roman"/>
+                <w:b/>
+                <w:color w:val="000000"/>
+                <w:sz w:val="22"/>
+              </w:rPr>
+              <w:t>Chuyển giao nhiệm vụ:</w:t>
+            </w:r>
+          </w:p>
+          <w:p>
+            <w:pPr>
+              <w:spacing w:before="40" w:after="40" w:line="276" w:lineRule="auto"/>
+              <w:ind w:left="170" w:hanging="113"/>
+              <w:jc w:val="left"/>
+            </w:pPr>
+            <w:r>
+              <w:rPr>
+                <w:rFonts w:ascii="Times New Roman" w:hAnsi="Times New Roman"/>
+                <w:color w:val="000000"/>
+                <w:sz w:val="22"/>
+              </w:rPr>
+              <w:t xml:space="preserve">- </w:t>
+            </w:r>
+            <w:r>
+              <w:rPr>
+                <w:rFonts w:ascii="Times New Roman" w:hAnsi="Times New Roman"/>
+                <w:color w:val="000000"/>
+                <w:sz w:val="22"/>
+              </w:rPr>
+              <w:t xml:space="preserve">GV chiếu bảng số liệu thực nghiệm đun nóng nước và rượu. Đặt câu hỏi: *"Với cùng khối lượng và nhận cùng nhiệt lượng, vì sao rượu nóng lên nhanh hơn nước? Con số nhiệt dung riêng của nước </w:t>
+            </w:r>
+            <w:r>
+              <w:rPr>
+                <w:rFonts w:ascii="Times New Roman" w:hAnsi="Times New Roman"/>
+                <w:i/>
+                <w:color w:val="000000"/>
+                <w:sz w:val="22"/>
+              </w:rPr>
+              <w:t>c_{nước} = 4200</w:t>
+              <w:tab/>
+              <w:t>ext{ J/kg.K}</w:t>
+            </w:r>
+            <w:r>
+              <w:rPr>
+                <w:rFonts w:ascii="Times New Roman" w:hAnsi="Times New Roman"/>
+                <w:color w:val="000000"/>
+                <w:sz w:val="22"/>
+              </w:rPr>
+              <w:t xml:space="preserve"> cho biết điều gì?"*</w:t>
+            </w:r>
+          </w:p>
+        </w:tc>
+        <w:tc>
+          <w:tcPr>
+            <w:tcW w:type="dxa" w:w="4535"/>
+            <w:tcMar>
+              <w:top w:w="114" w:type="dxa"/>
+              <w:bottom w:w="114" w:type="dxa"/>
+              <w:left w:w="170" w:type="dxa"/>
+              <w:right w:w="170" w:type="dxa"/>
+            </w:tcMar>
+            <w:tcBorders>
+              <w:top w:val="single" w:sz="4" w:space="0" w:color="BFBFBF"/>
+              <w:left w:val="single" w:sz="4" w:space="0" w:color="BFBFBF"/>
+              <w:bottom w:val="single" w:sz="4" w:space="0" w:color="BFBFBF"/>
+              <w:right w:val="single" w:sz="4" w:space="0" w:color="BFBFBF"/>
+            </w:tcBorders>
+          </w:tcPr>
+          <w:p>
+            <w:pPr>
+              <w:spacing w:before="40" w:after="40" w:line="276" w:lineRule="auto"/>
+              <w:jc w:val="left"/>
+            </w:pPr>
+            <w:r/>
+            <w:r>
+              <w:rPr>
+                <w:rFonts w:ascii="Times New Roman" w:hAnsi="Times New Roman"/>
+                <w:b/>
+                <w:color w:val="000000"/>
+                <w:sz w:val="22"/>
+              </w:rPr>
+              <w:t>Tiếp nhận nhiệm vụ:</w:t>
+            </w:r>
+            <w:r>
+              <w:rPr>
+                <w:rFonts w:ascii="Times New Roman" w:hAnsi="Times New Roman"/>
+                <w:color w:val="000000"/>
+                <w:sz w:val="22"/>
+              </w:rPr>
+              <w:t xml:space="preserve"> Học sinh tiếp nhận nhiệm vụ học tập từ giáo viên.</w:t>
+            </w:r>
+          </w:p>
+        </w:tc>
+      </w:tr>
+      <w:tr>
+        <w:trPr>
+          <w:cantSplit/>
+        </w:trPr>
+        <w:tc>
+          <w:tcPr>
+            <w:tcW w:type="dxa" w:w="4535"/>
+            <w:tcMar>
+              <w:top w:w="114" w:type="dxa"/>
+              <w:bottom w:w="114" w:type="dxa"/>
+              <w:left w:w="170" w:type="dxa"/>
+              <w:right w:w="170" w:type="dxa"/>
+            </w:tcMar>
+            <w:tcBorders>
+              <w:top w:val="single" w:sz="4" w:space="0" w:color="BFBFBF"/>
+              <w:left w:val="single" w:sz="4" w:space="0" w:color="BFBFBF"/>
+              <w:bottom w:val="single" w:sz="4" w:space="0" w:color="BFBFBF"/>
+              <w:right w:val="single" w:sz="4" w:space="0" w:color="BFBFBF"/>
+            </w:tcBorders>
+          </w:tcPr>
+          <w:p>
+            <w:pPr>
+              <w:spacing w:before="40" w:after="40" w:line="276" w:lineRule="auto"/>
+              <w:jc w:val="left"/>
+            </w:pPr>
+            <w:r/>
+            <w:r>
+              <w:rPr>
+                <w:rFonts w:ascii="Times New Roman" w:hAnsi="Times New Roman"/>
+                <w:b/>
+                <w:color w:val="000000"/>
+                <w:sz w:val="22"/>
+              </w:rPr>
+              <w:t>Theo dõi, hỗ trợ:</w:t>
+            </w:r>
+            <w:r>
+              <w:rPr>
+                <w:rFonts w:ascii="Times New Roman" w:hAnsi="Times New Roman"/>
+                <w:color w:val="000000"/>
+                <w:sz w:val="22"/>
+              </w:rPr>
+              <w:t xml:space="preserve"> GV định hướng HS phân tích định nghĩa nhiệt dung riêng: lượng nhiệt cần thiết để làm </w:t>
+            </w:r>
+            <w:r>
+              <w:rPr>
+                <w:rFonts w:ascii="Times New Roman" w:hAnsi="Times New Roman"/>
+                <w:i/>
+                <w:color w:val="000000"/>
+                <w:sz w:val="22"/>
+              </w:rPr>
+              <w:t>1</w:t>
+              <w:tab/>
+              <w:t>ext{ kg}</w:t>
+            </w:r>
+            <w:r>
+              <w:rPr>
+                <w:rFonts w:ascii="Times New Roman" w:hAnsi="Times New Roman"/>
+                <w:color w:val="000000"/>
+                <w:sz w:val="22"/>
+              </w:rPr>
+              <w:t xml:space="preserve"> chất tăng thêm </w:t>
+            </w:r>
+            <w:r>
+              <w:rPr>
+                <w:rFonts w:ascii="Times New Roman" w:hAnsi="Times New Roman"/>
+                <w:i/>
+                <w:color w:val="000000"/>
+                <w:sz w:val="22"/>
+              </w:rPr>
+              <w:t>1</w:t>
+              <w:tab/>
+              <w:t>ext{ K}</w:t>
+            </w:r>
+            <w:r>
+              <w:rPr>
+                <w:rFonts w:ascii="Times New Roman" w:hAnsi="Times New Roman"/>
+                <w:color w:val="000000"/>
+                <w:sz w:val="22"/>
+              </w:rPr>
+              <w:t xml:space="preserve"> hoặc </w:t>
+            </w:r>
+            <w:r>
+              <w:rPr>
+                <w:rFonts w:ascii="Times New Roman" w:hAnsi="Times New Roman"/>
+                <w:i/>
+                <w:color w:val="000000"/>
+                <w:sz w:val="22"/>
+              </w:rPr>
+              <w:t>1^°</w:t>
+              <w:tab/>
+              <w:t>ext{C}</w:t>
+            </w:r>
+            <w:r>
+              <w:rPr>
+                <w:rFonts w:ascii="Times New Roman" w:hAnsi="Times New Roman"/>
+                <w:color w:val="000000"/>
+                <w:sz w:val="22"/>
+              </w:rPr>
+              <w:t>.</w:t>
+            </w:r>
+          </w:p>
+        </w:tc>
+        <w:tc>
+          <w:tcPr>
+            <w:tcW w:type="dxa" w:w="4535"/>
+            <w:tcMar>
+              <w:top w:w="114" w:type="dxa"/>
+              <w:bottom w:w="114" w:type="dxa"/>
+              <w:left w:w="170" w:type="dxa"/>
+              <w:right w:w="170" w:type="dxa"/>
+            </w:tcMar>
+            <w:tcBorders>
+              <w:top w:val="single" w:sz="4" w:space="0" w:color="BFBFBF"/>
+              <w:left w:val="single" w:sz="4" w:space="0" w:color="BFBFBF"/>
+              <w:bottom w:val="single" w:sz="4" w:space="0" w:color="BFBFBF"/>
+              <w:right w:val="single" w:sz="4" w:space="0" w:color="BFBFBF"/>
+            </w:tcBorders>
+          </w:tcPr>
+          <w:p>
+            <w:pPr>
+              <w:spacing w:before="40" w:after="40" w:line="276" w:lineRule="auto"/>
+              <w:jc w:val="left"/>
+            </w:pPr>
+            <w:r/>
+            <w:r>
+              <w:rPr>
+                <w:rFonts w:ascii="Times New Roman" w:hAnsi="Times New Roman"/>
+                <w:b/>
+                <w:color w:val="000000"/>
+                <w:sz w:val="22"/>
+              </w:rPr>
+              <w:t>Thực hiện nhiệm vụ:</w:t>
+            </w:r>
+            <w:r>
+              <w:rPr>
+                <w:rFonts w:ascii="Times New Roman" w:hAnsi="Times New Roman"/>
+                <w:color w:val="000000"/>
+                <w:sz w:val="22"/>
+              </w:rPr>
+              <w:t xml:space="preserve"> HS làm việc nhóm nhỏ để phân tích ý nghĩa của nhiệt dung riêng và giải thích hiện tượng thực tế (khí hậu ven biển mát mẻ hơn trong đất liền).</w:t>
+            </w:r>
+          </w:p>
+        </w:tc>
+      </w:tr>
+      <w:tr>
+        <w:trPr>
+          <w:cantSplit/>
+        </w:trPr>
+        <w:tc>
+          <w:tcPr>
+            <w:tcW w:type="dxa" w:w="4535"/>
+            <w:tcMar>
+              <w:top w:w="114" w:type="dxa"/>
+              <w:bottom w:w="114" w:type="dxa"/>
+              <w:left w:w="170" w:type="dxa"/>
+              <w:right w:w="170" w:type="dxa"/>
+            </w:tcMar>
+            <w:tcBorders>
+              <w:top w:val="single" w:sz="4" w:space="0" w:color="BFBFBF"/>
+              <w:left w:val="single" w:sz="4" w:space="0" w:color="BFBFBF"/>
+              <w:bottom w:val="single" w:sz="4" w:space="0" w:color="BFBFBF"/>
+              <w:right w:val="single" w:sz="4" w:space="0" w:color="BFBFBF"/>
+            </w:tcBorders>
+          </w:tcPr>
+          <w:p>
+            <w:pPr>
+              <w:spacing w:before="40" w:after="40" w:line="276" w:lineRule="auto"/>
+              <w:jc w:val="left"/>
+            </w:pPr>
+            <w:r/>
+            <w:r>
+              <w:rPr>
+                <w:rFonts w:ascii="Times New Roman" w:hAnsi="Times New Roman"/>
+                <w:b/>
+                <w:color w:val="000000"/>
+                <w:sz w:val="22"/>
+              </w:rPr>
+              <w:t>Tổ chức báo cáo:</w:t>
+            </w:r>
+            <w:r>
+              <w:rPr>
+                <w:rFonts w:ascii="Times New Roman" w:hAnsi="Times New Roman"/>
+                <w:color w:val="000000"/>
+                <w:sz w:val="22"/>
+              </w:rPr>
+              <w:t xml:space="preserve"> GV gọi đại diện nhóm trình bày ý nghĩa vật lý của nhiệt dung riêng.</w:t>
+            </w:r>
+          </w:p>
+        </w:tc>
+        <w:tc>
+          <w:tcPr>
+            <w:tcW w:type="dxa" w:w="4535"/>
+            <w:tcMar>
+              <w:top w:w="114" w:type="dxa"/>
+              <w:bottom w:w="114" w:type="dxa"/>
+              <w:left w:w="170" w:type="dxa"/>
+              <w:right w:w="170" w:type="dxa"/>
+            </w:tcMar>
+            <w:tcBorders>
+              <w:top w:val="single" w:sz="4" w:space="0" w:color="BFBFBF"/>
+              <w:left w:val="single" w:sz="4" w:space="0" w:color="BFBFBF"/>
+              <w:bottom w:val="single" w:sz="4" w:space="0" w:color="BFBFBF"/>
+              <w:right w:val="single" w:sz="4" w:space="0" w:color="BFBFBF"/>
+            </w:tcBorders>
+          </w:tcPr>
+          <w:p>
+            <w:pPr>
+              <w:spacing w:before="40" w:after="40" w:line="276" w:lineRule="auto"/>
+              <w:jc w:val="left"/>
+            </w:pPr>
+            <w:r/>
+            <w:r>
+              <w:rPr>
+                <w:rFonts w:ascii="Times New Roman" w:hAnsi="Times New Roman"/>
+                <w:b/>
+                <w:color w:val="000000"/>
+                <w:sz w:val="22"/>
+              </w:rPr>
+              <w:t>Báo cáo, thảo luận:</w:t>
+            </w:r>
+            <w:r>
+              <w:rPr>
+                <w:rFonts w:ascii="Times New Roman" w:hAnsi="Times New Roman"/>
+                <w:color w:val="000000"/>
+                <w:sz w:val="22"/>
+              </w:rPr>
+              <w:t xml:space="preserve"> Đại diện trình bày định nghĩa, đơn vị </w:t>
+            </w:r>
+            <w:r>
+              <w:rPr>
+                <w:rFonts w:ascii="Times New Roman" w:hAnsi="Times New Roman"/>
+                <w:i/>
+                <w:color w:val="000000"/>
+                <w:sz w:val="22"/>
+              </w:rPr>
+              <w:t>J/kg.K</w:t>
+            </w:r>
+            <w:r>
+              <w:rPr>
+                <w:rFonts w:ascii="Times New Roman" w:hAnsi="Times New Roman"/>
+                <w:color w:val="000000"/>
+                <w:sz w:val="22"/>
+              </w:rPr>
+              <w:t xml:space="preserve"> và vai trò điều hòa khí hậu của nước do có nhiệt dung riêng rất lớn.</w:t>
+            </w:r>
+          </w:p>
+        </w:tc>
+      </w:tr>
+      <w:tr>
+        <w:trPr>
+          <w:cantSplit/>
+        </w:trPr>
+        <w:tc>
+          <w:tcPr>
+            <w:tcW w:type="dxa" w:w="4535"/>
+            <w:tcMar>
+              <w:top w:w="114" w:type="dxa"/>
+              <w:bottom w:w="114" w:type="dxa"/>
+              <w:left w:w="170" w:type="dxa"/>
+              <w:right w:w="170" w:type="dxa"/>
+            </w:tcMar>
+            <w:tcBorders>
+              <w:top w:val="single" w:sz="4" w:space="0" w:color="BFBFBF"/>
+              <w:left w:val="single" w:sz="4" w:space="0" w:color="BFBFBF"/>
+              <w:bottom w:val="single" w:sz="4" w:space="0" w:color="BFBFBF"/>
+              <w:right w:val="single" w:sz="4" w:space="0" w:color="BFBFBF"/>
+            </w:tcBorders>
+          </w:tcPr>
+          <w:p>
+            <w:pPr>
+              <w:spacing w:before="40" w:after="40" w:line="276" w:lineRule="auto"/>
+              <w:jc w:val="left"/>
+            </w:pPr>
+            <w:r/>
+            <w:r>
+              <w:rPr>
+                <w:rFonts w:ascii="Times New Roman" w:hAnsi="Times New Roman"/>
+                <w:b/>
+                <w:color w:val="000000"/>
+                <w:sz w:val="22"/>
+              </w:rPr>
+              <w:t>Kết luận, nhận định:</w:t>
+            </w:r>
+          </w:p>
+          <w:p>
+            <w:pPr>
+              <w:spacing w:before="40" w:after="40" w:line="276" w:lineRule="auto"/>
+              <w:ind w:left="170" w:hanging="113"/>
+              <w:jc w:val="left"/>
+            </w:pPr>
+            <w:r>
+              <w:rPr>
+                <w:rFonts w:ascii="Times New Roman" w:hAnsi="Times New Roman"/>
+                <w:color w:val="000000"/>
+                <w:sz w:val="22"/>
+              </w:rPr>
+              <w:t xml:space="preserve">- </w:t>
+            </w:r>
+            <w:r>
+              <w:rPr>
+                <w:rFonts w:ascii="Times New Roman" w:hAnsi="Times New Roman"/>
+                <w:color w:val="000000"/>
+                <w:sz w:val="22"/>
+              </w:rPr>
+              <w:t>GV chốt khái niệm nhiệt dung riêng là đại lượng đặc trưng cho chất.</w:t>
+            </w:r>
+          </w:p>
+        </w:tc>
+        <w:tc>
+          <w:tcPr>
+            <w:tcW w:type="dxa" w:w="4535"/>
+            <w:tcMar>
+              <w:top w:w="114" w:type="dxa"/>
+              <w:bottom w:w="114" w:type="dxa"/>
+              <w:left w:w="170" w:type="dxa"/>
+              <w:right w:w="170" w:type="dxa"/>
+            </w:tcMar>
+            <w:tcBorders>
+              <w:top w:val="single" w:sz="4" w:space="0" w:color="BFBFBF"/>
+              <w:left w:val="single" w:sz="4" w:space="0" w:color="BFBFBF"/>
+              <w:bottom w:val="single" w:sz="4" w:space="0" w:color="BFBFBF"/>
+              <w:right w:val="single" w:sz="4" w:space="0" w:color="BFBFBF"/>
+            </w:tcBorders>
+          </w:tcPr>
+          <w:p>
+            <w:pPr>
+              <w:spacing w:before="40" w:after="40" w:line="276" w:lineRule="auto"/>
+              <w:jc w:val="left"/>
+            </w:pPr>
+            <w:r/>
+            <w:r>
+              <w:rPr>
+                <w:rFonts w:ascii="Times New Roman" w:hAnsi="Times New Roman"/>
+                <w:b/>
+                <w:color w:val="000000"/>
+                <w:sz w:val="22"/>
+              </w:rPr>
+              <w:t>Ghi nhận kiến thức:</w:t>
+            </w:r>
+            <w:r>
+              <w:rPr>
+                <w:rFonts w:ascii="Times New Roman" w:hAnsi="Times New Roman"/>
+                <w:color w:val="000000"/>
+                <w:sz w:val="22"/>
+              </w:rPr>
+              <w:t xml:space="preserve"> Học sinh lắng nghe nhận xét, đối chiếu lời giải và ghi chép kiến thức cốt lõi.</w:t>
+            </w:r>
+          </w:p>
+        </w:tc>
+      </w:tr>
+    </w:tbl>
+    <w:p/>
     <w:p>
       <w:pPr>
         <w:pStyle w:val="Heading2"/>

</xml_diff>

<commit_message>
Fix \text{} parsing to resolve cp1252 tab issues and strip == highlight symbols
</commit_message>
<xml_diff>
--- a/agent soạn tài liệu/output/bai3_noi_nang_nhiet_luong/ready/bai3_noi_nang_nhiet_luong_ke_hoach_bai_day.docx
+++ b/agent soạn tài liệu/output/bai3_noi_nang_nhiet_luong/ready/bai3_noi_nang_nhiet_luong_ke_hoach_bai_day.docx
@@ -5188,9 +5188,7 @@
                 <w:color w:val="000000"/>
                 <w:sz w:val="22"/>
               </w:rPr>
-              <w:t>c_{nước} = 4200</w:t>
-              <w:tab/>
-              <w:t>ext{ J/kg.K}</w:t>
+              <w:t>c_{nước} = 4200 J/kg.K</w:t>
             </w:r>
             <w:r>
               <w:rPr>
@@ -5294,9 +5292,7 @@
                 <w:color w:val="000000"/>
                 <w:sz w:val="22"/>
               </w:rPr>
-              <w:t>1</w:t>
-              <w:tab/>
-              <w:t>ext{ kg}</w:t>
+              <w:t>1 kg</w:t>
             </w:r>
             <w:r>
               <w:rPr>
@@ -5313,9 +5309,7 @@
                 <w:color w:val="000000"/>
                 <w:sz w:val="22"/>
               </w:rPr>
-              <w:t>1</w:t>
-              <w:tab/>
-              <w:t>ext{ K}</w:t>
+              <w:t>1 K</w:t>
             </w:r>
             <w:r>
               <w:rPr>
@@ -5332,9 +5326,7 @@
                 <w:color w:val="000000"/>
                 <w:sz w:val="22"/>
               </w:rPr>
-              <w:t>1^°</w:t>
-              <w:tab/>
-              <w:t>ext{C}</w:t>
+              <w:t>1^°C</w:t>
             </w:r>
             <w:r>
               <w:rPr>

</xml_diff>

<commit_message>
Recreate Lesson 3 materials from scratch using local Antigravity AI reasoning and DOCX export pipeline
</commit_message>
<xml_diff>
--- a/agent soạn tài liệu/output/bai3_noi_nang_nhiet_luong/ready/bai3_noi_nang_nhiet_luong_ke_hoach_bai_day.docx
+++ b/agent soạn tài liệu/output/bai3_noi_nang_nhiet_luong/ready/bai3_noi_nang_nhiet_luong_ke_hoach_bai_day.docx
@@ -283,7 +283,7 @@
                 <w:color w:val="000000"/>
                 <w:sz w:val="22"/>
               </w:rPr>
-              <w:t>BÀI 3 - NỘI NĂNG, NHIỆT LƯỢNG</w:t>
+              <w:t>KẾ HOẠCH BÀI DẠY</w:t>
             </w:r>
           </w:p>
         </w:tc>
@@ -349,7 +349,7 @@
                 <w:color w:val="000000"/>
                 <w:sz w:val="22"/>
               </w:rPr>
-              <w:t>2 tiết (90 phút)</w:t>
+              <w:t>2 tiết</w:t>
             </w:r>
           </w:p>
         </w:tc>
@@ -420,7 +420,7 @@
     <w:p>
       <w:pPr>
         <w:spacing w:before="60" w:after="60" w:line="312" w:lineRule="auto"/>
-        <w:ind w:left="567" w:hanging="170"/>
+        <w:ind w:left="283" w:hanging="170"/>
         <w:jc w:val="both"/>
       </w:pPr>
       <w:r>
@@ -429,7 +429,7 @@
           <w:color w:val="000000"/>
           <w:sz w:val="26"/>
         </w:rPr>
-        <w:t xml:space="preserve">+ </w:t>
+        <w:t xml:space="preserve">- </w:t>
       </w:r>
       <w:r>
         <w:rPr>
@@ -439,7 +439,7 @@
           <w:color w:val="000000"/>
           <w:sz w:val="26"/>
         </w:rPr>
-        <w:t>Định nghĩa được nội năng dưới góc độ động học phân tử (</w:t>
+        <w:t>Phát biểu được định nghĩa nội năng (</w:t>
       </w:r>
       <w:r>
         <w:rPr>
@@ -449,7 +449,7 @@
           <w:color w:val="000000"/>
           <w:sz w:val="26"/>
         </w:rPr>
-        <w:t>U = E_đ + E_t</w:t>
+        <w:t>U</w:t>
       </w:r>
       <w:r>
         <w:rPr>
@@ -459,13 +459,13 @@
           <w:color w:val="000000"/>
           <w:sz w:val="26"/>
         </w:rPr>
-        <w:t>).</w:t>
+        <w:t>). Nêu được hai cách làm biến đổi nội năng (thực hiện công và truyền nhiệt).</w:t>
       </w:r>
     </w:p>
     <w:p>
       <w:pPr>
         <w:spacing w:before="60" w:after="60" w:line="312" w:lineRule="auto"/>
-        <w:ind w:left="567" w:hanging="170"/>
+        <w:ind w:left="283" w:hanging="170"/>
         <w:jc w:val="both"/>
       </w:pPr>
       <w:r>
@@ -474,7 +474,7 @@
           <w:color w:val="000000"/>
           <w:sz w:val="26"/>
         </w:rPr>
-        <w:t xml:space="preserve">+ </w:t>
+        <w:t xml:space="preserve">- </w:t>
       </w:r>
       <w:r>
         <w:rPr>
@@ -504,13 +504,13 @@
           <w:color w:val="000000"/>
           <w:sz w:val="26"/>
         </w:rPr>
-        <w:t>) và giải thích đúng quy ước dấu của các đại lượng.</w:t>
+        <w:t>) và áp dụng đúng quy ước dấu.</w:t>
       </w:r>
     </w:p>
     <w:p>
       <w:pPr>
         <w:spacing w:before="60" w:after="60" w:line="312" w:lineRule="auto"/>
-        <w:ind w:left="567" w:hanging="170"/>
+        <w:ind w:left="283" w:hanging="170"/>
         <w:jc w:val="both"/>
       </w:pPr>
       <w:r>
@@ -519,7 +519,7 @@
           <w:color w:val="000000"/>
           <w:sz w:val="26"/>
         </w:rPr>
-        <w:t xml:space="preserve">+ </w:t>
+        <w:t xml:space="preserve">- </w:t>
       </w:r>
       <w:r>
         <w:rPr>
@@ -529,7 +529,27 @@
           <w:color w:val="000000"/>
           <w:sz w:val="26"/>
         </w:rPr>
-        <w:t xml:space="preserve">Nêu được định nghĩa nhiệt lượng, công thức tính nhiệt lượng </w:t>
+        <w:t>Định nghĩa được nhiệt lượng (</w:t>
+      </w:r>
+      <w:r>
+        <w:rPr>
+          <w:rFonts w:ascii="Times New Roman" w:hAnsi="Times New Roman"/>
+          <w:b w:val="0"/>
+          <w:i/>
+          <w:color w:val="000000"/>
+          <w:sz w:val="26"/>
+        </w:rPr>
+        <w:t>Q</w:t>
+      </w:r>
+      <w:r>
+        <w:rPr>
+          <w:rFonts w:ascii="Times New Roman" w:hAnsi="Times New Roman"/>
+          <w:b w:val="0"/>
+          <w:i w:val="0"/>
+          <w:color w:val="000000"/>
+          <w:sz w:val="26"/>
+        </w:rPr>
+        <w:t xml:space="preserve">), công thức tính nhiệt lượng </w:t>
       </w:r>
       <w:r>
         <w:rPr>
@@ -549,7 +569,27 @@
           <w:color w:val="000000"/>
           <w:sz w:val="26"/>
         </w:rPr>
-        <w:t>.</w:t>
+        <w:t>. Định nghĩa được nhiệt dung riêng (</w:t>
+      </w:r>
+      <w:r>
+        <w:rPr>
+          <w:rFonts w:ascii="Times New Roman" w:hAnsi="Times New Roman"/>
+          <w:b w:val="0"/>
+          <w:i/>
+          <w:color w:val="000000"/>
+          <w:sz w:val="26"/>
+        </w:rPr>
+        <w:t>c</w:t>
+      </w:r>
+      <w:r>
+        <w:rPr>
+          <w:rFonts w:ascii="Times New Roman" w:hAnsi="Times New Roman"/>
+          <w:b w:val="0"/>
+          <w:i w:val="0"/>
+          <w:color w:val="000000"/>
+          <w:sz w:val="26"/>
+        </w:rPr>
+        <w:t>).</w:t>
       </w:r>
     </w:p>
     <w:p>
@@ -576,21 +616,6 @@
         </w:rPr>
         <w:t>Tìm hiểu thế giới tự nhiên:</w:t>
       </w:r>
-    </w:p>
-    <w:p>
-      <w:pPr>
-        <w:spacing w:before="60" w:after="60" w:line="312" w:lineRule="auto"/>
-        <w:ind w:left="567" w:hanging="170"/>
-        <w:jc w:val="both"/>
-      </w:pPr>
-      <w:r>
-        <w:rPr>
-          <w:rFonts w:ascii="Times New Roman" w:hAnsi="Times New Roman"/>
-          <w:color w:val="000000"/>
-          <w:sz w:val="26"/>
-        </w:rPr>
-        <w:t xml:space="preserve">+ </w:t>
-      </w:r>
       <w:r>
         <w:rPr>
           <w:rFonts w:ascii="Times New Roman" w:hAnsi="Times New Roman"/>
@@ -599,32 +624,7 @@
           <w:color w:val="000000"/>
           <w:sz w:val="26"/>
         </w:rPr>
-        <w:t>Phân tích thí nghiệm cọ xát/đun nóng ống ete để chỉ ra hai cách làm biến đổi nội năng (thực hiện công và truyền nhiệt).</w:t>
-      </w:r>
-    </w:p>
-    <w:p>
-      <w:pPr>
-        <w:spacing w:before="60" w:after="60" w:line="312" w:lineRule="auto"/>
-        <w:ind w:left="567" w:hanging="170"/>
-        <w:jc w:val="both"/>
-      </w:pPr>
-      <w:r>
-        <w:rPr>
-          <w:rFonts w:ascii="Times New Roman" w:hAnsi="Times New Roman"/>
-          <w:color w:val="000000"/>
-          <w:sz w:val="26"/>
-        </w:rPr>
-        <w:t xml:space="preserve">+ </w:t>
-      </w:r>
-      <w:r>
-        <w:rPr>
-          <w:rFonts w:ascii="Times New Roman" w:hAnsi="Times New Roman"/>
-          <w:b w:val="0"/>
-          <w:i w:val="0"/>
-          <w:color w:val="000000"/>
-          <w:sz w:val="26"/>
-        </w:rPr>
-        <w:t>Đọc bảng dữ liệu so sánh tốc độ tăng nhiệt độ của nước và rượu để rút ra vai trò của nhiệt dung riêng.</w:t>
+        <w:t xml:space="preserve"> Mô tả và giải thích được các thí nghiệm về biến đổi nội năng, so sánh tốc độ tăng nhiệt độ của các chất khác nhau để tìm hiểu tính chất nhiệt dung riêng.</w:t>
       </w:r>
     </w:p>
     <w:p>
@@ -651,21 +651,6 @@
         </w:rPr>
         <w:t>Vận dụng kiến thức, kĩ năng:</w:t>
       </w:r>
-    </w:p>
-    <w:p>
-      <w:pPr>
-        <w:spacing w:before="60" w:after="60" w:line="312" w:lineRule="auto"/>
-        <w:ind w:left="567" w:hanging="170"/>
-        <w:jc w:val="both"/>
-      </w:pPr>
-      <w:r>
-        <w:rPr>
-          <w:rFonts w:ascii="Times New Roman" w:hAnsi="Times New Roman"/>
-          <w:color w:val="000000"/>
-          <w:sz w:val="26"/>
-        </w:rPr>
-        <w:t xml:space="preserve">+ </w:t>
-      </w:r>
       <w:r>
         <w:rPr>
           <w:rFonts w:ascii="Times New Roman" w:hAnsi="Times New Roman"/>
@@ -674,32 +659,7 @@
           <w:color w:val="000000"/>
           <w:sz w:val="26"/>
         </w:rPr>
-        <w:t>Tính toán độ biến thiên nội năng trong các bài toán nhiệt động cơ bản.</w:t>
-      </w:r>
-    </w:p>
-    <w:p>
-      <w:pPr>
-        <w:spacing w:before="60" w:after="60" w:line="312" w:lineRule="auto"/>
-        <w:ind w:left="567" w:hanging="170"/>
-        <w:jc w:val="both"/>
-      </w:pPr>
-      <w:r>
-        <w:rPr>
-          <w:rFonts w:ascii="Times New Roman" w:hAnsi="Times New Roman"/>
-          <w:color w:val="000000"/>
-          <w:sz w:val="26"/>
-        </w:rPr>
-        <w:t xml:space="preserve">+ </w:t>
-      </w:r>
-      <w:r>
-        <w:rPr>
-          <w:rFonts w:ascii="Times New Roman" w:hAnsi="Times New Roman"/>
-          <w:b w:val="0"/>
-          <w:i w:val="0"/>
-          <w:color w:val="000000"/>
-          <w:sz w:val="26"/>
-        </w:rPr>
-        <w:t>Tính toán nhiệt lượng cung cấp cho hệ ấm nhôm đun nước sôi.</w:t>
+        <w:t xml:space="preserve"> Giải được các bài tập tính nhiệt lượng truyền nhận, độ biến thiên nội năng trong các quá trình biến đổi trạng thái cơ bản và giải thích các hiện tượng thực tế (ôn hòa khí hậu vùng ven biển).</w:t>
       </w:r>
     </w:p>
     <w:p>
@@ -752,7 +712,7 @@
           <w:color w:val="000000"/>
           <w:sz w:val="26"/>
         </w:rPr>
-        <w:t xml:space="preserve"> Chủ động tự học, tự điền khuyết phần Trọng tâm trong Phiếu học tập.</w:t>
+        <w:t xml:space="preserve"> Chủ động tự đọc phiếu học tập, nghiên cứu SGK để tìm kiếm thông tin về động năng và thế năng phân tử.</w:t>
       </w:r>
     </w:p>
     <w:p>
@@ -787,7 +747,7 @@
           <w:color w:val="000000"/>
           <w:sz w:val="26"/>
         </w:rPr>
-        <w:t xml:space="preserve"> Thảo luận nhóm giải quyết tình huống pit-tông xilanh nén khí.</w:t>
+        <w:t xml:space="preserve"> Làm việc nhóm hiệu quả để phân tích kết quả thực nghiệm đun nóng nước và rượu.</w:t>
       </w:r>
     </w:p>
     <w:p>
@@ -840,7 +800,7 @@
           <w:color w:val="000000"/>
           <w:sz w:val="26"/>
         </w:rPr>
-        <w:t xml:space="preserve"> Nghiêm túc làm việc nhóm thực nghiệm.</w:t>
+        <w:t xml:space="preserve"> Tích cực học tập, chủ động làm các nhiệm vụ cá nhân trong phiếu học tập.</w:t>
       </w:r>
     </w:p>
     <w:p>
@@ -875,7 +835,7 @@
           <w:color w:val="000000"/>
           <w:sz w:val="26"/>
         </w:rPr>
-        <w:t xml:space="preserve"> Báo cáo đúng kết quả số liệu giải toán luyện tập.</w:t>
+        <w:t xml:space="preserve"> Ghi nhận kết quả thực nghiệm và tính toán bài tập một cách khách quan, chính xác.</w:t>
       </w:r>
     </w:p>
     <w:p>
@@ -915,19 +875,17 @@
     </w:p>
     <w:p>
       <w:pPr>
-        <w:spacing w:before="120" w:after="120" w:line="312" w:lineRule="auto"/>
-        <w:ind w:left="0" w:firstLine="567"/>
+        <w:spacing w:before="60" w:after="60" w:line="312" w:lineRule="auto"/>
+        <w:ind w:left="283" w:hanging="170"/>
         <w:jc w:val="both"/>
       </w:pPr>
       <w:r>
         <w:rPr>
           <w:rFonts w:ascii="Times New Roman" w:hAnsi="Times New Roman"/>
-          <w:b w:val="0"/>
-          <w:i w:val="0"/>
           <w:color w:val="000000"/>
           <w:sz w:val="26"/>
         </w:rPr>
-        <w:t xml:space="preserve">1. </w:t>
+        <w:t xml:space="preserve">- </w:t>
       </w:r>
       <w:r>
         <w:rPr>
@@ -938,6 +896,16 @@
           <w:sz w:val="26"/>
         </w:rPr>
         <w:t>Giáo viên:</w:t>
+      </w:r>
+      <w:r>
+        <w:rPr>
+          <w:rFonts w:ascii="Times New Roman" w:hAnsi="Times New Roman"/>
+          <w:b w:val="0"/>
+          <w:i w:val="0"/>
+          <w:color w:val="000000"/>
+          <w:sz w:val="26"/>
+        </w:rPr>
+        <w:t xml:space="preserve"> Thiết bị thí nghiệm cọ xát/đun nóng ống ete đậy nút cao su; bộ thí nghiệm đun nước và rượu với nguồn nhiệt giống nhau; phiếu học tập.</w:t>
       </w:r>
     </w:p>
     <w:p>
@@ -957,27 +925,12 @@
       <w:r>
         <w:rPr>
           <w:rFonts w:ascii="Times New Roman" w:hAnsi="Times New Roman"/>
-          <w:b w:val="0"/>
+          <w:b/>
           <w:i w:val="0"/>
           <w:color w:val="000000"/>
           <w:sz w:val="26"/>
         </w:rPr>
-        <w:t>Máy chiếu, slide bài giảng.</w:t>
-      </w:r>
-    </w:p>
-    <w:p>
-      <w:pPr>
-        <w:spacing w:before="60" w:after="60" w:line="312" w:lineRule="auto"/>
-        <w:ind w:left="283" w:hanging="170"/>
-        <w:jc w:val="both"/>
-      </w:pPr>
-      <w:r>
-        <w:rPr>
-          <w:rFonts w:ascii="Times New Roman" w:hAnsi="Times New Roman"/>
-          <w:color w:val="000000"/>
-          <w:sz w:val="26"/>
-        </w:rPr>
-        <w:t xml:space="preserve">- </w:t>
+        <w:t>Học sinh:</w:t>
       </w:r>
       <w:r>
         <w:rPr>
@@ -987,84 +940,7 @@
           <w:color w:val="000000"/>
           <w:sz w:val="26"/>
         </w:rPr>
-        <w:t>Bộ thí nghiệm trực quan: Ống nghiệm, ete, nút cao su, dây cọ xát.</w:t>
-      </w:r>
-    </w:p>
-    <w:p>
-      <w:pPr>
-        <w:spacing w:before="60" w:after="60" w:line="312" w:lineRule="auto"/>
-        <w:ind w:left="283" w:hanging="170"/>
-        <w:jc w:val="both"/>
-      </w:pPr>
-      <w:r>
-        <w:rPr>
-          <w:rFonts w:ascii="Times New Roman" w:hAnsi="Times New Roman"/>
-          <w:color w:val="000000"/>
-          <w:sz w:val="26"/>
-        </w:rPr>
-        <w:t xml:space="preserve">- </w:t>
-      </w:r>
-      <w:r>
-        <w:rPr>
-          <w:rFonts w:ascii="Times New Roman" w:hAnsi="Times New Roman"/>
-          <w:b w:val="0"/>
-          <w:i w:val="0"/>
-          <w:color w:val="000000"/>
-          <w:sz w:val="26"/>
-        </w:rPr>
-        <w:t>Phiếu học tập số 3.</w:t>
-      </w:r>
-    </w:p>
-    <w:p>
-      <w:pPr>
-        <w:spacing w:before="120" w:after="120" w:line="312" w:lineRule="auto"/>
-        <w:ind w:left="0" w:firstLine="567"/>
-        <w:jc w:val="both"/>
-      </w:pPr>
-      <w:r>
-        <w:rPr>
-          <w:rFonts w:ascii="Times New Roman" w:hAnsi="Times New Roman"/>
-          <w:b w:val="0"/>
-          <w:i w:val="0"/>
-          <w:color w:val="000000"/>
-          <w:sz w:val="26"/>
-        </w:rPr>
-        <w:t xml:space="preserve">2. </w:t>
-      </w:r>
-      <w:r>
-        <w:rPr>
-          <w:rFonts w:ascii="Times New Roman" w:hAnsi="Times New Roman"/>
-          <w:b/>
-          <w:i w:val="0"/>
-          <w:color w:val="000000"/>
-          <w:sz w:val="26"/>
-        </w:rPr>
-        <w:t>Học sinh:</w:t>
-      </w:r>
-    </w:p>
-    <w:p>
-      <w:pPr>
-        <w:spacing w:before="60" w:after="60" w:line="312" w:lineRule="auto"/>
-        <w:ind w:left="283" w:hanging="170"/>
-        <w:jc w:val="both"/>
-      </w:pPr>
-      <w:r>
-        <w:rPr>
-          <w:rFonts w:ascii="Times New Roman" w:hAnsi="Times New Roman"/>
-          <w:color w:val="000000"/>
-          <w:sz w:val="26"/>
-        </w:rPr>
-        <w:t xml:space="preserve">- </w:t>
-      </w:r>
-      <w:r>
-        <w:rPr>
-          <w:rFonts w:ascii="Times New Roman" w:hAnsi="Times New Roman"/>
-          <w:b w:val="0"/>
-          <w:i w:val="0"/>
-          <w:color w:val="000000"/>
-          <w:sz w:val="26"/>
-        </w:rPr>
-        <w:t>SGK Vật lí 12, vở ghi.</w:t>
+        <w:t xml:space="preserve"> Sách giáo khoa Vật lý 12, bút viết, phiếu học tập cá nhân.</w:t>
       </w:r>
     </w:p>
     <w:p>
@@ -1152,7 +1028,7 @@
           <w:color w:val="000000"/>
           <w:sz w:val="26"/>
         </w:rPr>
-        <w:t xml:space="preserve"> Tạo tình huống học tập giúp học sinh nhận thức được sự thay đổi nhiệt năng/nội năng của vật bằng cọ xát.</w:t>
+        <w:t xml:space="preserve"> Tạo tình huống học tập, kích thích sự tò mò của học sinh về mối quan hệ giữa nhiệt độ, thể tích của vật với năng lượng vi mô của các phân tử.</w:t>
       </w:r>
     </w:p>
     <w:p>
@@ -1187,7 +1063,17 @@
           <w:color w:val="000000"/>
           <w:sz w:val="26"/>
         </w:rPr>
-        <w:t xml:space="preserve"> GV yêu cầu HS áp hai lòng bàn tay vào nhau và xoa mạnh, nhận xét nhiệt độ lòng bàn tay.</w:t>
+        <w:t xml:space="preserve"> GV đặt câu hỏi khởi động: </w:t>
+      </w:r>
+      <w:r>
+        <w:rPr>
+          <w:rFonts w:ascii="Times New Roman" w:hAnsi="Times New Roman"/>
+          <w:b w:val="0"/>
+          <w:i/>
+          <w:color w:val="000000"/>
+          <w:sz w:val="26"/>
+        </w:rPr>
+        <w:t>“Khi cọ xát một đồng xu lên mặt bàn, đồng xu nóng lên. Năng lượng nào đã chuyển hóa thành nhiệt năng của đồng xu? Nhiệt năng này thực chất liên quan đến những dạng năng lượng vi mô nào của các phân tử cấu tạo nên đồng xu?”</w:t>
       </w:r>
     </w:p>
     <w:p>
@@ -1222,7 +1108,32 @@
           <w:color w:val="000000"/>
           <w:sz w:val="26"/>
         </w:rPr>
-        <w:t xml:space="preserve"> Cảm nhận của HS về sự ấm lên của lòng bàn tay do cọ xát sinh công.</w:t>
+        <w:t xml:space="preserve"> Câu trả lời dự kiến của học sinh (cơ năng chuyển hóa thành nhiệt năng, các phân tử chuyển động nhanh hơn nên động năng tăng).</w:t>
+      </w:r>
+    </w:p>
+    <w:p>
+      <w:pPr>
+        <w:spacing w:before="60" w:after="60" w:line="312" w:lineRule="auto"/>
+        <w:ind w:left="283" w:hanging="170"/>
+        <w:jc w:val="both"/>
+      </w:pPr>
+      <w:r>
+        <w:rPr>
+          <w:rFonts w:ascii="Times New Roman" w:hAnsi="Times New Roman"/>
+          <w:color w:val="000000"/>
+          <w:sz w:val="26"/>
+        </w:rPr>
+        <w:t xml:space="preserve">- </w:t>
+      </w:r>
+      <w:r>
+        <w:rPr>
+          <w:rFonts w:ascii="Times New Roman" w:hAnsi="Times New Roman"/>
+          <w:b/>
+          <w:i w:val="0"/>
+          <w:color w:val="000000"/>
+          <w:sz w:val="26"/>
+        </w:rPr>
+        <w:t>Tiến trình dạy học:</w:t>
       </w:r>
     </w:p>
     <w:tbl>
@@ -1366,7 +1277,7 @@
                 <w:color w:val="000000"/>
                 <w:sz w:val="22"/>
               </w:rPr>
-              <w:t>GV yêu cầu cả lớp thực hiện hành động: *“Xoa hai lòng bàn tay vào nhau thật mạnh trong 10 giây. Hãy mô tả cảm nhận của em ở lòng bàn tay và giải thích tại sao bàn tay lại ấm lên?”*</w:t>
+              <w:t>GV đưa ra câu hỏi tình huống khởi động về sự nóng lên của đồng xu khi cọ xát và yêu cầu HS thảo luận cặp đôi.</w:t>
             </w:r>
           </w:p>
         </w:tc>
@@ -1401,13 +1312,28 @@
               </w:rPr>
               <w:t>Tiếp nhận nhiệm vụ:</w:t>
             </w:r>
+          </w:p>
+          <w:p>
+            <w:pPr>
+              <w:spacing w:before="40" w:after="40" w:line="276" w:lineRule="auto"/>
+              <w:ind w:left="170" w:hanging="113"/>
+              <w:jc w:val="left"/>
+            </w:pPr>
             <w:r>
               <w:rPr>
                 <w:rFonts w:ascii="Times New Roman" w:hAnsi="Times New Roman"/>
                 <w:color w:val="000000"/>
                 <w:sz w:val="22"/>
               </w:rPr>
-              <w:t xml:space="preserve"> Học sinh tiếp nhận nhiệm vụ học tập từ giáo viên.</w:t>
+              <w:t xml:space="preserve">- </w:t>
+            </w:r>
+            <w:r>
+              <w:rPr>
+                <w:rFonts w:ascii="Times New Roman" w:hAnsi="Times New Roman"/>
+                <w:color w:val="000000"/>
+                <w:sz w:val="22"/>
+              </w:rPr>
+              <w:t>Học sinh lắng nghe câu hỏi và suy nghĩ thảo luận cặp đôi trong 3 phút.</w:t>
             </w:r>
           </w:p>
         </w:tc>
@@ -1447,13 +1373,28 @@
               </w:rPr>
               <w:t>Theo dõi, hỗ trợ:</w:t>
             </w:r>
+          </w:p>
+          <w:p>
+            <w:pPr>
+              <w:spacing w:before="40" w:after="40" w:line="276" w:lineRule="auto"/>
+              <w:ind w:left="170" w:hanging="113"/>
+              <w:jc w:val="left"/>
+            </w:pPr>
             <w:r>
               <w:rPr>
                 <w:rFonts w:ascii="Times New Roman" w:hAnsi="Times New Roman"/>
                 <w:color w:val="000000"/>
                 <w:sz w:val="22"/>
               </w:rPr>
-              <w:t xml:space="preserve"> Giáo viên theo dõi, quan sát và hỗ trợ gợi ý các nhóm khi cần thiết.</w:t>
+              <w:t xml:space="preserve">- </w:t>
+            </w:r>
+            <w:r>
+              <w:rPr>
+                <w:rFonts w:ascii="Times New Roman" w:hAnsi="Times New Roman"/>
+                <w:color w:val="000000"/>
+                <w:sz w:val="22"/>
+              </w:rPr>
+              <w:t>GV quan sát các nhóm thảo luận, định hướng HS suy nghĩ về sự chuyển động nhiệt của phân tử cấu tạo nên vật.</w:t>
             </w:r>
           </w:p>
         </w:tc>
@@ -1509,30 +1450,7 @@
                 <w:color w:val="000000"/>
                 <w:sz w:val="22"/>
               </w:rPr>
-              <w:t>HS thực hiện động tác xoa tay.</w:t>
-            </w:r>
-          </w:p>
-          <w:p>
-            <w:pPr>
-              <w:spacing w:before="40" w:after="40" w:line="276" w:lineRule="auto"/>
-              <w:ind w:left="170" w:hanging="113"/>
-              <w:jc w:val="left"/>
-            </w:pPr>
-            <w:r>
-              <w:rPr>
-                <w:rFonts w:ascii="Times New Roman" w:hAnsi="Times New Roman"/>
-                <w:color w:val="000000"/>
-                <w:sz w:val="22"/>
-              </w:rPr>
-              <w:t xml:space="preserve">- </w:t>
-            </w:r>
-            <w:r>
-              <w:rPr>
-                <w:rFonts w:ascii="Times New Roman" w:hAnsi="Times New Roman"/>
-                <w:color w:val="000000"/>
-                <w:sz w:val="22"/>
-              </w:rPr>
-              <w:t>Suy nghĩ câu trả lời cá nhân dựa trên sự chuyển hóa từ cơ năng sang nhiệt năng.</w:t>
+              <w:t>HS trao đổi ý kiến, liên hệ kiến thức lớp dưới về chuyển động nhiệt phân tử.</w:t>
             </w:r>
           </w:p>
         </w:tc>
@@ -1572,13 +1490,28 @@
               </w:rPr>
               <w:t>Tổ chức báo cáo:</w:t>
             </w:r>
+          </w:p>
+          <w:p>
+            <w:pPr>
+              <w:spacing w:before="40" w:after="40" w:line="276" w:lineRule="auto"/>
+              <w:ind w:left="170" w:hanging="113"/>
+              <w:jc w:val="left"/>
+            </w:pPr>
             <w:r>
               <w:rPr>
                 <w:rFonts w:ascii="Times New Roman" w:hAnsi="Times New Roman"/>
                 <w:color w:val="000000"/>
                 <w:sz w:val="22"/>
               </w:rPr>
-              <w:t xml:space="preserve"> Giáo viên điều hành, gọi đại diện báo cáo kết quả, tổ chức nhận xét phản biện chéo giữa các học sinh.</w:t>
+              <w:t xml:space="preserve">- </w:t>
+            </w:r>
+            <w:r>
+              <w:rPr>
+                <w:rFonts w:ascii="Times New Roman" w:hAnsi="Times New Roman"/>
+                <w:color w:val="000000"/>
+                <w:sz w:val="22"/>
+              </w:rPr>
+              <w:t>GV gọi 2 đại diện HS trình bày ý kiến trước lớp, khuyến khích các HS khác nhận xét, bổ sung.</w:t>
             </w:r>
           </w:p>
         </w:tc>
@@ -1634,30 +1567,7 @@
                 <w:color w:val="000000"/>
                 <w:sz w:val="22"/>
               </w:rPr>
-              <w:t>2 HS đứng tại chỗ phát biểu ý kiến.</w:t>
-            </w:r>
-          </w:p>
-          <w:p>
-            <w:pPr>
-              <w:spacing w:before="40" w:after="40" w:line="276" w:lineRule="auto"/>
-              <w:ind w:left="170" w:hanging="113"/>
-              <w:jc w:val="left"/>
-            </w:pPr>
-            <w:r>
-              <w:rPr>
-                <w:rFonts w:ascii="Times New Roman" w:hAnsi="Times New Roman"/>
-                <w:color w:val="000000"/>
-                <w:sz w:val="22"/>
-              </w:rPr>
-              <w:t xml:space="preserve">- </w:t>
-            </w:r>
-            <w:r>
-              <w:rPr>
-                <w:rFonts w:ascii="Times New Roman" w:hAnsi="Times New Roman"/>
-                <w:color w:val="000000"/>
-                <w:sz w:val="22"/>
-              </w:rPr>
-              <w:t>Cả lớp lắng nghe, ghi nhận bài học mới.</w:t>
+              <w:t>Đại diện HS trả lời câu hỏi khởi động, nêu nhận định ban đầu về nhiệt năng phân tử.</w:t>
             </w:r>
           </w:p>
         </w:tc>
@@ -1718,7 +1628,7 @@
                 <w:color w:val="000000"/>
                 <w:sz w:val="22"/>
               </w:rPr>
-              <w:t>GV chốt: *“Cơ năng cọ xát đã biến đổi thành nhiệt năng làm tay ấm lên. Quá trình này được mô tả thế nào qua khái niệm nội năng? Bài học hôm nay sẽ giúp chúng ta trả lời.”*</w:t>
+              <w:t>GV ghi nhận ý kiến, chưa chốt đúng sai mà dẫn dắt vào bài mới: *“Để làm rõ các dạng năng lượng vi mô này và cách đo lường chúng, chúng ta cùng nghiên cứu Bài 3.”*</w:t>
             </w:r>
           </w:p>
         </w:tc>
@@ -1753,13 +1663,28 @@
               </w:rPr>
               <w:t>Ghi nhận kiến thức:</w:t>
             </w:r>
+          </w:p>
+          <w:p>
+            <w:pPr>
+              <w:spacing w:before="40" w:after="40" w:line="276" w:lineRule="auto"/>
+              <w:ind w:left="170" w:hanging="113"/>
+              <w:jc w:val="left"/>
+            </w:pPr>
             <w:r>
               <w:rPr>
                 <w:rFonts w:ascii="Times New Roman" w:hAnsi="Times New Roman"/>
                 <w:color w:val="000000"/>
                 <w:sz w:val="22"/>
               </w:rPr>
-              <w:t xml:space="preserve"> Học sinh đối chiếu, sửa đổi kết quả bài làm và ghi nhận kiến thức cốt lõi vào vở.</w:t>
+              <w:t xml:space="preserve">- </w:t>
+            </w:r>
+            <w:r>
+              <w:rPr>
+                <w:rFonts w:ascii="Times New Roman" w:hAnsi="Times New Roman"/>
+                <w:color w:val="000000"/>
+                <w:sz w:val="22"/>
+              </w:rPr>
+              <w:t>HS lắng nghe giáo viên dẫn dắt và chuẩn bị ghi chép bài mới vào vở.</w:t>
             </w:r>
           </w:p>
         </w:tc>
@@ -1803,6 +1728,24 @@
     </w:p>
     <w:p>
       <w:pPr>
+        <w:pStyle w:val="Heading3"/>
+        <w:keepNext/>
+        <w:spacing w:before="120" w:after="60"/>
+        <w:ind w:left="0" w:firstLine="0"/>
+      </w:pPr>
+      <w:r>
+        <w:rPr>
+          <w:rFonts w:ascii="Times New Roman" w:hAnsi="Times New Roman"/>
+          <w:b w:val="0"/>
+          <w:i/>
+          <w:color w:val="000000"/>
+          <w:sz w:val="26"/>
+        </w:rPr>
+        <w:t>2.1. Đơn vị kiến thức 1: Khái niệm nội năng của vật</w:t>
+      </w:r>
+    </w:p>
+    <w:p>
+      <w:pPr>
         <w:spacing w:before="60" w:after="60" w:line="312" w:lineRule="auto"/>
         <w:ind w:left="283" w:hanging="170"/>
         <w:jc w:val="both"/>
@@ -1833,7 +1776,27 @@
           <w:color w:val="000000"/>
           <w:sz w:val="26"/>
         </w:rPr>
-        <w:t xml:space="preserve"> HS định nghĩa được khái niệm nội năng, phân tích được các cách làm biến đổi nội năng, phát biểu và vận dụng được Nguyên lí I Nhiệt động lực học, hiểu được công thức tính nhiệt lượng và ý nghĩa vật lý của nhiệt dung riêng.</w:t>
+        <w:t xml:space="preserve"> HS phát biểu được khái niệm nội năng (</w:t>
+      </w:r>
+      <w:r>
+        <w:rPr>
+          <w:rFonts w:ascii="Times New Roman" w:hAnsi="Times New Roman"/>
+          <w:b w:val="0"/>
+          <w:i/>
+          <w:color w:val="000000"/>
+          <w:sz w:val="26"/>
+        </w:rPr>
+        <w:t>U</w:t>
+      </w:r>
+      <w:r>
+        <w:rPr>
+          <w:rFonts w:ascii="Times New Roman" w:hAnsi="Times New Roman"/>
+          <w:b w:val="0"/>
+          <w:i w:val="0"/>
+          <w:color w:val="000000"/>
+          <w:sz w:val="26"/>
+        </w:rPr>
+        <w:t>), biết nội năng gồm động năng chuyển động nhiệt phân tử và thế năng tương tác phân tử, hiểu sự phụ thuộc vào nhiệt độ và thể tích.</w:t>
       </w:r>
     </w:p>
     <w:p>
@@ -1868,25 +1831,7 @@
           <w:color w:val="000000"/>
           <w:sz w:val="26"/>
         </w:rPr>
-        <w:t xml:space="preserve"> Lời giải các nhiệm vụ học tập từ ĐVKT 2.1 đến ĐVKT 2.5 đầy đủ trên Phiếu học tập.</w:t>
-      </w:r>
-    </w:p>
-    <w:p>
-      <w:pPr>
-        <w:pStyle w:val="Heading3"/>
-        <w:keepNext/>
-        <w:spacing w:before="120" w:after="60"/>
-        <w:ind w:left="0" w:firstLine="0"/>
-      </w:pPr>
-      <w:r>
-        <w:rPr>
-          <w:rFonts w:ascii="Times New Roman" w:hAnsi="Times New Roman"/>
-          <w:b w:val="0"/>
-          <w:i/>
-          <w:color w:val="000000"/>
-          <w:sz w:val="26"/>
-        </w:rPr>
-        <w:t>2.1. Đơn vị kiến thức 1: Khái niệm nội năng của vật</w:t>
+        <w:t xml:space="preserve"> Nội dung ghi bài và phần trả lời Nhiệm vụ 1 trong Phiếu học tập.</w:t>
       </w:r>
     </w:p>
     <w:p>
@@ -1906,142 +1851,12 @@
       <w:r>
         <w:rPr>
           <w:rFonts w:ascii="Times New Roman" w:hAnsi="Times New Roman"/>
-          <w:b w:val="0"/>
-          <w:i w:val="0"/>
-          <w:color w:val="000000"/>
-          <w:sz w:val="26"/>
-        </w:rPr>
-        <w:t xml:space="preserve">  </w:t>
-      </w:r>
-      <w:r>
-        <w:rPr>
-          <w:rFonts w:ascii="Times New Roman" w:hAnsi="Times New Roman"/>
           <w:b/>
           <w:i w:val="0"/>
           <w:color w:val="000000"/>
           <w:sz w:val="26"/>
         </w:rPr>
-        <w:t>Mục tiêu:</w:t>
-      </w:r>
-      <w:r>
-        <w:rPr>
-          <w:rFonts w:ascii="Times New Roman" w:hAnsi="Times New Roman"/>
-          <w:b w:val="0"/>
-          <w:i w:val="0"/>
-          <w:color w:val="000000"/>
-          <w:sz w:val="26"/>
-        </w:rPr>
-        <w:t xml:space="preserve"> HS định nghĩa được nội năng dưới góc độ động học phân tử là tổng động năng và thế năng của các phân tử cấu tạo nên vật: </w:t>
-      </w:r>
-      <w:r>
-        <w:rPr>
-          <w:rFonts w:ascii="Times New Roman" w:hAnsi="Times New Roman"/>
-          <w:b w:val="0"/>
-          <w:i/>
-          <w:color w:val="000000"/>
-          <w:sz w:val="26"/>
-        </w:rPr>
-        <w:t>U = E_đ + E_t</w:t>
-      </w:r>
-      <w:r>
-        <w:rPr>
-          <w:rFonts w:ascii="Times New Roman" w:hAnsi="Times New Roman"/>
-          <w:b w:val="0"/>
-          <w:i w:val="0"/>
-          <w:color w:val="000000"/>
-          <w:sz w:val="26"/>
-        </w:rPr>
-        <w:t>.</w:t>
-      </w:r>
-    </w:p>
-    <w:p>
-      <w:pPr>
-        <w:spacing w:before="60" w:after="60" w:line="312" w:lineRule="auto"/>
-        <w:ind w:left="283" w:hanging="170"/>
-        <w:jc w:val="both"/>
-      </w:pPr>
-      <w:r>
-        <w:rPr>
-          <w:rFonts w:ascii="Times New Roman" w:hAnsi="Times New Roman"/>
-          <w:color w:val="000000"/>
-          <w:sz w:val="26"/>
-        </w:rPr>
-        <w:t xml:space="preserve">- </w:t>
-      </w:r>
-      <w:r>
-        <w:rPr>
-          <w:rFonts w:ascii="Times New Roman" w:hAnsi="Times New Roman"/>
-          <w:b w:val="0"/>
-          <w:i w:val="0"/>
-          <w:color w:val="000000"/>
-          <w:sz w:val="26"/>
-        </w:rPr>
-        <w:t xml:space="preserve">  </w:t>
-      </w:r>
-      <w:r>
-        <w:rPr>
-          <w:rFonts w:ascii="Times New Roman" w:hAnsi="Times New Roman"/>
-          <w:b/>
-          <w:i w:val="0"/>
-          <w:color w:val="000000"/>
-          <w:sz w:val="26"/>
-        </w:rPr>
-        <w:t>Nội dung:</w:t>
-      </w:r>
-      <w:r>
-        <w:rPr>
-          <w:rFonts w:ascii="Times New Roman" w:hAnsi="Times New Roman"/>
-          <w:b w:val="0"/>
-          <w:i w:val="0"/>
-          <w:color w:val="000000"/>
-          <w:sz w:val="26"/>
-        </w:rPr>
-        <w:t xml:space="preserve"> Tìm hiểu khái niệm nội năng và các đại lượng ảnh hưởng.</w:t>
-      </w:r>
-    </w:p>
-    <w:p>
-      <w:pPr>
-        <w:spacing w:before="60" w:after="60" w:line="312" w:lineRule="auto"/>
-        <w:ind w:left="283" w:hanging="170"/>
-        <w:jc w:val="both"/>
-      </w:pPr>
-      <w:r>
-        <w:rPr>
-          <w:rFonts w:ascii="Times New Roman" w:hAnsi="Times New Roman"/>
-          <w:color w:val="000000"/>
-          <w:sz w:val="26"/>
-        </w:rPr>
-        <w:t xml:space="preserve">- </w:t>
-      </w:r>
-      <w:r>
-        <w:rPr>
-          <w:rFonts w:ascii="Times New Roman" w:hAnsi="Times New Roman"/>
-          <w:b w:val="0"/>
-          <w:i w:val="0"/>
-          <w:color w:val="000000"/>
-          <w:sz w:val="26"/>
-        </w:rPr>
-        <w:t xml:space="preserve">  </w:t>
-      </w:r>
-      <w:r>
-        <w:rPr>
-          <w:rFonts w:ascii="Times New Roman" w:hAnsi="Times New Roman"/>
-          <w:b/>
-          <w:i w:val="0"/>
-          <w:color w:val="000000"/>
-          <w:sz w:val="26"/>
-        </w:rPr>
-        <w:t>Sản phẩm:</w:t>
-      </w:r>
-      <w:r>
-        <w:rPr>
-          <w:rFonts w:ascii="Times New Roman" w:hAnsi="Times New Roman"/>
-          <w:b w:val="0"/>
-          <w:i w:val="0"/>
-          <w:color w:val="000000"/>
-          <w:sz w:val="26"/>
-        </w:rPr>
-        <w:t xml:space="preserve"> Định nghĩa nội năng được hoàn thiện trên PHT.</w:t>
+        <w:t>Tiến trình dạy học:</w:t>
       </w:r>
     </w:p>
     <w:tbl>
@@ -2185,7 +2000,7 @@
                 <w:color w:val="000000"/>
                 <w:sz w:val="22"/>
               </w:rPr>
-              <w:t>GV yêu cầu HS nghiên cứu cá nhân mục I SGK và trả lời câu hỏi: *“Các phân tử cấu tạo nên vật chuyển động không ngừng và có lực liên kết phân tử. Vậy chúng sở hữu những dạng năng lượng nào ở cấp độ vi mô? Tổng các năng lượng này gọi là gì?”*</w:t>
+              <w:t>GV giao Nhiệm vụ 1 trên PHT, yêu cầu HS đọc SGK để tìm hiểu về các dạng năng lượng phân tử cấu tạo nên nội năng.</w:t>
             </w:r>
           </w:p>
         </w:tc>
@@ -2220,13 +2035,28 @@
               </w:rPr>
               <w:t>Tiếp nhận nhiệm vụ:</w:t>
             </w:r>
+          </w:p>
+          <w:p>
+            <w:pPr>
+              <w:spacing w:before="40" w:after="40" w:line="276" w:lineRule="auto"/>
+              <w:ind w:left="170" w:hanging="113"/>
+              <w:jc w:val="left"/>
+            </w:pPr>
             <w:r>
               <w:rPr>
                 <w:rFonts w:ascii="Times New Roman" w:hAnsi="Times New Roman"/>
                 <w:color w:val="000000"/>
                 <w:sz w:val="22"/>
               </w:rPr>
-              <w:t xml:space="preserve"> Học sinh tiếp nhận nhiệm vụ học tập từ giáo viên.</w:t>
+              <w:t xml:space="preserve">- </w:t>
+            </w:r>
+            <w:r>
+              <w:rPr>
+                <w:rFonts w:ascii="Times New Roman" w:hAnsi="Times New Roman"/>
+                <w:color w:val="000000"/>
+                <w:sz w:val="22"/>
+              </w:rPr>
+              <w:t>Học sinh nhận nhiệm vụ học tập và mở phiếu học tập cá nhân.</w:t>
             </w:r>
           </w:p>
         </w:tc>
@@ -2266,13 +2096,28 @@
               </w:rPr>
               <w:t>Theo dõi, hỗ trợ:</w:t>
             </w:r>
+          </w:p>
+          <w:p>
+            <w:pPr>
+              <w:spacing w:before="40" w:after="40" w:line="276" w:lineRule="auto"/>
+              <w:ind w:left="170" w:hanging="113"/>
+              <w:jc w:val="left"/>
+            </w:pPr>
             <w:r>
               <w:rPr>
                 <w:rFonts w:ascii="Times New Roman" w:hAnsi="Times New Roman"/>
                 <w:color w:val="000000"/>
                 <w:sz w:val="22"/>
               </w:rPr>
-              <w:t xml:space="preserve"> Giáo viên theo dõi, hướng dẫn HS liên hệ giữa chuyển động nhiệt với động năng phân tử, lực liên kết phân tử với thế năng phân tử.</w:t>
+              <w:t xml:space="preserve">- </w:t>
+            </w:r>
+            <w:r>
+              <w:rPr>
+                <w:rFonts w:ascii="Times New Roman" w:hAnsi="Times New Roman"/>
+                <w:color w:val="000000"/>
+                <w:sz w:val="22"/>
+              </w:rPr>
+              <w:t>GV gợi ý HS: chuyển động nhiệt tạo ra động năng, lực tương tác tạo ra thế năng tương tác.</w:t>
             </w:r>
           </w:p>
         </w:tc>
@@ -2307,13 +2152,28 @@
               </w:rPr>
               <w:t>Thực hiện nhiệm vụ:</w:t>
             </w:r>
+          </w:p>
+          <w:p>
+            <w:pPr>
+              <w:spacing w:before="40" w:after="40" w:line="276" w:lineRule="auto"/>
+              <w:ind w:left="170" w:hanging="113"/>
+              <w:jc w:val="left"/>
+            </w:pPr>
             <w:r>
               <w:rPr>
                 <w:rFonts w:ascii="Times New Roman" w:hAnsi="Times New Roman"/>
                 <w:color w:val="000000"/>
                 <w:sz w:val="22"/>
               </w:rPr>
-              <w:t xml:space="preserve"> HS nghiên cứu cá nhân mục I SGK, thảo luận cặp đôi để chỉ ra động năng và thế năng phân tử cấu tạo nên nội năng.</w:t>
+              <w:t xml:space="preserve">- </w:t>
+            </w:r>
+            <w:r>
+              <w:rPr>
+                <w:rFonts w:ascii="Times New Roman" w:hAnsi="Times New Roman"/>
+                <w:color w:val="000000"/>
+                <w:sz w:val="22"/>
+              </w:rPr>
+              <w:t>HS đọc SGK và điền các từ khóa thích hợp vào phần Trọng tâm trên PHT.</w:t>
             </w:r>
           </w:p>
         </w:tc>
@@ -2353,13 +2213,62 @@
               </w:rPr>
               <w:t>Tổ chức báo cáo:</w:t>
             </w:r>
+          </w:p>
+          <w:p>
+            <w:pPr>
+              <w:spacing w:before="40" w:after="40" w:line="276" w:lineRule="auto"/>
+              <w:ind w:left="170" w:hanging="113"/>
+              <w:jc w:val="left"/>
+            </w:pPr>
             <w:r>
               <w:rPr>
                 <w:rFonts w:ascii="Times New Roman" w:hAnsi="Times New Roman"/>
                 <w:color w:val="000000"/>
                 <w:sz w:val="22"/>
               </w:rPr>
-              <w:t xml:space="preserve"> GV gọi đại diện HS phát biểu giải thích nội năng của vật.</w:t>
+              <w:t xml:space="preserve">- </w:t>
+            </w:r>
+            <w:r>
+              <w:rPr>
+                <w:rFonts w:ascii="Times New Roman" w:hAnsi="Times New Roman"/>
+                <w:color w:val="000000"/>
+                <w:sz w:val="22"/>
+              </w:rPr>
+              <w:t xml:space="preserve">GV gọi đại diện học sinh phát biểu định nghĩa nội năng và nêu sự phụ thuộc của nó vào </w:t>
+            </w:r>
+            <w:r>
+              <w:rPr>
+                <w:rFonts w:ascii="Times New Roman" w:hAnsi="Times New Roman"/>
+                <w:i/>
+                <w:color w:val="000000"/>
+                <w:sz w:val="22"/>
+              </w:rPr>
+              <w:t>T</w:t>
+            </w:r>
+            <w:r>
+              <w:rPr>
+                <w:rFonts w:ascii="Times New Roman" w:hAnsi="Times New Roman"/>
+                <w:color w:val="000000"/>
+                <w:sz w:val="22"/>
+              </w:rPr>
+              <w:t xml:space="preserve"> và </w:t>
+            </w:r>
+            <w:r>
+              <w:rPr>
+                <w:rFonts w:ascii="Times New Roman" w:hAnsi="Times New Roman"/>
+                <w:i/>
+                <w:color w:val="000000"/>
+                <w:sz w:val="22"/>
+              </w:rPr>
+              <w:t>V</w:t>
+            </w:r>
+            <w:r>
+              <w:rPr>
+                <w:rFonts w:ascii="Times New Roman" w:hAnsi="Times New Roman"/>
+                <w:color w:val="000000"/>
+                <w:sz w:val="22"/>
+              </w:rPr>
+              <w:t>.</w:t>
             </w:r>
           </w:p>
         </w:tc>
@@ -2394,13 +2303,28 @@
               </w:rPr>
               <w:t>Báo cáo, thảo luận:</w:t>
             </w:r>
+          </w:p>
+          <w:p>
+            <w:pPr>
+              <w:spacing w:before="40" w:after="40" w:line="276" w:lineRule="auto"/>
+              <w:ind w:left="170" w:hanging="113"/>
+              <w:jc w:val="left"/>
+            </w:pPr>
             <w:r>
               <w:rPr>
                 <w:rFonts w:ascii="Times New Roman" w:hAnsi="Times New Roman"/>
                 <w:color w:val="000000"/>
                 <w:sz w:val="22"/>
               </w:rPr>
-              <w:t xml:space="preserve"> HS trình bày định nghĩa nội năng: </w:t>
+              <w:t xml:space="preserve">- </w:t>
+            </w:r>
+            <w:r>
+              <w:rPr>
+                <w:rFonts w:ascii="Times New Roman" w:hAnsi="Times New Roman"/>
+                <w:color w:val="000000"/>
+                <w:sz w:val="22"/>
+              </w:rPr>
+              <w:t xml:space="preserve">HS trình bày định nghĩa </w:t>
             </w:r>
             <w:r>
               <w:rPr>
@@ -2417,7 +2341,7 @@
                 <w:color w:val="000000"/>
                 <w:sz w:val="22"/>
               </w:rPr>
-              <w:t>.</w:t>
+              <w:t>, giải thích tại sao nội năng khí lý tưởng chỉ phụ thuộc nhiệt độ.</w:t>
             </w:r>
           </w:p>
         </w:tc>
@@ -2478,7 +2402,7 @@
                 <w:color w:val="000000"/>
                 <w:sz w:val="22"/>
               </w:rPr>
-              <w:t xml:space="preserve">GV chốt kiến thức: Nội năng </w:t>
+              <w:t>GV chuẩn hóa kiến thức: Nội năng (</w:t>
             </w:r>
             <w:r>
               <w:rPr>
@@ -2495,7 +2419,7 @@
                 <w:color w:val="000000"/>
                 <w:sz w:val="22"/>
               </w:rPr>
-              <w:t xml:space="preserve"> phụ thuộc vào nhiệt độ </w:t>
+              <w:t xml:space="preserve">) là tổng động năng chuyển động nhiệt và thế năng tương tác phân tử. Nội năng phụ thuộc vào </w:t>
             </w:r>
             <w:r>
               <w:rPr>
@@ -2512,7 +2436,7 @@
                 <w:color w:val="000000"/>
                 <w:sz w:val="22"/>
               </w:rPr>
-              <w:t xml:space="preserve"> và thể tích </w:t>
+              <w:t xml:space="preserve"> và </w:t>
             </w:r>
             <w:r>
               <w:rPr>
@@ -2522,23 +2446,6 @@
                 <w:sz w:val="22"/>
               </w:rPr>
               <w:t>V</w:t>
-            </w:r>
-            <w:r>
-              <w:rPr>
-                <w:rFonts w:ascii="Times New Roman" w:hAnsi="Times New Roman"/>
-                <w:color w:val="000000"/>
-                <w:sz w:val="22"/>
-              </w:rPr>
-              <w:t xml:space="preserve"> của vật: </w:t>
-            </w:r>
-            <w:r>
-              <w:rPr>
-                <w:rFonts w:ascii="Times New Roman" w:hAnsi="Times New Roman"/>
-                <w:i/>
-                <w:color w:val="000000"/>
-                <w:sz w:val="22"/>
-              </w:rPr>
-              <w:t>U = f(T, V)</w:t>
             </w:r>
             <w:r>
               <w:rPr>
@@ -2581,13 +2488,45 @@
               </w:rPr>
               <w:t>Ghi nhận kiến thức:</w:t>
             </w:r>
+          </w:p>
+          <w:p>
+            <w:pPr>
+              <w:spacing w:before="40" w:after="40" w:line="276" w:lineRule="auto"/>
+              <w:ind w:left="170" w:hanging="113"/>
+              <w:jc w:val="left"/>
+            </w:pPr>
             <w:r>
               <w:rPr>
                 <w:rFonts w:ascii="Times New Roman" w:hAnsi="Times New Roman"/>
                 <w:color w:val="000000"/>
                 <w:sz w:val="22"/>
               </w:rPr>
-              <w:t xml:space="preserve"> Học sinh lắng nghe nhận xét, đối chiếu lời giải và ghi chép kiến thức cốt lõi.</w:t>
+              <w:t xml:space="preserve">- </w:t>
+            </w:r>
+            <w:r>
+              <w:rPr>
+                <w:rFonts w:ascii="Times New Roman" w:hAnsi="Times New Roman"/>
+                <w:color w:val="000000"/>
+                <w:sz w:val="22"/>
+              </w:rPr>
+              <w:t xml:space="preserve">HS ghi chép định nghĩa nội năng và công thức </w:t>
+            </w:r>
+            <w:r>
+              <w:rPr>
+                <w:rFonts w:ascii="Times New Roman" w:hAnsi="Times New Roman"/>
+                <w:i/>
+                <w:color w:val="000000"/>
+                <w:sz w:val="22"/>
+              </w:rPr>
+              <w:t>U = E_đ + E_t</w:t>
+            </w:r>
+            <w:r>
+              <w:rPr>
+                <w:rFonts w:ascii="Times New Roman" w:hAnsi="Times New Roman"/>
+                <w:color w:val="000000"/>
+                <w:sz w:val="22"/>
+              </w:rPr>
+              <w:t xml:space="preserve"> vào vở.</w:t>
             </w:r>
           </w:p>
         </w:tc>
@@ -2629,16 +2568,6 @@
       <w:r>
         <w:rPr>
           <w:rFonts w:ascii="Times New Roman" w:hAnsi="Times New Roman"/>
-          <w:b w:val="0"/>
-          <w:i w:val="0"/>
-          <w:color w:val="000000"/>
-          <w:sz w:val="26"/>
-        </w:rPr>
-        <w:t xml:space="preserve">  </w:t>
-      </w:r>
-      <w:r>
-        <w:rPr>
-          <w:rFonts w:ascii="Times New Roman" w:hAnsi="Times New Roman"/>
           <w:b/>
           <w:i w:val="0"/>
           <w:color w:val="000000"/>
@@ -2654,7 +2583,7 @@
           <w:color w:val="000000"/>
           <w:sz w:val="26"/>
         </w:rPr>
-        <w:t xml:space="preserve"> Chỉ ra được hai cách làm biến đổi nội năng là thực hiện công và truyền nhiệt thông qua thí nghiệm thực tế cọ xát/đun nóng ống ete.</w:t>
+        <w:t xml:space="preserve"> HS mô tả được thí nghiệm biến đổi nội năng hơi ete trong ống nghiệm và phân biệt được thực hiện công và truyền nhiệt.</w:t>
       </w:r>
     </w:p>
     <w:p>
@@ -2674,22 +2603,12 @@
       <w:r>
         <w:rPr>
           <w:rFonts w:ascii="Times New Roman" w:hAnsi="Times New Roman"/>
-          <w:b w:val="0"/>
-          <w:i w:val="0"/>
-          <w:color w:val="000000"/>
-          <w:sz w:val="26"/>
-        </w:rPr>
-        <w:t xml:space="preserve">  </w:t>
-      </w:r>
-      <w:r>
-        <w:rPr>
-          <w:rFonts w:ascii="Times New Roman" w:hAnsi="Times New Roman"/>
           <w:b/>
           <w:i w:val="0"/>
           <w:color w:val="000000"/>
           <w:sz w:val="26"/>
         </w:rPr>
-        <w:t>Nội dung:</w:t>
+        <w:t>Sản phẩm:</w:t>
       </w:r>
       <w:r>
         <w:rPr>
@@ -2699,7 +2618,7 @@
           <w:color w:val="000000"/>
           <w:sz w:val="26"/>
         </w:rPr>
-        <w:t xml:space="preserve"> Phân tích thí nghiệm ống nghiệm ete đậy nút cọ xát.</w:t>
+        <w:t xml:space="preserve"> Câu trả lời Nhiệm vụ 2 trong Phiếu học tập.</w:t>
       </w:r>
     </w:p>
     <w:p>
@@ -2719,32 +2638,12 @@
       <w:r>
         <w:rPr>
           <w:rFonts w:ascii="Times New Roman" w:hAnsi="Times New Roman"/>
-          <w:b w:val="0"/>
-          <w:i w:val="0"/>
-          <w:color w:val="000000"/>
-          <w:sz w:val="26"/>
-        </w:rPr>
-        <w:t xml:space="preserve">  </w:t>
-      </w:r>
-      <w:r>
-        <w:rPr>
-          <w:rFonts w:ascii="Times New Roman" w:hAnsi="Times New Roman"/>
           <w:b/>
           <w:i w:val="0"/>
           <w:color w:val="000000"/>
           <w:sz w:val="26"/>
         </w:rPr>
-        <w:t>Sản phẩm:</w:t>
-      </w:r>
-      <w:r>
-        <w:rPr>
-          <w:rFonts w:ascii="Times New Roman" w:hAnsi="Times New Roman"/>
-          <w:b w:val="0"/>
-          <w:i w:val="0"/>
-          <w:color w:val="000000"/>
-          <w:sz w:val="26"/>
-        </w:rPr>
-        <w:t xml:space="preserve"> Sự phân biệt rõ ràng hai cách làm biến đổi nội năng.</w:t>
+        <w:t>Tiến trình dạy học:</w:t>
       </w:r>
     </w:p>
     <w:tbl>
@@ -2888,7 +2787,7 @@
                 <w:color w:val="000000"/>
                 <w:sz w:val="22"/>
               </w:rPr>
-              <w:t>GV yêu cầu HS quan sát thí nghiệm đun nóng ống ete đậy nút cao su/hoặc cọ xát dây cọ xát ống nghiệm và đặt câu hỏi: *“Khi cọ xát hoặc đun nóng ống nghiệm, vì sao nút cao su lại bật ra? Nội năng của ete đã thay đổi bằng những cách nào? Nêu sự khác biệt giữa hai cách đó?”*</w:t>
+              <w:t>GV biểu diễn hoặc chiếu video thí nghiệm ống ete đậy nút kín bị cọ xát/đun nóng làm nút bật ra. Yêu cầu HS hoàn thành Nhiệm vụ 2.</w:t>
             </w:r>
           </w:p>
         </w:tc>
@@ -2923,13 +2822,28 @@
               </w:rPr>
               <w:t>Tiếp nhận nhiệm vụ:</w:t>
             </w:r>
+          </w:p>
+          <w:p>
+            <w:pPr>
+              <w:spacing w:before="40" w:after="40" w:line="276" w:lineRule="auto"/>
+              <w:ind w:left="170" w:hanging="113"/>
+              <w:jc w:val="left"/>
+            </w:pPr>
             <w:r>
               <w:rPr>
                 <w:rFonts w:ascii="Times New Roman" w:hAnsi="Times New Roman"/>
                 <w:color w:val="000000"/>
                 <w:sz w:val="22"/>
               </w:rPr>
-              <w:t xml:space="preserve"> Học sinh tiếp nhận nhiệm vụ học tập từ giáo viên.</w:t>
+              <w:t xml:space="preserve">- </w:t>
+            </w:r>
+            <w:r>
+              <w:rPr>
+                <w:rFonts w:ascii="Times New Roman" w:hAnsi="Times New Roman"/>
+                <w:color w:val="000000"/>
+                <w:sz w:val="22"/>
+              </w:rPr>
+              <w:t>HS quan sát hiện tượng thí nghiệm, ghi chép lại các biểu hiện và nhận nhiệm vụ trên PHT.</w:t>
             </w:r>
           </w:p>
         </w:tc>
@@ -2969,13 +2883,28 @@
               </w:rPr>
               <w:t>Theo dõi, hỗ trợ:</w:t>
             </w:r>
+          </w:p>
+          <w:p>
+            <w:pPr>
+              <w:spacing w:before="40" w:after="40" w:line="276" w:lineRule="auto"/>
+              <w:ind w:left="170" w:hanging="113"/>
+              <w:jc w:val="left"/>
+            </w:pPr>
             <w:r>
               <w:rPr>
                 <w:rFonts w:ascii="Times New Roman" w:hAnsi="Times New Roman"/>
                 <w:color w:val="000000"/>
                 <w:sz w:val="22"/>
               </w:rPr>
-              <w:t xml:space="preserve"> Giáo viên đôn đốc, gợi ý sự chuyển hóa cơ năng -&gt; nội năng (thực hiện công) và nhiệt năng truyền trực tiếp -&gt; nội năng (truyền nhiệt).</w:t>
+              <w:t xml:space="preserve">- </w:t>
+            </w:r>
+            <w:r>
+              <w:rPr>
+                <w:rFonts w:ascii="Times New Roman" w:hAnsi="Times New Roman"/>
+                <w:color w:val="000000"/>
+                <w:sz w:val="22"/>
+              </w:rPr>
+              <w:t>GV định hướng HS phân tích sự chuyển hóa năng lượng (có sinh công/lực cơ học hay chỉ truyền nhiệt năng).</w:t>
             </w:r>
           </w:p>
         </w:tc>
@@ -3010,13 +2939,28 @@
               </w:rPr>
               <w:t>Thực hiện nhiệm vụ:</w:t>
             </w:r>
+          </w:p>
+          <w:p>
+            <w:pPr>
+              <w:spacing w:before="40" w:after="40" w:line="276" w:lineRule="auto"/>
+              <w:ind w:left="170" w:hanging="113"/>
+              <w:jc w:val="left"/>
+            </w:pPr>
             <w:r>
               <w:rPr>
                 <w:rFonts w:ascii="Times New Roman" w:hAnsi="Times New Roman"/>
                 <w:color w:val="000000"/>
                 <w:sz w:val="22"/>
               </w:rPr>
-              <w:t xml:space="preserve"> HS thảo luận nhóm nhỏ để phân tích hai quá trình vật lý xảy ra trong thí nghiệm ống ete và điền khuyết lý thuyết vào PHT.</w:t>
+              <w:t xml:space="preserve">- </w:t>
+            </w:r>
+            <w:r>
+              <w:rPr>
+                <w:rFonts w:ascii="Times New Roman" w:hAnsi="Times New Roman"/>
+                <w:color w:val="000000"/>
+                <w:sz w:val="22"/>
+              </w:rPr>
+              <w:t>HS làm việc nhóm nhỏ thảo luận về hai quá trình: cọ xát (thực hiện công) và đun nóng (truyền nhiệt).</w:t>
             </w:r>
           </w:p>
         </w:tc>
@@ -3056,13 +3000,28 @@
               </w:rPr>
               <w:t>Tổ chức báo cáo:</w:t>
             </w:r>
+          </w:p>
+          <w:p>
+            <w:pPr>
+              <w:spacing w:before="40" w:after="40" w:line="276" w:lineRule="auto"/>
+              <w:ind w:left="170" w:hanging="113"/>
+              <w:jc w:val="left"/>
+            </w:pPr>
             <w:r>
               <w:rPr>
                 <w:rFonts w:ascii="Times New Roman" w:hAnsi="Times New Roman"/>
                 <w:color w:val="000000"/>
                 <w:sz w:val="22"/>
               </w:rPr>
-              <w:t xml:space="preserve"> GV gọi đại diện nhóm phân tích các cách làm biến đổi nội năng của hệ.</w:t>
+              <w:t xml:space="preserve">- </w:t>
+            </w:r>
+            <w:r>
+              <w:rPr>
+                <w:rFonts w:ascii="Times New Roman" w:hAnsi="Times New Roman"/>
+                <w:color w:val="000000"/>
+                <w:sz w:val="22"/>
+              </w:rPr>
+              <w:t>GV gọi đại diện nhóm trình bày sự giống và khác nhau giữa hai cách làm biến đổi nội năng.</w:t>
             </w:r>
           </w:p>
         </w:tc>
@@ -3097,13 +3056,28 @@
               </w:rPr>
               <w:t>Báo cáo, thảo luận:</w:t>
             </w:r>
+          </w:p>
+          <w:p>
+            <w:pPr>
+              <w:spacing w:before="40" w:after="40" w:line="276" w:lineRule="auto"/>
+              <w:ind w:left="170" w:hanging="113"/>
+              <w:jc w:val="left"/>
+            </w:pPr>
             <w:r>
               <w:rPr>
                 <w:rFonts w:ascii="Times New Roman" w:hAnsi="Times New Roman"/>
                 <w:color w:val="000000"/>
                 <w:sz w:val="22"/>
               </w:rPr>
-              <w:t xml:space="preserve"> Đại diện nhóm trình bày sự khác biệt giữa thực hiện công (có sự chuyển hóa năng lượng) và truyền nhiệt (không có sự chuyển hóa năng lượng, chỉ có sự truyền năng lượng).</w:t>
+              <w:t xml:space="preserve">- </w:t>
+            </w:r>
+            <w:r>
+              <w:rPr>
+                <w:rFonts w:ascii="Times New Roman" w:hAnsi="Times New Roman"/>
+                <w:color w:val="000000"/>
+                <w:sz w:val="22"/>
+              </w:rPr>
+              <w:t>Đại diện HS phân tích: thực hiện công có sự chuyển hóa cơ năng thành nội năng; truyền nhiệt không có chuyển hóa năng lượng.</w:t>
             </w:r>
           </w:p>
         </w:tc>
@@ -3164,7 +3138,7 @@
                 <w:color w:val="000000"/>
                 <w:sz w:val="22"/>
               </w:rPr>
-              <w:t>GV chuẩn hóa kiến thức về hai cách làm biến đổi nội năng (Thực hiện công và Truyền nhiệt).</w:t>
+              <w:t>GV chốt kiến thức: Có hai cách làm thay đổi nội năng là Thực hiện công và Truyền nhiệt.</w:t>
             </w:r>
           </w:p>
         </w:tc>
@@ -3199,13 +3173,28 @@
               </w:rPr>
               <w:t>Ghi nhận kiến thức:</w:t>
             </w:r>
+          </w:p>
+          <w:p>
+            <w:pPr>
+              <w:spacing w:before="40" w:after="40" w:line="276" w:lineRule="auto"/>
+              <w:ind w:left="170" w:hanging="113"/>
+              <w:jc w:val="left"/>
+            </w:pPr>
             <w:r>
               <w:rPr>
                 <w:rFonts w:ascii="Times New Roman" w:hAnsi="Times New Roman"/>
                 <w:color w:val="000000"/>
                 <w:sz w:val="22"/>
               </w:rPr>
-              <w:t xml:space="preserve"> Học sinh lắng nghe nhận xét, đối chiếu lời giải và ghi chép kiến thức cốt lõi.</w:t>
+              <w:t xml:space="preserve">- </w:t>
+            </w:r>
+            <w:r>
+              <w:rPr>
+                <w:rFonts w:ascii="Times New Roman" w:hAnsi="Times New Roman"/>
+                <w:color w:val="000000"/>
+                <w:sz w:val="22"/>
+              </w:rPr>
+              <w:t>HS ghi nhận hai phương thức biến đổi nội năng và điền từ khóa tương ứng vào PHT.</w:t>
             </w:r>
           </w:p>
         </w:tc>
@@ -3247,16 +3236,6 @@
       <w:r>
         <w:rPr>
           <w:rFonts w:ascii="Times New Roman" w:hAnsi="Times New Roman"/>
-          <w:b w:val="0"/>
-          <w:i w:val="0"/>
-          <w:color w:val="000000"/>
-          <w:sz w:val="26"/>
-        </w:rPr>
-        <w:t xml:space="preserve">  </w:t>
-      </w:r>
-      <w:r>
-        <w:rPr>
-          <w:rFonts w:ascii="Times New Roman" w:hAnsi="Times New Roman"/>
           <w:b/>
           <w:i w:val="0"/>
           <w:color w:val="000000"/>
@@ -3272,7 +3251,7 @@
           <w:color w:val="000000"/>
           <w:sz w:val="26"/>
         </w:rPr>
-        <w:t xml:space="preserve"> Phát biểu được Nguyên lí I Nhiệt động lực học (</w:t>
+        <w:t xml:space="preserve"> HS phát biểu được Nguyên lí I, ghi nhớ hệ thức </w:t>
       </w:r>
       <w:r>
         <w:rPr>
@@ -3292,7 +3271,7 @@
           <w:color w:val="000000"/>
           <w:sz w:val="26"/>
         </w:rPr>
-        <w:t>) và giải thích đúng quy ước dấu của các đại lượng.</w:t>
+        <w:t xml:space="preserve"> và áp dụng chính xác quy ước dấu.</w:t>
       </w:r>
     </w:p>
     <w:p>
@@ -3312,22 +3291,12 @@
       <w:r>
         <w:rPr>
           <w:rFonts w:ascii="Times New Roman" w:hAnsi="Times New Roman"/>
-          <w:b w:val="0"/>
-          <w:i w:val="0"/>
-          <w:color w:val="000000"/>
-          <w:sz w:val="26"/>
-        </w:rPr>
-        <w:t xml:space="preserve">  </w:t>
-      </w:r>
-      <w:r>
-        <w:rPr>
-          <w:rFonts w:ascii="Times New Roman" w:hAnsi="Times New Roman"/>
           <w:b/>
           <w:i w:val="0"/>
           <w:color w:val="000000"/>
           <w:sz w:val="26"/>
         </w:rPr>
-        <w:t>Nội dung:</w:t>
+        <w:t>Sản phẩm:</w:t>
       </w:r>
       <w:r>
         <w:rPr>
@@ -3337,7 +3306,7 @@
           <w:color w:val="000000"/>
           <w:sz w:val="26"/>
         </w:rPr>
-        <w:t xml:space="preserve"> Tìm hiểu biểu thức toán học và bảng quy ước dấu.</w:t>
+        <w:t xml:space="preserve"> Câu trả lời Nhiệm vụ 3 trong Phiếu học tập.</w:t>
       </w:r>
     </w:p>
     <w:p>
@@ -3357,32 +3326,12 @@
       <w:r>
         <w:rPr>
           <w:rFonts w:ascii="Times New Roman" w:hAnsi="Times New Roman"/>
-          <w:b w:val="0"/>
-          <w:i w:val="0"/>
-          <w:color w:val="000000"/>
-          <w:sz w:val="26"/>
-        </w:rPr>
-        <w:t xml:space="preserve">  </w:t>
-      </w:r>
-      <w:r>
-        <w:rPr>
-          <w:rFonts w:ascii="Times New Roman" w:hAnsi="Times New Roman"/>
           <w:b/>
           <w:i w:val="0"/>
           <w:color w:val="000000"/>
           <w:sz w:val="26"/>
         </w:rPr>
-        <w:t>Sản phẩm:</w:t>
-      </w:r>
-      <w:r>
-        <w:rPr>
-          <w:rFonts w:ascii="Times New Roman" w:hAnsi="Times New Roman"/>
-          <w:b w:val="0"/>
-          <w:i w:val="0"/>
-          <w:color w:val="000000"/>
-          <w:sz w:val="26"/>
-        </w:rPr>
-        <w:t xml:space="preserve"> Ghi nhận biểu thức và bảng quy ước dấu chuẩn xác trên PHT.</w:t>
+        <w:t>Tiến trình dạy học:</w:t>
       </w:r>
     </w:p>
     <w:tbl>
@@ -3526,58 +3475,7 @@
                 <w:color w:val="000000"/>
                 <w:sz w:val="22"/>
               </w:rPr>
-              <w:t xml:space="preserve">GV yêu cầu HS kết hợp hai quá trình thực hiện công và truyền nhiệt để viết biểu thức liên hệ độ biến thiên nội năng </w:t>
-            </w:r>
-            <w:r>
-              <w:rPr>
-                <w:rFonts w:ascii="Times New Roman" w:hAnsi="Times New Roman"/>
-                <w:i/>
-                <w:color w:val="000000"/>
-                <w:sz w:val="22"/>
-              </w:rPr>
-              <w:t>Δ U</w:t>
-            </w:r>
-            <w:r>
-              <w:rPr>
-                <w:rFonts w:ascii="Times New Roman" w:hAnsi="Times New Roman"/>
-                <w:color w:val="000000"/>
-                <w:sz w:val="22"/>
-              </w:rPr>
-              <w:t xml:space="preserve"> với công </w:t>
-            </w:r>
-            <w:r>
-              <w:rPr>
-                <w:rFonts w:ascii="Times New Roman" w:hAnsi="Times New Roman"/>
-                <w:i/>
-                <w:color w:val="000000"/>
-                <w:sz w:val="22"/>
-              </w:rPr>
-              <w:t>A</w:t>
-            </w:r>
-            <w:r>
-              <w:rPr>
-                <w:rFonts w:ascii="Times New Roman" w:hAnsi="Times New Roman"/>
-                <w:color w:val="000000"/>
-                <w:sz w:val="22"/>
-              </w:rPr>
-              <w:t xml:space="preserve"> và nhiệt lượng </w:t>
-            </w:r>
-            <w:r>
-              <w:rPr>
-                <w:rFonts w:ascii="Times New Roman" w:hAnsi="Times New Roman"/>
-                <w:i/>
-                <w:color w:val="000000"/>
-                <w:sz w:val="22"/>
-              </w:rPr>
-              <w:t>Q</w:t>
-            </w:r>
-            <w:r>
-              <w:rPr>
-                <w:rFonts w:ascii="Times New Roman" w:hAnsi="Times New Roman"/>
-                <w:color w:val="000000"/>
-                <w:sz w:val="22"/>
-              </w:rPr>
-              <w:t>. Yêu cầu nghiên cứu bảng quy ước dấu trong SGK.</w:t>
+              <w:t>GV giới thiệu hệ thức Nguyên lí I và quy ước dấu. Yêu cầu HS thảo luận và hoàn thành Nhiệm vụ 3 trên PHT.</w:t>
             </w:r>
           </w:p>
         </w:tc>
@@ -3612,13 +3510,28 @@
               </w:rPr>
               <w:t>Tiếp nhận nhiệm vụ:</w:t>
             </w:r>
+          </w:p>
+          <w:p>
+            <w:pPr>
+              <w:spacing w:before="40" w:after="40" w:line="276" w:lineRule="auto"/>
+              <w:ind w:left="170" w:hanging="113"/>
+              <w:jc w:val="left"/>
+            </w:pPr>
             <w:r>
               <w:rPr>
                 <w:rFonts w:ascii="Times New Roman" w:hAnsi="Times New Roman"/>
                 <w:color w:val="000000"/>
                 <w:sz w:val="22"/>
               </w:rPr>
-              <w:t xml:space="preserve"> Học sinh tiếp nhận nhiệm vụ học tập từ giáo viên.</w:t>
+              <w:t xml:space="preserve">- </w:t>
+            </w:r>
+            <w:r>
+              <w:rPr>
+                <w:rFonts w:ascii="Times New Roman" w:hAnsi="Times New Roman"/>
+                <w:color w:val="000000"/>
+                <w:sz w:val="22"/>
+              </w:rPr>
+              <w:t>HS tiếp nhận nhiệm vụ học tập, quan sát sơ đồ quy ước dấu trên bảng chiếu.</w:t>
             </w:r>
           </w:p>
         </w:tc>
@@ -3658,81 +3571,28 @@
               </w:rPr>
               <w:t>Theo dõi, hỗ trợ:</w:t>
             </w:r>
+          </w:p>
+          <w:p>
+            <w:pPr>
+              <w:spacing w:before="40" w:after="40" w:line="276" w:lineRule="auto"/>
+              <w:ind w:left="170" w:hanging="113"/>
+              <w:jc w:val="left"/>
+            </w:pPr>
             <w:r>
               <w:rPr>
                 <w:rFonts w:ascii="Times New Roman" w:hAnsi="Times New Roman"/>
                 <w:color w:val="000000"/>
                 <w:sz w:val="22"/>
               </w:rPr>
-              <w:t xml:space="preserve"> GV hỗ trợ HS ghi nhớ quy ước dấu: Hệ nhận nhiệt (</w:t>
-            </w:r>
-            <w:r>
-              <w:rPr>
-                <w:rFonts w:ascii="Times New Roman" w:hAnsi="Times New Roman"/>
-                <w:i/>
+              <w:t xml:space="preserve">- </w:t>
+            </w:r>
+            <w:r>
+              <w:rPr>
+                <w:rFonts w:ascii="Times New Roman" w:hAnsi="Times New Roman"/>
                 <w:color w:val="000000"/>
                 <w:sz w:val="22"/>
               </w:rPr>
-              <w:t>Q &gt; 0</w:t>
-            </w:r>
-            <w:r>
-              <w:rPr>
-                <w:rFonts w:ascii="Times New Roman" w:hAnsi="Times New Roman"/>
-                <w:color w:val="000000"/>
-                <w:sz w:val="22"/>
-              </w:rPr>
-              <w:t>)/nhận công (</w:t>
-            </w:r>
-            <w:r>
-              <w:rPr>
-                <w:rFonts w:ascii="Times New Roman" w:hAnsi="Times New Roman"/>
-                <w:i/>
-                <w:color w:val="000000"/>
-                <w:sz w:val="22"/>
-              </w:rPr>
-              <w:t>A &gt; 0</w:t>
-            </w:r>
-            <w:r>
-              <w:rPr>
-                <w:rFonts w:ascii="Times New Roman" w:hAnsi="Times New Roman"/>
-                <w:color w:val="000000"/>
-                <w:sz w:val="22"/>
-              </w:rPr>
-              <w:t>); hệ tỏa nhiệt (</w:t>
-            </w:r>
-            <w:r>
-              <w:rPr>
-                <w:rFonts w:ascii="Times New Roman" w:hAnsi="Times New Roman"/>
-                <w:i/>
-                <w:color w:val="000000"/>
-                <w:sz w:val="22"/>
-              </w:rPr>
-              <w:t>Q &lt; 0</w:t>
-            </w:r>
-            <w:r>
-              <w:rPr>
-                <w:rFonts w:ascii="Times New Roman" w:hAnsi="Times New Roman"/>
-                <w:color w:val="000000"/>
-                <w:sz w:val="22"/>
-              </w:rPr>
-              <w:t>)/thực hiện công (</w:t>
-            </w:r>
-            <w:r>
-              <w:rPr>
-                <w:rFonts w:ascii="Times New Roman" w:hAnsi="Times New Roman"/>
-                <w:i/>
-                <w:color w:val="000000"/>
-                <w:sz w:val="22"/>
-              </w:rPr>
-              <w:t>A &lt; 0</w:t>
-            </w:r>
-            <w:r>
-              <w:rPr>
-                <w:rFonts w:ascii="Times New Roman" w:hAnsi="Times New Roman"/>
-                <w:color w:val="000000"/>
-                <w:sz w:val="22"/>
-              </w:rPr>
-              <w:t>).</w:t>
+              <w:t>GV nhấn mạnh: dấu dương (+) khi hệ nhận (năng lượng đi vào hệ); dấu âm (-) khi hệ truyền đi/tỏa ra (đi ra ngoài).</w:t>
             </w:r>
           </w:p>
         </w:tc>
@@ -3767,13 +3627,28 @@
               </w:rPr>
               <w:t>Thực hiện nhiệm vụ:</w:t>
             </w:r>
+          </w:p>
+          <w:p>
+            <w:pPr>
+              <w:spacing w:before="40" w:after="40" w:line="276" w:lineRule="auto"/>
+              <w:ind w:left="170" w:hanging="113"/>
+              <w:jc w:val="left"/>
+            </w:pPr>
             <w:r>
               <w:rPr>
                 <w:rFonts w:ascii="Times New Roman" w:hAnsi="Times New Roman"/>
                 <w:color w:val="000000"/>
                 <w:sz w:val="22"/>
               </w:rPr>
-              <w:t xml:space="preserve"> HS làm việc cá nhân hoàn thành hệ thức </w:t>
+              <w:t xml:space="preserve">- </w:t>
+            </w:r>
+            <w:r>
+              <w:rPr>
+                <w:rFonts w:ascii="Times New Roman" w:hAnsi="Times New Roman"/>
+                <w:color w:val="000000"/>
+                <w:sz w:val="22"/>
+              </w:rPr>
+              <w:t xml:space="preserve">HS thảo luận nhóm điền khuyết quy ước dấu của công </w:t>
             </w:r>
             <w:r>
               <w:rPr>
@@ -3782,7 +3657,7 @@
                 <w:color w:val="000000"/>
                 <w:sz w:val="22"/>
               </w:rPr>
-              <w:t>Δ U = A + Q</w:t>
+              <w:t>A</w:t>
             </w:r>
             <w:r>
               <w:rPr>
@@ -3790,7 +3665,24 @@
                 <w:color w:val="000000"/>
                 <w:sz w:val="22"/>
               </w:rPr>
-              <w:t xml:space="preserve"> và vẽ bảng quy ước dấu vào PHT.</w:t>
+              <w:t xml:space="preserve"> và nhiệt lượng </w:t>
+            </w:r>
+            <w:r>
+              <w:rPr>
+                <w:rFonts w:ascii="Times New Roman" w:hAnsi="Times New Roman"/>
+                <w:i/>
+                <w:color w:val="000000"/>
+                <w:sz w:val="22"/>
+              </w:rPr>
+              <w:t>Q</w:t>
+            </w:r>
+            <w:r>
+              <w:rPr>
+                <w:rFonts w:ascii="Times New Roman" w:hAnsi="Times New Roman"/>
+                <w:color w:val="000000"/>
+                <w:sz w:val="22"/>
+              </w:rPr>
+              <w:t xml:space="preserve"> vào PHT.</w:t>
             </w:r>
           </w:p>
         </w:tc>
@@ -3830,13 +3722,28 @@
               </w:rPr>
               <w:t>Tổ chức báo cáo:</w:t>
             </w:r>
+          </w:p>
+          <w:p>
+            <w:pPr>
+              <w:spacing w:before="40" w:after="40" w:line="276" w:lineRule="auto"/>
+              <w:ind w:left="170" w:hanging="113"/>
+              <w:jc w:val="left"/>
+            </w:pPr>
             <w:r>
               <w:rPr>
                 <w:rFonts w:ascii="Times New Roman" w:hAnsi="Times New Roman"/>
                 <w:color w:val="000000"/>
                 <w:sz w:val="22"/>
               </w:rPr>
-              <w:t xml:space="preserve"> GV gọi HS lên bảng viết biểu thức và vẽ bảng quy ước dấu.</w:t>
+              <w:t xml:space="preserve">- </w:t>
+            </w:r>
+            <w:r>
+              <w:rPr>
+                <w:rFonts w:ascii="Times New Roman" w:hAnsi="Times New Roman"/>
+                <w:color w:val="000000"/>
+                <w:sz w:val="22"/>
+              </w:rPr>
+              <w:t>GV gọi HS lên bảng điền bảng quy ước dấu và giải thích ý nghĩa vật lý của các trường hợp.</w:t>
             </w:r>
           </w:p>
         </w:tc>
@@ -3871,13 +3778,45 @@
               </w:rPr>
               <w:t>Báo cáo, thảo luận:</w:t>
             </w:r>
+          </w:p>
+          <w:p>
+            <w:pPr>
+              <w:spacing w:before="40" w:after="40" w:line="276" w:lineRule="auto"/>
+              <w:ind w:left="170" w:hanging="113"/>
+              <w:jc w:val="left"/>
+            </w:pPr>
             <w:r>
               <w:rPr>
                 <w:rFonts w:ascii="Times New Roman" w:hAnsi="Times New Roman"/>
                 <w:color w:val="000000"/>
                 <w:sz w:val="22"/>
               </w:rPr>
-              <w:t xml:space="preserve"> HS lên bảng trình bày, các HS khác nhận xét chéo.</w:t>
+              <w:t xml:space="preserve">- </w:t>
+            </w:r>
+            <w:r>
+              <w:rPr>
+                <w:rFonts w:ascii="Times New Roman" w:hAnsi="Times New Roman"/>
+                <w:color w:val="000000"/>
+                <w:sz w:val="22"/>
+              </w:rPr>
+              <w:t xml:space="preserve">HS đại diện trình bày bảng dấu và giải thích sự bảo toàn năng lượng trong hệ thức </w:t>
+            </w:r>
+            <w:r>
+              <w:rPr>
+                <w:rFonts w:ascii="Times New Roman" w:hAnsi="Times New Roman"/>
+                <w:i/>
+                <w:color w:val="000000"/>
+                <w:sz w:val="22"/>
+              </w:rPr>
+              <w:t>Δ U = A + Q</w:t>
+            </w:r>
+            <w:r>
+              <w:rPr>
+                <w:rFonts w:ascii="Times New Roman" w:hAnsi="Times New Roman"/>
+                <w:color w:val="000000"/>
+                <w:sz w:val="22"/>
+              </w:rPr>
+              <w:t>.</w:t>
             </w:r>
           </w:p>
         </w:tc>
@@ -3938,7 +3877,75 @@
                 <w:color w:val="000000"/>
                 <w:sz w:val="22"/>
               </w:rPr>
-              <w:t>GV chuẩn hóa quy ước dấu và đưa ra ví dụ minh họa trực quan.</w:t>
+              <w:t xml:space="preserve">GV chuẩn hóa hệ thức Nguyên lí I và chốt quy ước dấu: </w:t>
+            </w:r>
+            <w:r>
+              <w:rPr>
+                <w:rFonts w:ascii="Times New Roman" w:hAnsi="Times New Roman"/>
+                <w:i/>
+                <w:color w:val="000000"/>
+                <w:sz w:val="22"/>
+              </w:rPr>
+              <w:t>Q &gt; 0</w:t>
+            </w:r>
+            <w:r>
+              <w:rPr>
+                <w:rFonts w:ascii="Times New Roman" w:hAnsi="Times New Roman"/>
+                <w:color w:val="000000"/>
+                <w:sz w:val="22"/>
+              </w:rPr>
+              <w:t xml:space="preserve"> nhận nhiệt, </w:t>
+            </w:r>
+            <w:r>
+              <w:rPr>
+                <w:rFonts w:ascii="Times New Roman" w:hAnsi="Times New Roman"/>
+                <w:i/>
+                <w:color w:val="000000"/>
+                <w:sz w:val="22"/>
+              </w:rPr>
+              <w:t>Q &lt; 0</w:t>
+            </w:r>
+            <w:r>
+              <w:rPr>
+                <w:rFonts w:ascii="Times New Roman" w:hAnsi="Times New Roman"/>
+                <w:color w:val="000000"/>
+                <w:sz w:val="22"/>
+              </w:rPr>
+              <w:t xml:space="preserve"> tỏa nhiệt; </w:t>
+            </w:r>
+            <w:r>
+              <w:rPr>
+                <w:rFonts w:ascii="Times New Roman" w:hAnsi="Times New Roman"/>
+                <w:i/>
+                <w:color w:val="000000"/>
+                <w:sz w:val="22"/>
+              </w:rPr>
+              <w:t>A &gt; 0</w:t>
+            </w:r>
+            <w:r>
+              <w:rPr>
+                <w:rFonts w:ascii="Times New Roman" w:hAnsi="Times New Roman"/>
+                <w:color w:val="000000"/>
+                <w:sz w:val="22"/>
+              </w:rPr>
+              <w:t xml:space="preserve"> nhận công, </w:t>
+            </w:r>
+            <w:r>
+              <w:rPr>
+                <w:rFonts w:ascii="Times New Roman" w:hAnsi="Times New Roman"/>
+                <w:i/>
+                <w:color w:val="000000"/>
+                <w:sz w:val="22"/>
+              </w:rPr>
+              <w:t>A &lt; 0</w:t>
+            </w:r>
+            <w:r>
+              <w:rPr>
+                <w:rFonts w:ascii="Times New Roman" w:hAnsi="Times New Roman"/>
+                <w:color w:val="000000"/>
+                <w:sz w:val="22"/>
+              </w:rPr>
+              <w:t xml:space="preserve"> sinh công.</w:t>
             </w:r>
           </w:p>
         </w:tc>
@@ -3973,13 +3980,28 @@
               </w:rPr>
               <w:t>Ghi nhận kiến thức:</w:t>
             </w:r>
+          </w:p>
+          <w:p>
+            <w:pPr>
+              <w:spacing w:before="40" w:after="40" w:line="276" w:lineRule="auto"/>
+              <w:ind w:left="170" w:hanging="113"/>
+              <w:jc w:val="left"/>
+            </w:pPr>
             <w:r>
               <w:rPr>
                 <w:rFonts w:ascii="Times New Roman" w:hAnsi="Times New Roman"/>
                 <w:color w:val="000000"/>
                 <w:sz w:val="22"/>
               </w:rPr>
-              <w:t xml:space="preserve"> Học sinh lắng nghe nhận xét, đối chiếu lời giải và ghi chép kiến thức cốt lõi.</w:t>
+              <w:t xml:space="preserve">- </w:t>
+            </w:r>
+            <w:r>
+              <w:rPr>
+                <w:rFonts w:ascii="Times New Roman" w:hAnsi="Times New Roman"/>
+                <w:color w:val="000000"/>
+                <w:sz w:val="22"/>
+              </w:rPr>
+              <w:t>HS ghi chép biểu thức Nguyên lí I và quy ước dấu cốt lõi vào vở học tập.</w:t>
             </w:r>
           </w:p>
         </w:tc>
@@ -4021,16 +4043,6 @@
       <w:r>
         <w:rPr>
           <w:rFonts w:ascii="Times New Roman" w:hAnsi="Times New Roman"/>
-          <w:b w:val="0"/>
-          <w:i w:val="0"/>
-          <w:color w:val="000000"/>
-          <w:sz w:val="26"/>
-        </w:rPr>
-        <w:t xml:space="preserve">  </w:t>
-      </w:r>
-      <w:r>
-        <w:rPr>
-          <w:rFonts w:ascii="Times New Roman" w:hAnsi="Times New Roman"/>
           <w:b/>
           <w:i w:val="0"/>
           <w:color w:val="000000"/>
@@ -4046,27 +4058,7 @@
           <w:color w:val="000000"/>
           <w:sz w:val="26"/>
         </w:rPr>
-        <w:t xml:space="preserve"> Phát biểu được định nghĩa nhiệt lượng và công thức tính nhiệt lượng thu vào/tỏa ra khi thay đổi nhiệt độ: </w:t>
-      </w:r>
-      <w:r>
-        <w:rPr>
-          <w:rFonts w:ascii="Times New Roman" w:hAnsi="Times New Roman"/>
-          <w:b w:val="0"/>
-          <w:i/>
-          <w:color w:val="000000"/>
-          <w:sz w:val="26"/>
-        </w:rPr>
-        <w:t>Q = mcΔ t</w:t>
-      </w:r>
-      <w:r>
-        <w:rPr>
-          <w:rFonts w:ascii="Times New Roman" w:hAnsi="Times New Roman"/>
-          <w:b w:val="0"/>
-          <w:i w:val="0"/>
-          <w:color w:val="000000"/>
-          <w:sz w:val="26"/>
-        </w:rPr>
-        <w:t>.</w:t>
+        <w:t xml:space="preserve"> HS phát biểu được định nghĩa nhiệt lượng, viết công thức tính nhiệt lượng thu vào/tỏa ra khi thay đổi nhiệt độ.</w:t>
       </w:r>
     </w:p>
     <w:p>
@@ -4086,22 +4078,12 @@
       <w:r>
         <w:rPr>
           <w:rFonts w:ascii="Times New Roman" w:hAnsi="Times New Roman"/>
-          <w:b w:val="0"/>
-          <w:i w:val="0"/>
-          <w:color w:val="000000"/>
-          <w:sz w:val="26"/>
-        </w:rPr>
-        <w:t xml:space="preserve">  </w:t>
-      </w:r>
-      <w:r>
-        <w:rPr>
-          <w:rFonts w:ascii="Times New Roman" w:hAnsi="Times New Roman"/>
           <w:b/>
           <w:i w:val="0"/>
           <w:color w:val="000000"/>
           <w:sz w:val="26"/>
         </w:rPr>
-        <w:t>Nội dung:</w:t>
+        <w:t>Sản phẩm:</w:t>
       </w:r>
       <w:r>
         <w:rPr>
@@ -4111,7 +4093,7 @@
           <w:color w:val="000000"/>
           <w:sz w:val="26"/>
         </w:rPr>
-        <w:t xml:space="preserve"> Tìm hiểu công thức tính nhiệt lượng và các đại lượng trong công thức.</w:t>
+        <w:t xml:space="preserve"> Công thức tính nhiệt lượng điền khuyết trong Nhiệm vụ 4.</w:t>
       </w:r>
     </w:p>
     <w:p>
@@ -4131,52 +4113,12 @@
       <w:r>
         <w:rPr>
           <w:rFonts w:ascii="Times New Roman" w:hAnsi="Times New Roman"/>
-          <w:b w:val="0"/>
-          <w:i w:val="0"/>
-          <w:color w:val="000000"/>
-          <w:sz w:val="26"/>
-        </w:rPr>
-        <w:t xml:space="preserve">  </w:t>
-      </w:r>
-      <w:r>
-        <w:rPr>
-          <w:rFonts w:ascii="Times New Roman" w:hAnsi="Times New Roman"/>
           <w:b/>
           <w:i w:val="0"/>
           <w:color w:val="000000"/>
           <w:sz w:val="26"/>
         </w:rPr>
-        <w:t>Sản phẩm:</w:t>
-      </w:r>
-      <w:r>
-        <w:rPr>
-          <w:rFonts w:ascii="Times New Roman" w:hAnsi="Times New Roman"/>
-          <w:b w:val="0"/>
-          <w:i w:val="0"/>
-          <w:color w:val="000000"/>
-          <w:sz w:val="26"/>
-        </w:rPr>
-        <w:t xml:space="preserve"> Công thức </w:t>
-      </w:r>
-      <w:r>
-        <w:rPr>
-          <w:rFonts w:ascii="Times New Roman" w:hAnsi="Times New Roman"/>
-          <w:b w:val="0"/>
-          <w:i/>
-          <w:color w:val="000000"/>
-          <w:sz w:val="26"/>
-        </w:rPr>
-        <w:t>Q = mcΔ t</w:t>
-      </w:r>
-      <w:r>
-        <w:rPr>
-          <w:rFonts w:ascii="Times New Roman" w:hAnsi="Times New Roman"/>
-          <w:b w:val="0"/>
-          <w:i w:val="0"/>
-          <w:color w:val="000000"/>
-          <w:sz w:val="26"/>
-        </w:rPr>
-        <w:t xml:space="preserve"> và đơn vị của các đại lượng.</w:t>
+        <w:t>Tiến trình dạy học:</w:t>
       </w:r>
     </w:p>
     <w:tbl>
@@ -4320,7 +4262,7 @@
                 <w:color w:val="000000"/>
                 <w:sz w:val="22"/>
               </w:rPr>
-              <w:t>GV đặt vấn đề: *“Khi truyền nhiệt làm vật tăng nhiệt độ, nhiệt lượng thu vào phụ thuộc những yếu tố nào của vật? Hãy nghiên cứu SGK để tìm ra công thức tính nhiệt lượng.”*</w:t>
+              <w:t>GV giao Nhiệm vụ 4, yêu cầu HS thảo luận các yếu tố ảnh hưởng đến nhiệt lượng cần cung cấp để làm nóng một vật.</w:t>
             </w:r>
           </w:p>
         </w:tc>
@@ -4355,13 +4297,28 @@
               </w:rPr>
               <w:t>Tiếp nhận nhiệm vụ:</w:t>
             </w:r>
+          </w:p>
+          <w:p>
+            <w:pPr>
+              <w:spacing w:before="40" w:after="40" w:line="276" w:lineRule="auto"/>
+              <w:ind w:left="170" w:hanging="113"/>
+              <w:jc w:val="left"/>
+            </w:pPr>
             <w:r>
               <w:rPr>
                 <w:rFonts w:ascii="Times New Roman" w:hAnsi="Times New Roman"/>
                 <w:color w:val="000000"/>
                 <w:sz w:val="22"/>
               </w:rPr>
-              <w:t xml:space="preserve"> Học sinh tiếp nhận nhiệm vụ học tập từ giáo viên.</w:t>
+              <w:t xml:space="preserve">- </w:t>
+            </w:r>
+            <w:r>
+              <w:rPr>
+                <w:rFonts w:ascii="Times New Roman" w:hAnsi="Times New Roman"/>
+                <w:color w:val="000000"/>
+                <w:sz w:val="22"/>
+              </w:rPr>
+              <w:t>HS tiếp nhận nhiệm vụ trên PHT và suy nghĩ câu hỏi từ thực tế đun nước nấu ăn.</w:t>
             </w:r>
           </w:p>
         </w:tc>
@@ -4401,13 +4358,28 @@
               </w:rPr>
               <w:t>Theo dõi, hỗ trợ:</w:t>
             </w:r>
+          </w:p>
+          <w:p>
+            <w:pPr>
+              <w:spacing w:before="40" w:after="40" w:line="276" w:lineRule="auto"/>
+              <w:ind w:left="170" w:hanging="113"/>
+              <w:jc w:val="left"/>
+            </w:pPr>
             <w:r>
               <w:rPr>
                 <w:rFonts w:ascii="Times New Roman" w:hAnsi="Times New Roman"/>
                 <w:color w:val="000000"/>
                 <w:sz w:val="22"/>
               </w:rPr>
-              <w:t xml:space="preserve"> GV hướng dẫn HS phân tích các đại lượng: khối lượng </w:t>
+              <w:t xml:space="preserve">- </w:t>
+            </w:r>
+            <w:r>
+              <w:rPr>
+                <w:rFonts w:ascii="Times New Roman" w:hAnsi="Times New Roman"/>
+                <w:color w:val="000000"/>
+                <w:sz w:val="22"/>
+              </w:rPr>
+              <w:t xml:space="preserve">GV hướng dẫn HS phân tích mối quan hệ giữa nhiệt lượng </w:t>
             </w:r>
             <w:r>
               <w:rPr>
@@ -4416,7 +4388,7 @@
                 <w:color w:val="000000"/>
                 <w:sz w:val="22"/>
               </w:rPr>
-              <w:t>m</w:t>
+              <w:t>Q</w:t>
             </w:r>
             <w:r>
               <w:rPr>
@@ -4424,7 +4396,7 @@
                 <w:color w:val="000000"/>
                 <w:sz w:val="22"/>
               </w:rPr>
-              <w:t xml:space="preserve">, độ tăng nhiệt độ </w:t>
+              <w:t xml:space="preserve"> với khối lượng </w:t>
             </w:r>
             <w:r>
               <w:rPr>
@@ -4433,6 +4405,23 @@
                 <w:color w:val="000000"/>
                 <w:sz w:val="22"/>
               </w:rPr>
+              <w:t>m</w:t>
+            </w:r>
+            <w:r>
+              <w:rPr>
+                <w:rFonts w:ascii="Times New Roman" w:hAnsi="Times New Roman"/>
+                <w:color w:val="000000"/>
+                <w:sz w:val="22"/>
+              </w:rPr>
+              <w:t xml:space="preserve">, độ tăng nhiệt độ </w:t>
+            </w:r>
+            <w:r>
+              <w:rPr>
+                <w:rFonts w:ascii="Times New Roman" w:hAnsi="Times New Roman"/>
+                <w:i/>
+                <w:color w:val="000000"/>
+                <w:sz w:val="22"/>
+              </w:rPr>
               <w:t>Δ t</w:t>
             </w:r>
             <w:r>
@@ -4441,7 +4430,7 @@
                 <w:color w:val="000000"/>
                 <w:sz w:val="22"/>
               </w:rPr>
-              <w:t>, và chất cấu tạo nên vật.</w:t>
+              <w:t xml:space="preserve"> và bản chất của chất.</w:t>
             </w:r>
           </w:p>
         </w:tc>
@@ -4476,13 +4465,45 @@
               </w:rPr>
               <w:t>Thực hiện nhiệm vụ:</w:t>
             </w:r>
+          </w:p>
+          <w:p>
+            <w:pPr>
+              <w:spacing w:before="40" w:after="40" w:line="276" w:lineRule="auto"/>
+              <w:ind w:left="170" w:hanging="113"/>
+              <w:jc w:val="left"/>
+            </w:pPr>
             <w:r>
               <w:rPr>
                 <w:rFonts w:ascii="Times New Roman" w:hAnsi="Times New Roman"/>
                 <w:color w:val="000000"/>
                 <w:sz w:val="22"/>
               </w:rPr>
-              <w:t xml:space="preserve"> HS thảo luận cặp đôi hoàn thành phần điền khuyết công thức tính nhiệt lượng trong PHT.</w:t>
+              <w:t xml:space="preserve">- </w:t>
+            </w:r>
+            <w:r>
+              <w:rPr>
+                <w:rFonts w:ascii="Times New Roman" w:hAnsi="Times New Roman"/>
+                <w:color w:val="000000"/>
+                <w:sz w:val="22"/>
+              </w:rPr>
+              <w:t xml:space="preserve">HS thảo luận và ghi nhận công thức tính nhiệt lượng </w:t>
+            </w:r>
+            <w:r>
+              <w:rPr>
+                <w:rFonts w:ascii="Times New Roman" w:hAnsi="Times New Roman"/>
+                <w:i/>
+                <w:color w:val="000000"/>
+                <w:sz w:val="22"/>
+              </w:rPr>
+              <w:t>Q = mcΔ t</w:t>
+            </w:r>
+            <w:r>
+              <w:rPr>
+                <w:rFonts w:ascii="Times New Roman" w:hAnsi="Times New Roman"/>
+                <w:color w:val="000000"/>
+                <w:sz w:val="22"/>
+              </w:rPr>
+              <w:t xml:space="preserve"> cùng các đơn vị tương ứng vào PHT.</w:t>
             </w:r>
           </w:p>
         </w:tc>
@@ -4522,13 +4543,45 @@
               </w:rPr>
               <w:t>Tổ chức báo cáo:</w:t>
             </w:r>
+          </w:p>
+          <w:p>
+            <w:pPr>
+              <w:spacing w:before="40" w:after="40" w:line="276" w:lineRule="auto"/>
+              <w:ind w:left="170" w:hanging="113"/>
+              <w:jc w:val="left"/>
+            </w:pPr>
             <w:r>
               <w:rPr>
                 <w:rFonts w:ascii="Times New Roman" w:hAnsi="Times New Roman"/>
                 <w:color w:val="000000"/>
                 <w:sz w:val="22"/>
               </w:rPr>
-              <w:t xml:space="preserve"> GV gọi HS đọc công thức tính nhiệt lượng phát hiện được.</w:t>
+              <w:t xml:space="preserve">- </w:t>
+            </w:r>
+            <w:r>
+              <w:rPr>
+                <w:rFonts w:ascii="Times New Roman" w:hAnsi="Times New Roman"/>
+                <w:color w:val="000000"/>
+                <w:sz w:val="22"/>
+              </w:rPr>
+              <w:t xml:space="preserve">GV gọi HS phát biểu định nghĩa nhiệt lượng và nêu tên, đơn vị của từng đại lượng trong công thức </w:t>
+            </w:r>
+            <w:r>
+              <w:rPr>
+                <w:rFonts w:ascii="Times New Roman" w:hAnsi="Times New Roman"/>
+                <w:i/>
+                <w:color w:val="000000"/>
+                <w:sz w:val="22"/>
+              </w:rPr>
+              <w:t>Q = mcΔ t</w:t>
+            </w:r>
+            <w:r>
+              <w:rPr>
+                <w:rFonts w:ascii="Times New Roman" w:hAnsi="Times New Roman"/>
+                <w:color w:val="000000"/>
+                <w:sz w:val="22"/>
+              </w:rPr>
+              <w:t>.</w:t>
             </w:r>
           </w:p>
         </w:tc>
@@ -4563,13 +4616,28 @@
               </w:rPr>
               <w:t>Báo cáo, thảo luận:</w:t>
             </w:r>
+          </w:p>
+          <w:p>
+            <w:pPr>
+              <w:spacing w:before="40" w:after="40" w:line="276" w:lineRule="auto"/>
+              <w:ind w:left="170" w:hanging="113"/>
+              <w:jc w:val="left"/>
+            </w:pPr>
             <w:r>
               <w:rPr>
                 <w:rFonts w:ascii="Times New Roman" w:hAnsi="Times New Roman"/>
                 <w:color w:val="000000"/>
                 <w:sz w:val="22"/>
               </w:rPr>
-              <w:t xml:space="preserve"> HS phát biểu công thức: </w:t>
+              <w:t xml:space="preserve">- </w:t>
+            </w:r>
+            <w:r>
+              <w:rPr>
+                <w:rFonts w:ascii="Times New Roman" w:hAnsi="Times New Roman"/>
+                <w:color w:val="000000"/>
+                <w:sz w:val="22"/>
+              </w:rPr>
+              <w:t xml:space="preserve">HS trình bày công thức, ghi rõ đơn vị của </w:t>
             </w:r>
             <w:r>
               <w:rPr>
@@ -4578,7 +4646,7 @@
                 <w:color w:val="000000"/>
                 <w:sz w:val="22"/>
               </w:rPr>
-              <w:t>Q = mcΔ t</w:t>
+              <w:t>Q</w:t>
             </w:r>
             <w:r>
               <w:rPr>
@@ -4586,7 +4654,7 @@
                 <w:color w:val="000000"/>
                 <w:sz w:val="22"/>
               </w:rPr>
-              <w:t>. Giải thích đơn vị của các đại lượng (</w:t>
+              <w:t xml:space="preserve"> (</w:t>
             </w:r>
             <w:r>
               <w:rPr>
@@ -4595,7 +4663,7 @@
                 <w:color w:val="000000"/>
                 <w:sz w:val="22"/>
               </w:rPr>
-              <w:t>Q</w:t>
+              <w:t>J</w:t>
             </w:r>
             <w:r>
               <w:rPr>
@@ -4603,7 +4671,7 @@
                 <w:color w:val="000000"/>
                 <w:sz w:val="22"/>
               </w:rPr>
-              <w:t xml:space="preserve"> tính bằng Jun </w:t>
+              <w:t xml:space="preserve">), </w:t>
             </w:r>
             <w:r>
               <w:rPr>
@@ -4612,7 +4680,7 @@
                 <w:color w:val="000000"/>
                 <w:sz w:val="22"/>
               </w:rPr>
-              <w:t>J</w:t>
+              <w:t>m</w:t>
             </w:r>
             <w:r>
               <w:rPr>
@@ -4620,7 +4688,7 @@
                 <w:color w:val="000000"/>
                 <w:sz w:val="22"/>
               </w:rPr>
-              <w:t xml:space="preserve">, </w:t>
+              <w:t xml:space="preserve"> (</w:t>
             </w:r>
             <w:r>
               <w:rPr>
@@ -4629,7 +4697,7 @@
                 <w:color w:val="000000"/>
                 <w:sz w:val="22"/>
               </w:rPr>
-              <w:t>m</w:t>
+              <w:t>kg</w:t>
             </w:r>
             <w:r>
               <w:rPr>
@@ -4637,7 +4705,7 @@
                 <w:color w:val="000000"/>
                 <w:sz w:val="22"/>
               </w:rPr>
-              <w:t xml:space="preserve"> tính bằng </w:t>
+              <w:t xml:space="preserve">), </w:t>
             </w:r>
             <w:r>
               <w:rPr>
@@ -4646,7 +4714,7 @@
                 <w:color w:val="000000"/>
                 <w:sz w:val="22"/>
               </w:rPr>
-              <w:t>kg</w:t>
+              <w:t>c</w:t>
             </w:r>
             <w:r>
               <w:rPr>
@@ -4654,7 +4722,7 @@
                 <w:color w:val="000000"/>
                 <w:sz w:val="22"/>
               </w:rPr>
-              <w:t xml:space="preserve">, </w:t>
+              <w:t xml:space="preserve"> (</w:t>
             </w:r>
             <w:r>
               <w:rPr>
@@ -4663,6 +4731,23 @@
                 <w:color w:val="000000"/>
                 <w:sz w:val="22"/>
               </w:rPr>
+              <w:t>J/kg.K</w:t>
+            </w:r>
+            <w:r>
+              <w:rPr>
+                <w:rFonts w:ascii="Times New Roman" w:hAnsi="Times New Roman"/>
+                <w:color w:val="000000"/>
+                <w:sz w:val="22"/>
+              </w:rPr>
+              <w:t xml:space="preserve">), </w:t>
+            </w:r>
+            <w:r>
+              <w:rPr>
+                <w:rFonts w:ascii="Times New Roman" w:hAnsi="Times New Roman"/>
+                <w:i/>
+                <w:color w:val="000000"/>
+                <w:sz w:val="22"/>
+              </w:rPr>
               <w:t>Δ t</w:t>
             </w:r>
             <w:r>
@@ -4671,7 +4756,7 @@
                 <w:color w:val="000000"/>
                 <w:sz w:val="22"/>
               </w:rPr>
-              <w:t xml:space="preserve"> tính bằng </w:t>
+              <w:t xml:space="preserve"> (</w:t>
             </w:r>
             <w:r>
               <w:rPr>
@@ -4766,7 +4851,7 @@
                 <w:color w:val="000000"/>
                 <w:sz w:val="22"/>
               </w:rPr>
-              <w:t xml:space="preserve">GV chốt công thức và lưu ý dấu của </w:t>
+              <w:t>GV chuẩn hóa: Nhiệt lượng (</w:t>
             </w:r>
             <w:r>
               <w:rPr>
@@ -4783,7 +4868,7 @@
                 <w:color w:val="000000"/>
                 <w:sz w:val="22"/>
               </w:rPr>
-              <w:t xml:space="preserve">: hệ thu nhiệt </w:t>
+              <w:t xml:space="preserve">) là số đo phần nội năng biến đổi trong truyền nhiệt. Công thức tính nhiệt lượng: </w:t>
             </w:r>
             <w:r>
               <w:rPr>
@@ -4792,24 +4877,7 @@
                 <w:color w:val="000000"/>
                 <w:sz w:val="22"/>
               </w:rPr>
-              <w:t>Q &gt; 0</w:t>
-            </w:r>
-            <w:r>
-              <w:rPr>
-                <w:rFonts w:ascii="Times New Roman" w:hAnsi="Times New Roman"/>
-                <w:color w:val="000000"/>
-                <w:sz w:val="22"/>
-              </w:rPr>
-              <w:t xml:space="preserve">, hệ tỏa nhiệt </w:t>
-            </w:r>
-            <w:r>
-              <w:rPr>
-                <w:rFonts w:ascii="Times New Roman" w:hAnsi="Times New Roman"/>
-                <w:i/>
-                <w:color w:val="000000"/>
-                <w:sz w:val="22"/>
-              </w:rPr>
-              <w:t>Q &lt; 0</w:t>
+              <w:t>Q = mcΔ t</w:t>
             </w:r>
             <w:r>
               <w:rPr>
@@ -4852,13 +4920,45 @@
               </w:rPr>
               <w:t>Ghi nhận kiến thức:</w:t>
             </w:r>
+          </w:p>
+          <w:p>
+            <w:pPr>
+              <w:spacing w:before="40" w:after="40" w:line="276" w:lineRule="auto"/>
+              <w:ind w:left="170" w:hanging="113"/>
+              <w:jc w:val="left"/>
+            </w:pPr>
             <w:r>
               <w:rPr>
                 <w:rFonts w:ascii="Times New Roman" w:hAnsi="Times New Roman"/>
                 <w:color w:val="000000"/>
                 <w:sz w:val="22"/>
               </w:rPr>
-              <w:t xml:space="preserve"> Học sinh lắng nghe nhận xét, đối chiếu lời giải và ghi chép kiến thức cốt lõi.</w:t>
+              <w:t xml:space="preserve">- </w:t>
+            </w:r>
+            <w:r>
+              <w:rPr>
+                <w:rFonts w:ascii="Times New Roman" w:hAnsi="Times New Roman"/>
+                <w:color w:val="000000"/>
+                <w:sz w:val="22"/>
+              </w:rPr>
+              <w:t xml:space="preserve">HS ghi chép định nghĩa nhiệt lượng và công thức </w:t>
+            </w:r>
+            <w:r>
+              <w:rPr>
+                <w:rFonts w:ascii="Times New Roman" w:hAnsi="Times New Roman"/>
+                <w:i/>
+                <w:color w:val="000000"/>
+                <w:sz w:val="22"/>
+              </w:rPr>
+              <w:t>Q = mcΔ t</w:t>
+            </w:r>
+            <w:r>
+              <w:rPr>
+                <w:rFonts w:ascii="Times New Roman" w:hAnsi="Times New Roman"/>
+                <w:color w:val="000000"/>
+                <w:sz w:val="22"/>
+              </w:rPr>
+              <w:t xml:space="preserve"> vào vở.</w:t>
             </w:r>
           </w:p>
         </w:tc>
@@ -4900,16 +5000,6 @@
       <w:r>
         <w:rPr>
           <w:rFonts w:ascii="Times New Roman" w:hAnsi="Times New Roman"/>
-          <w:b w:val="0"/>
-          <w:i w:val="0"/>
-          <w:color w:val="000000"/>
-          <w:sz w:val="26"/>
-        </w:rPr>
-        <w:t xml:space="preserve">  </w:t>
-      </w:r>
-      <w:r>
-        <w:rPr>
-          <w:rFonts w:ascii="Times New Roman" w:hAnsi="Times New Roman"/>
           <w:b/>
           <w:i w:val="0"/>
           <w:color w:val="000000"/>
@@ -4925,27 +5015,7 @@
           <w:color w:val="000000"/>
           <w:sz w:val="26"/>
         </w:rPr>
-        <w:t xml:space="preserve"> Nêu được ý nghĩa vật lý đặc trưng của nhiệt dung riêng </w:t>
-      </w:r>
-      <w:r>
-        <w:rPr>
-          <w:rFonts w:ascii="Times New Roman" w:hAnsi="Times New Roman"/>
-          <w:b w:val="0"/>
-          <w:i/>
-          <w:color w:val="000000"/>
-          <w:sz w:val="26"/>
-        </w:rPr>
-        <w:t>c</w:t>
-      </w:r>
-      <w:r>
-        <w:rPr>
-          <w:rFonts w:ascii="Times New Roman" w:hAnsi="Times New Roman"/>
-          <w:b w:val="0"/>
-          <w:i w:val="0"/>
-          <w:color w:val="000000"/>
-          <w:sz w:val="26"/>
-        </w:rPr>
-        <w:t xml:space="preserve"> của các chất khác nhau thông qua bảng số liệu thực nghiệm.</w:t>
+        <w:t xml:space="preserve"> HS nêu được khái niệm nhiệt dung riêng, ý nghĩa vật lý đặc trưng của nhiệt dung riêng đối với mỗi chất.</w:t>
       </w:r>
     </w:p>
     <w:p>
@@ -4965,22 +5035,12 @@
       <w:r>
         <w:rPr>
           <w:rFonts w:ascii="Times New Roman" w:hAnsi="Times New Roman"/>
-          <w:b w:val="0"/>
-          <w:i w:val="0"/>
-          <w:color w:val="000000"/>
-          <w:sz w:val="26"/>
-        </w:rPr>
-        <w:t xml:space="preserve">  </w:t>
-      </w:r>
-      <w:r>
-        <w:rPr>
-          <w:rFonts w:ascii="Times New Roman" w:hAnsi="Times New Roman"/>
           <w:b/>
           <w:i w:val="0"/>
           <w:color w:val="000000"/>
           <w:sz w:val="26"/>
         </w:rPr>
-        <w:t>Nội dung:</w:t>
+        <w:t>Sản phẩm:</w:t>
       </w:r>
       <w:r>
         <w:rPr>
@@ -4990,7 +5050,7 @@
           <w:color w:val="000000"/>
           <w:sz w:val="26"/>
         </w:rPr>
-        <w:t xml:space="preserve"> Phân tích bảng số liệu so sánh sự tăng nhiệt độ của nước và rượu.</w:t>
+        <w:t xml:space="preserve"> Câu trả lời Nhiệm vụ 5 trong Phiếu học tập.</w:t>
       </w:r>
     </w:p>
     <w:p>
@@ -5010,32 +5070,12 @@
       <w:r>
         <w:rPr>
           <w:rFonts w:ascii="Times New Roman" w:hAnsi="Times New Roman"/>
-          <w:b w:val="0"/>
-          <w:i w:val="0"/>
-          <w:color w:val="000000"/>
-          <w:sz w:val="26"/>
-        </w:rPr>
-        <w:t xml:space="preserve">  </w:t>
-      </w:r>
-      <w:r>
-        <w:rPr>
-          <w:rFonts w:ascii="Times New Roman" w:hAnsi="Times New Roman"/>
           <w:b/>
           <w:i w:val="0"/>
           <w:color w:val="000000"/>
           <w:sz w:val="26"/>
         </w:rPr>
-        <w:t>Sản phẩm:</w:t>
-      </w:r>
-      <w:r>
-        <w:rPr>
-          <w:rFonts w:ascii="Times New Roman" w:hAnsi="Times New Roman"/>
-          <w:b w:val="0"/>
-          <w:i w:val="0"/>
-          <w:color w:val="000000"/>
-          <w:sz w:val="26"/>
-        </w:rPr>
-        <w:t xml:space="preserve"> Giải thích được tại sao các chất khác nhau có tốc độ tăng nhiệt độ khác nhau khi nhận cùng nhiệt lượng.</w:t>
+        <w:t>Tiến trình dạy học:</w:t>
       </w:r>
     </w:p>
     <w:tbl>
@@ -5179,24 +5219,7 @@
                 <w:color w:val="000000"/>
                 <w:sz w:val="22"/>
               </w:rPr>
-              <w:t xml:space="preserve">GV chiếu bảng số liệu thực nghiệm đun nóng nước và rượu. Đặt câu hỏi: *"Với cùng khối lượng và nhận cùng nhiệt lượng, vì sao rượu nóng lên nhanh hơn nước? Con số nhiệt dung riêng của nước </w:t>
-            </w:r>
-            <w:r>
-              <w:rPr>
-                <w:rFonts w:ascii="Times New Roman" w:hAnsi="Times New Roman"/>
-                <w:i/>
-                <w:color w:val="000000"/>
-                <w:sz w:val="22"/>
-              </w:rPr>
-              <w:t>c_{nước} = 4200 J/kg.K</w:t>
-            </w:r>
-            <w:r>
-              <w:rPr>
-                <w:rFonts w:ascii="Times New Roman" w:hAnsi="Times New Roman"/>
-                <w:color w:val="000000"/>
-                <w:sz w:val="22"/>
-              </w:rPr>
-              <w:t xml:space="preserve"> cho biết điều gì?"*</w:t>
+              <w:t>GV chiếu bảng số liệu hoặc mô tả thí nghiệm đun nóng nước và rượu. Đặt câu hỏi Nhiệm vụ 5 trên PHT.</w:t>
             </w:r>
           </w:p>
         </w:tc>
@@ -5231,13 +5254,28 @@
               </w:rPr>
               <w:t>Tiếp nhận nhiệm vụ:</w:t>
             </w:r>
+          </w:p>
+          <w:p>
+            <w:pPr>
+              <w:spacing w:before="40" w:after="40" w:line="276" w:lineRule="auto"/>
+              <w:ind w:left="170" w:hanging="113"/>
+              <w:jc w:val="left"/>
+            </w:pPr>
             <w:r>
               <w:rPr>
                 <w:rFonts w:ascii="Times New Roman" w:hAnsi="Times New Roman"/>
                 <w:color w:val="000000"/>
                 <w:sz w:val="22"/>
               </w:rPr>
-              <w:t xml:space="preserve"> Học sinh tiếp nhận nhiệm vụ học tập từ giáo viên.</w:t>
+              <w:t xml:space="preserve">- </w:t>
+            </w:r>
+            <w:r>
+              <w:rPr>
+                <w:rFonts w:ascii="Times New Roman" w:hAnsi="Times New Roman"/>
+                <w:color w:val="000000"/>
+                <w:sz w:val="22"/>
+              </w:rPr>
+              <w:t>HS quan sát bảng số liệu đun nóng nước và rượu, nhận nhiệm vụ phân tích.</w:t>
             </w:r>
           </w:p>
         </w:tc>
@@ -5277,64 +5315,28 @@
               </w:rPr>
               <w:t>Theo dõi, hỗ trợ:</w:t>
             </w:r>
+          </w:p>
+          <w:p>
+            <w:pPr>
+              <w:spacing w:before="40" w:after="40" w:line="276" w:lineRule="auto"/>
+              <w:ind w:left="170" w:hanging="113"/>
+              <w:jc w:val="left"/>
+            </w:pPr>
             <w:r>
               <w:rPr>
                 <w:rFonts w:ascii="Times New Roman" w:hAnsi="Times New Roman"/>
                 <w:color w:val="000000"/>
                 <w:sz w:val="22"/>
               </w:rPr>
-              <w:t xml:space="preserve"> GV định hướng HS phân tích định nghĩa nhiệt dung riêng: lượng nhiệt cần thiết để làm </w:t>
-            </w:r>
-            <w:r>
-              <w:rPr>
-                <w:rFonts w:ascii="Times New Roman" w:hAnsi="Times New Roman"/>
-                <w:i/>
+              <w:t xml:space="preserve">- </w:t>
+            </w:r>
+            <w:r>
+              <w:rPr>
+                <w:rFonts w:ascii="Times New Roman" w:hAnsi="Times New Roman"/>
                 <w:color w:val="000000"/>
                 <w:sz w:val="22"/>
               </w:rPr>
-              <w:t>1 kg</w:t>
-            </w:r>
-            <w:r>
-              <w:rPr>
-                <w:rFonts w:ascii="Times New Roman" w:hAnsi="Times New Roman"/>
-                <w:color w:val="000000"/>
-                <w:sz w:val="22"/>
-              </w:rPr>
-              <w:t xml:space="preserve"> chất tăng thêm </w:t>
-            </w:r>
-            <w:r>
-              <w:rPr>
-                <w:rFonts w:ascii="Times New Roman" w:hAnsi="Times New Roman"/>
-                <w:i/>
-                <w:color w:val="000000"/>
-                <w:sz w:val="22"/>
-              </w:rPr>
-              <w:t>1 K</w:t>
-            </w:r>
-            <w:r>
-              <w:rPr>
-                <w:rFonts w:ascii="Times New Roman" w:hAnsi="Times New Roman"/>
-                <w:color w:val="000000"/>
-                <w:sz w:val="22"/>
-              </w:rPr>
-              <w:t xml:space="preserve"> hoặc </w:t>
-            </w:r>
-            <w:r>
-              <w:rPr>
-                <w:rFonts w:ascii="Times New Roman" w:hAnsi="Times New Roman"/>
-                <w:i/>
-                <w:color w:val="000000"/>
-                <w:sz w:val="22"/>
-              </w:rPr>
-              <w:t>1^°C</w:t>
-            </w:r>
-            <w:r>
-              <w:rPr>
-                <w:rFonts w:ascii="Times New Roman" w:hAnsi="Times New Roman"/>
-                <w:color w:val="000000"/>
-                <w:sz w:val="22"/>
-              </w:rPr>
-              <w:t>.</w:t>
+              <w:t>GV định hướng HS so sánh độ tăng nhiệt độ của rượu và nước để thấy đại lượng đặc trưng cho tính chất nhiệt của mỗi chất.</w:t>
             </w:r>
           </w:p>
         </w:tc>
@@ -5369,13 +5371,45 @@
               </w:rPr>
               <w:t>Thực hiện nhiệm vụ:</w:t>
             </w:r>
+          </w:p>
+          <w:p>
+            <w:pPr>
+              <w:spacing w:before="40" w:after="40" w:line="276" w:lineRule="auto"/>
+              <w:ind w:left="170" w:hanging="113"/>
+              <w:jc w:val="left"/>
+            </w:pPr>
             <w:r>
               <w:rPr>
                 <w:rFonts w:ascii="Times New Roman" w:hAnsi="Times New Roman"/>
                 <w:color w:val="000000"/>
                 <w:sz w:val="22"/>
               </w:rPr>
-              <w:t xml:space="preserve"> HS làm việc nhóm nhỏ để phân tích ý nghĩa của nhiệt dung riêng và giải thích hiện tượng thực tế (khí hậu ven biển mát mẻ hơn trong đất liền).</w:t>
+              <w:t xml:space="preserve">- </w:t>
+            </w:r>
+            <w:r>
+              <w:rPr>
+                <w:rFonts w:ascii="Times New Roman" w:hAnsi="Times New Roman"/>
+                <w:color w:val="000000"/>
+                <w:sz w:val="22"/>
+              </w:rPr>
+              <w:t xml:space="preserve">HS thảo luận nhóm đôi giải thích vì sao rượu tăng nhiệt độ nhanh hơn và rút ra khái niệm nhiệt dung riêng </w:t>
+            </w:r>
+            <w:r>
+              <w:rPr>
+                <w:rFonts w:ascii="Times New Roman" w:hAnsi="Times New Roman"/>
+                <w:i/>
+                <w:color w:val="000000"/>
+                <w:sz w:val="22"/>
+              </w:rPr>
+              <w:t>c</w:t>
+            </w:r>
+            <w:r>
+              <w:rPr>
+                <w:rFonts w:ascii="Times New Roman" w:hAnsi="Times New Roman"/>
+                <w:color w:val="000000"/>
+                <w:sz w:val="22"/>
+              </w:rPr>
+              <w:t>.</w:t>
             </w:r>
           </w:p>
         </w:tc>
@@ -5415,13 +5449,45 @@
               </w:rPr>
               <w:t>Tổ chức báo cáo:</w:t>
             </w:r>
+          </w:p>
+          <w:p>
+            <w:pPr>
+              <w:spacing w:before="40" w:after="40" w:line="276" w:lineRule="auto"/>
+              <w:ind w:left="170" w:hanging="113"/>
+              <w:jc w:val="left"/>
+            </w:pPr>
             <w:r>
               <w:rPr>
                 <w:rFonts w:ascii="Times New Roman" w:hAnsi="Times New Roman"/>
                 <w:color w:val="000000"/>
                 <w:sz w:val="22"/>
               </w:rPr>
-              <w:t xml:space="preserve"> GV gọi đại diện nhóm trình bày ý nghĩa vật lý của nhiệt dung riêng.</w:t>
+              <w:t xml:space="preserve">- </w:t>
+            </w:r>
+            <w:r>
+              <w:rPr>
+                <w:rFonts w:ascii="Times New Roman" w:hAnsi="Times New Roman"/>
+                <w:color w:val="000000"/>
+                <w:sz w:val="22"/>
+              </w:rPr>
+              <w:t xml:space="preserve">GV gọi đại diện nhóm báo cáo định nghĩa nhiệt dung riêng và ý nghĩa con số </w:t>
+            </w:r>
+            <w:r>
+              <w:rPr>
+                <w:rFonts w:ascii="Times New Roman" w:hAnsi="Times New Roman"/>
+                <w:i/>
+                <w:color w:val="000000"/>
+                <w:sz w:val="22"/>
+              </w:rPr>
+              <w:t>c_{nước} = 4200 J/kg.K</w:t>
+            </w:r>
+            <w:r>
+              <w:rPr>
+                <w:rFonts w:ascii="Times New Roman" w:hAnsi="Times New Roman"/>
+                <w:color w:val="000000"/>
+                <w:sz w:val="22"/>
+              </w:rPr>
+              <w:t>.</w:t>
             </w:r>
           </w:p>
         </w:tc>
@@ -5456,13 +5522,28 @@
               </w:rPr>
               <w:t>Báo cáo, thảo luận:</w:t>
             </w:r>
+          </w:p>
+          <w:p>
+            <w:pPr>
+              <w:spacing w:before="40" w:after="40" w:line="276" w:lineRule="auto"/>
+              <w:ind w:left="170" w:hanging="113"/>
+              <w:jc w:val="left"/>
+            </w:pPr>
             <w:r>
               <w:rPr>
                 <w:rFonts w:ascii="Times New Roman" w:hAnsi="Times New Roman"/>
                 <w:color w:val="000000"/>
                 <w:sz w:val="22"/>
               </w:rPr>
-              <w:t xml:space="preserve"> Đại diện trình bày định nghĩa, đơn vị </w:t>
+              <w:t xml:space="preserve">- </w:t>
+            </w:r>
+            <w:r>
+              <w:rPr>
+                <w:rFonts w:ascii="Times New Roman" w:hAnsi="Times New Roman"/>
+                <w:color w:val="000000"/>
+                <w:sz w:val="22"/>
+              </w:rPr>
+              <w:t xml:space="preserve">HS phát biểu định nghĩa và nêu ý nghĩa: cần </w:t>
             </w:r>
             <w:r>
               <w:rPr>
@@ -5471,7 +5552,7 @@
                 <w:color w:val="000000"/>
                 <w:sz w:val="22"/>
               </w:rPr>
-              <w:t>J/kg.K</w:t>
+              <w:t>4200 J</w:t>
             </w:r>
             <w:r>
               <w:rPr>
@@ -5479,7 +5560,58 @@
                 <w:color w:val="000000"/>
                 <w:sz w:val="22"/>
               </w:rPr>
-              <w:t xml:space="preserve"> và vai trò điều hòa khí hậu của nước do có nhiệt dung riêng rất lớn.</w:t>
+              <w:t xml:space="preserve"> để làm </w:t>
+            </w:r>
+            <w:r>
+              <w:rPr>
+                <w:rFonts w:ascii="Times New Roman" w:hAnsi="Times New Roman"/>
+                <w:i/>
+                <w:color w:val="000000"/>
+                <w:sz w:val="22"/>
+              </w:rPr>
+              <w:t>1 kg</w:t>
+            </w:r>
+            <w:r>
+              <w:rPr>
+                <w:rFonts w:ascii="Times New Roman" w:hAnsi="Times New Roman"/>
+                <w:color w:val="000000"/>
+                <w:sz w:val="22"/>
+              </w:rPr>
+              <w:t xml:space="preserve"> nước tăng thêm </w:t>
+            </w:r>
+            <w:r>
+              <w:rPr>
+                <w:rFonts w:ascii="Times New Roman" w:hAnsi="Times New Roman"/>
+                <w:i/>
+                <w:color w:val="000000"/>
+                <w:sz w:val="22"/>
+              </w:rPr>
+              <w:t>1 K</w:t>
+            </w:r>
+            <w:r>
+              <w:rPr>
+                <w:rFonts w:ascii="Times New Roman" w:hAnsi="Times New Roman"/>
+                <w:color w:val="000000"/>
+                <w:sz w:val="22"/>
+              </w:rPr>
+              <w:t xml:space="preserve"> hoặc </w:t>
+            </w:r>
+            <w:r>
+              <w:rPr>
+                <w:rFonts w:ascii="Times New Roman" w:hAnsi="Times New Roman"/>
+                <w:i/>
+                <w:color w:val="000000"/>
+                <w:sz w:val="22"/>
+              </w:rPr>
+              <w:t>1^° C</w:t>
+            </w:r>
+            <w:r>
+              <w:rPr>
+                <w:rFonts w:ascii="Times New Roman" w:hAnsi="Times New Roman"/>
+                <w:color w:val="000000"/>
+                <w:sz w:val="22"/>
+              </w:rPr>
+              <w:t>.</w:t>
             </w:r>
           </w:p>
         </w:tc>
@@ -5540,7 +5672,24 @@
                 <w:color w:val="000000"/>
                 <w:sz w:val="22"/>
               </w:rPr>
-              <w:t>GV chốt khái niệm nhiệt dung riêng là đại lượng đặc trưng cho chất.</w:t>
+              <w:t xml:space="preserve">GV chuẩn hóa khái niệm nhiệt dung riêng là đại lượng đặc trưng của chất, đơn vị </w:t>
+            </w:r>
+            <w:r>
+              <w:rPr>
+                <w:rFonts w:ascii="Times New Roman" w:hAnsi="Times New Roman"/>
+                <w:i/>
+                <w:color w:val="000000"/>
+                <w:sz w:val="22"/>
+              </w:rPr>
+              <w:t>J/kg.K</w:t>
+            </w:r>
+            <w:r>
+              <w:rPr>
+                <w:rFonts w:ascii="Times New Roman" w:hAnsi="Times New Roman"/>
+                <w:color w:val="000000"/>
+                <w:sz w:val="22"/>
+              </w:rPr>
+              <w:t>.</w:t>
             </w:r>
           </w:p>
         </w:tc>
@@ -5575,19 +5724,51 @@
               </w:rPr>
               <w:t>Ghi nhận kiến thức:</w:t>
             </w:r>
+          </w:p>
+          <w:p>
+            <w:pPr>
+              <w:spacing w:before="40" w:after="40" w:line="276" w:lineRule="auto"/>
+              <w:ind w:left="170" w:hanging="113"/>
+              <w:jc w:val="left"/>
+            </w:pPr>
             <w:r>
               <w:rPr>
                 <w:rFonts w:ascii="Times New Roman" w:hAnsi="Times New Roman"/>
                 <w:color w:val="000000"/>
                 <w:sz w:val="22"/>
               </w:rPr>
-              <w:t xml:space="preserve"> Học sinh lắng nghe nhận xét, đối chiếu lời giải và ghi chép kiến thức cốt lõi.</w:t>
+              <w:t xml:space="preserve">- </w:t>
+            </w:r>
+            <w:r>
+              <w:rPr>
+                <w:rFonts w:ascii="Times New Roman" w:hAnsi="Times New Roman"/>
+                <w:color w:val="000000"/>
+                <w:sz w:val="22"/>
+              </w:rPr>
+              <w:t>HS ghi nhận khái niệm nhiệt dung riêng và ý nghĩa vật lý của nó vào vở.</w:t>
             </w:r>
           </w:p>
         </w:tc>
       </w:tr>
     </w:tbl>
     <w:p/>
+    <w:p>
+      <w:pPr>
+        <w:spacing w:before="120" w:after="120" w:line="312" w:lineRule="auto"/>
+        <w:ind w:left="0" w:firstLine="567"/>
+        <w:jc w:val="both"/>
+      </w:pPr>
+      <w:r>
+        <w:rPr>
+          <w:rFonts w:ascii="Times New Roman" w:hAnsi="Times New Roman"/>
+          <w:b w:val="0"/>
+          <w:i w:val="0"/>
+          <w:color w:val="000000"/>
+          <w:sz w:val="26"/>
+        </w:rPr>
+        <w:t>---</w:t>
+      </w:r>
+    </w:p>
     <w:p>
       <w:pPr>
         <w:pStyle w:val="Heading2"/>
@@ -5638,7 +5819,42 @@
           <w:color w:val="000000"/>
           <w:sz w:val="26"/>
         </w:rPr>
-        <w:t xml:space="preserve"> Củng cố công thức tính </w:t>
+        <w:t xml:space="preserve"> HS vận dụng thành thạo Nguyên lí I và biểu thức quy ước dấu để giải bài toán xilanh pit-tông.</w:t>
+      </w:r>
+    </w:p>
+    <w:p>
+      <w:pPr>
+        <w:spacing w:before="60" w:after="60" w:line="312" w:lineRule="auto"/>
+        <w:ind w:left="283" w:hanging="170"/>
+        <w:jc w:val="both"/>
+      </w:pPr>
+      <w:r>
+        <w:rPr>
+          <w:rFonts w:ascii="Times New Roman" w:hAnsi="Times New Roman"/>
+          <w:color w:val="000000"/>
+          <w:sz w:val="26"/>
+        </w:rPr>
+        <w:t xml:space="preserve">- </w:t>
+      </w:r>
+      <w:r>
+        <w:rPr>
+          <w:rFonts w:ascii="Times New Roman" w:hAnsi="Times New Roman"/>
+          <w:b/>
+          <w:i w:val="0"/>
+          <w:color w:val="000000"/>
+          <w:sz w:val="26"/>
+        </w:rPr>
+        <w:t>Nội dung:</w:t>
+      </w:r>
+      <w:r>
+        <w:rPr>
+          <w:rFonts w:ascii="Times New Roman" w:hAnsi="Times New Roman"/>
+          <w:b w:val="0"/>
+          <w:i w:val="0"/>
+          <w:color w:val="000000"/>
+          <w:sz w:val="26"/>
+        </w:rPr>
+        <w:t xml:space="preserve"> GV yêu cầu học sinh giải Nhiệm vụ 6 trong Phiếu học tập (lượng khí nhận nhiệt lượng </w:t>
       </w:r>
       <w:r>
         <w:rPr>
@@ -5648,7 +5864,7 @@
           <w:color w:val="000000"/>
           <w:sz w:val="26"/>
         </w:rPr>
-        <w:t>Δ U = A + Q</w:t>
+        <w:t>Q = 200 J</w:t>
       </w:r>
       <w:r>
         <w:rPr>
@@ -5658,7 +5874,7 @@
           <w:color w:val="000000"/>
           <w:sz w:val="26"/>
         </w:rPr>
-        <w:t xml:space="preserve"> và </w:t>
+        <w:t xml:space="preserve"> và giãn nở thực hiện công </w:t>
       </w:r>
       <w:r>
         <w:rPr>
@@ -5668,7 +5884,7 @@
           <w:color w:val="000000"/>
           <w:sz w:val="26"/>
         </w:rPr>
-        <w:t>Q = mcΔ t</w:t>
+        <w:t>A' = 120 J</w:t>
       </w:r>
       <w:r>
         <w:rPr>
@@ -5678,7 +5894,7 @@
           <w:color w:val="000000"/>
           <w:sz w:val="26"/>
         </w:rPr>
-        <w:t xml:space="preserve"> qua các bài tập định lượng.</w:t>
+        <w:t>).</w:t>
       </w:r>
     </w:p>
     <w:p>
@@ -5713,7 +5929,32 @@
           <w:color w:val="000000"/>
           <w:sz w:val="26"/>
         </w:rPr>
-        <w:t xml:space="preserve"> Bài giải chi tiết của HS trong vở.</w:t>
+        <w:t xml:space="preserve"> Bài giải chi tiết Nhiệm vụ 6 trong PHT của học sinh.</w:t>
+      </w:r>
+    </w:p>
+    <w:p>
+      <w:pPr>
+        <w:spacing w:before="60" w:after="60" w:line="312" w:lineRule="auto"/>
+        <w:ind w:left="283" w:hanging="170"/>
+        <w:jc w:val="both"/>
+      </w:pPr>
+      <w:r>
+        <w:rPr>
+          <w:rFonts w:ascii="Times New Roman" w:hAnsi="Times New Roman"/>
+          <w:color w:val="000000"/>
+          <w:sz w:val="26"/>
+        </w:rPr>
+        <w:t xml:space="preserve">- </w:t>
+      </w:r>
+      <w:r>
+        <w:rPr>
+          <w:rFonts w:ascii="Times New Roman" w:hAnsi="Times New Roman"/>
+          <w:b/>
+          <w:i w:val="0"/>
+          <w:color w:val="000000"/>
+          <w:sz w:val="26"/>
+        </w:rPr>
+        <w:t>Tiến trình dạy học:</w:t>
       </w:r>
     </w:p>
     <w:tbl>
@@ -5857,58 +6098,7 @@
                 <w:color w:val="000000"/>
                 <w:sz w:val="22"/>
               </w:rPr>
-              <w:t xml:space="preserve">GV giao nhiệm vụ làm bài tập Vận dụng ĐVKT 1 (tính </w:t>
-            </w:r>
-            <w:r>
-              <w:rPr>
-                <w:rFonts w:ascii="Times New Roman" w:hAnsi="Times New Roman"/>
-                <w:i/>
-                <w:color w:val="000000"/>
-                <w:sz w:val="22"/>
-              </w:rPr>
-              <w:t>Δ U</w:t>
-            </w:r>
-            <w:r>
-              <w:rPr>
-                <w:rFonts w:ascii="Times New Roman" w:hAnsi="Times New Roman"/>
-                <w:color w:val="000000"/>
-                <w:sz w:val="22"/>
-              </w:rPr>
-              <w:t xml:space="preserve"> khí trong xilanh nhận nhiệt </w:t>
-            </w:r>
-            <w:r>
-              <w:rPr>
-                <w:rFonts w:ascii="Times New Roman" w:hAnsi="Times New Roman"/>
-                <w:i/>
-                <w:color w:val="000000"/>
-                <w:sz w:val="22"/>
-              </w:rPr>
-              <w:t>200 J</w:t>
-            </w:r>
-            <w:r>
-              <w:rPr>
-                <w:rFonts w:ascii="Times New Roman" w:hAnsi="Times New Roman"/>
-                <w:color w:val="000000"/>
-                <w:sz w:val="22"/>
-              </w:rPr>
-              <w:t xml:space="preserve"> và sinh công </w:t>
-            </w:r>
-            <w:r>
-              <w:rPr>
-                <w:rFonts w:ascii="Times New Roman" w:hAnsi="Times New Roman"/>
-                <w:i/>
-                <w:color w:val="000000"/>
-                <w:sz w:val="22"/>
-              </w:rPr>
-              <w:t>120 J</w:t>
-            </w:r>
-            <w:r>
-              <w:rPr>
-                <w:rFonts w:ascii="Times New Roman" w:hAnsi="Times New Roman"/>
-                <w:color w:val="000000"/>
-                <w:sz w:val="22"/>
-              </w:rPr>
-              <w:t>).</w:t>
+              <w:t>GV yêu cầu học sinh làm việc cá nhân hoàn thành bài tập giải Nhiệm vụ 6 trong PHT.</w:t>
             </w:r>
           </w:p>
         </w:tc>
@@ -5943,13 +6133,28 @@
               </w:rPr>
               <w:t>Tiếp nhận nhiệm vụ:</w:t>
             </w:r>
+          </w:p>
+          <w:p>
+            <w:pPr>
+              <w:spacing w:before="40" w:after="40" w:line="276" w:lineRule="auto"/>
+              <w:ind w:left="170" w:hanging="113"/>
+              <w:jc w:val="left"/>
+            </w:pPr>
             <w:r>
               <w:rPr>
                 <w:rFonts w:ascii="Times New Roman" w:hAnsi="Times New Roman"/>
                 <w:color w:val="000000"/>
                 <w:sz w:val="22"/>
               </w:rPr>
-              <w:t xml:space="preserve"> Học sinh tiếp nhận nhiệm vụ học tập từ giáo viên.</w:t>
+              <w:t xml:space="preserve">- </w:t>
+            </w:r>
+            <w:r>
+              <w:rPr>
+                <w:rFonts w:ascii="Times New Roman" w:hAnsi="Times New Roman"/>
+                <w:color w:val="000000"/>
+                <w:sz w:val="22"/>
+              </w:rPr>
+              <w:t>HS đọc đề bài Nhiệm vụ 6 và chuẩn bị nháp để tính toán.</w:t>
             </w:r>
           </w:p>
         </w:tc>
@@ -5989,13 +6194,62 @@
               </w:rPr>
               <w:t>Theo dõi, hỗ trợ:</w:t>
             </w:r>
+          </w:p>
+          <w:p>
+            <w:pPr>
+              <w:spacing w:before="40" w:after="40" w:line="276" w:lineRule="auto"/>
+              <w:ind w:left="170" w:hanging="113"/>
+              <w:jc w:val="left"/>
+            </w:pPr>
             <w:r>
               <w:rPr>
                 <w:rFonts w:ascii="Times New Roman" w:hAnsi="Times New Roman"/>
                 <w:color w:val="000000"/>
                 <w:sz w:val="22"/>
               </w:rPr>
-              <w:t xml:space="preserve"> Giáo viên theo dõi, quan sát và hỗ trợ gợi ý các nhóm khi cần thiết.</w:t>
+              <w:t xml:space="preserve">- </w:t>
+            </w:r>
+            <w:r>
+              <w:rPr>
+                <w:rFonts w:ascii="Times New Roman" w:hAnsi="Times New Roman"/>
+                <w:color w:val="000000"/>
+                <w:sz w:val="22"/>
+              </w:rPr>
+              <w:t xml:space="preserve">GV đi quanh lớp, quan sát, hướng dẫn HS xác định dấu của các đại lượng: khí nhận nhiệt </w:t>
+            </w:r>
+            <w:r>
+              <w:rPr>
+                <w:rFonts w:ascii="Times New Roman" w:hAnsi="Times New Roman"/>
+                <w:i/>
+                <w:color w:val="000000"/>
+                <w:sz w:val="22"/>
+              </w:rPr>
+              <w:t>Q &gt; 0</w:t>
+            </w:r>
+            <w:r>
+              <w:rPr>
+                <w:rFonts w:ascii="Times New Roman" w:hAnsi="Times New Roman"/>
+                <w:color w:val="000000"/>
+                <w:sz w:val="22"/>
+              </w:rPr>
+              <w:t xml:space="preserve">; khí sinh công </w:t>
+            </w:r>
+            <w:r>
+              <w:rPr>
+                <w:rFonts w:ascii="Times New Roman" w:hAnsi="Times New Roman"/>
+                <w:i/>
+                <w:color w:val="000000"/>
+                <w:sz w:val="22"/>
+              </w:rPr>
+              <w:t>A &lt; 0</w:t>
+            </w:r>
+            <w:r>
+              <w:rPr>
+                <w:rFonts w:ascii="Times New Roman" w:hAnsi="Times New Roman"/>
+                <w:color w:val="000000"/>
+                <w:sz w:val="22"/>
+              </w:rPr>
+              <w:t>.</w:t>
             </w:r>
           </w:p>
         </w:tc>
@@ -6051,7 +6305,7 @@
                 <w:color w:val="000000"/>
                 <w:sz w:val="22"/>
               </w:rPr>
-              <w:t xml:space="preserve">HS áp dụng quy ước dấu: khí nhận nhiệt </w:t>
+              <w:t xml:space="preserve">HS làm bài cá nhân vào PHT: </w:t>
             </w:r>
             <w:r>
               <w:rPr>
@@ -6060,7 +6314,7 @@
                 <w:color w:val="000000"/>
                 <w:sz w:val="22"/>
               </w:rPr>
-              <w:t>Q = 200 J &gt; 0</w:t>
+              <w:t>Q = +200 J</w:t>
             </w:r>
             <w:r>
               <w:rPr>
@@ -6068,7 +6322,7 @@
                 <w:color w:val="000000"/>
                 <w:sz w:val="22"/>
               </w:rPr>
-              <w:t xml:space="preserve">; khí thực hiện công </w:t>
+              <w:t xml:space="preserve">, </w:t>
             </w:r>
             <w:r>
               <w:rPr>
@@ -6077,7 +6331,7 @@
                 <w:color w:val="000000"/>
                 <w:sz w:val="22"/>
               </w:rPr>
-              <w:t>A = -120 J &lt; 0</w:t>
+              <w:t>A = -120 J</w:t>
             </w:r>
             <w:r>
               <w:rPr>
@@ -6085,30 +6339,7 @@
                 <w:color w:val="000000"/>
                 <w:sz w:val="22"/>
               </w:rPr>
-              <w:t>.</w:t>
-            </w:r>
-          </w:p>
-          <w:p>
-            <w:pPr>
-              <w:spacing w:before="40" w:after="40" w:line="276" w:lineRule="auto"/>
-              <w:ind w:left="170" w:hanging="113"/>
-              <w:jc w:val="left"/>
-            </w:pPr>
-            <w:r>
-              <w:rPr>
-                <w:rFonts w:ascii="Times New Roman" w:hAnsi="Times New Roman"/>
-                <w:color w:val="000000"/>
-                <w:sz w:val="22"/>
-              </w:rPr>
-              <w:t xml:space="preserve">- </w:t>
-            </w:r>
-            <w:r>
-              <w:rPr>
-                <w:rFonts w:ascii="Times New Roman" w:hAnsi="Times New Roman"/>
-                <w:color w:val="000000"/>
-                <w:sz w:val="22"/>
-              </w:rPr>
-              <w:t xml:space="preserve">Tính toán </w:t>
+              <w:t xml:space="preserve">. Tính </w:t>
             </w:r>
             <w:r>
               <w:rPr>
@@ -6117,7 +6348,7 @@
                 <w:color w:val="000000"/>
                 <w:sz w:val="22"/>
               </w:rPr>
-              <w:t>Δ U = A + Q</w:t>
+              <w:t>Δ U = A + Q = 80 J</w:t>
             </w:r>
             <w:r>
               <w:rPr>
@@ -6165,13 +6396,28 @@
               </w:rPr>
               <w:t>Tổ chức báo cáo:</w:t>
             </w:r>
+          </w:p>
+          <w:p>
+            <w:pPr>
+              <w:spacing w:before="40" w:after="40" w:line="276" w:lineRule="auto"/>
+              <w:ind w:left="170" w:hanging="113"/>
+              <w:jc w:val="left"/>
+            </w:pPr>
             <w:r>
               <w:rPr>
                 <w:rFonts w:ascii="Times New Roman" w:hAnsi="Times New Roman"/>
                 <w:color w:val="000000"/>
                 <w:sz w:val="22"/>
               </w:rPr>
-              <w:t xml:space="preserve"> Giáo viên điều hành, gọi đại diện báo cáo kết quả, tổ chức nhận xét phản biện chéo giữa các học sinh.</w:t>
+              <w:t xml:space="preserve">- </w:t>
+            </w:r>
+            <w:r>
+              <w:rPr>
+                <w:rFonts w:ascii="Times New Roman" w:hAnsi="Times New Roman"/>
+                <w:color w:val="000000"/>
+                <w:sz w:val="22"/>
+              </w:rPr>
+              <w:t>GV gọi 1 học sinh lên bảng trình bày lời giải chi tiết và lý giải việc xác định dấu.</w:t>
             </w:r>
           </w:p>
         </w:tc>
@@ -6227,64 +6473,7 @@
                 <w:color w:val="000000"/>
                 <w:sz w:val="22"/>
               </w:rPr>
-              <w:t>1 HS lên bảng trình bày bài giải.</w:t>
-            </w:r>
-          </w:p>
-          <w:p>
-            <w:pPr>
-              <w:spacing w:before="40" w:after="40" w:line="276" w:lineRule="auto"/>
-              <w:ind w:left="170" w:hanging="113"/>
-              <w:jc w:val="left"/>
-            </w:pPr>
-            <w:r>
-              <w:rPr>
-                <w:rFonts w:ascii="Times New Roman" w:hAnsi="Times New Roman"/>
-                <w:color w:val="000000"/>
-                <w:sz w:val="22"/>
-              </w:rPr>
-              <w:t xml:space="preserve">- </w:t>
-            </w:r>
-            <w:r>
-              <w:rPr>
-                <w:rFonts w:ascii="Times New Roman" w:hAnsi="Times New Roman"/>
-                <w:color w:val="000000"/>
-                <w:sz w:val="22"/>
-              </w:rPr>
-              <w:t xml:space="preserve">HS dưới lớp nhận xét dấu của </w:t>
-            </w:r>
-            <w:r>
-              <w:rPr>
-                <w:rFonts w:ascii="Times New Roman" w:hAnsi="Times New Roman"/>
-                <w:i/>
-                <w:color w:val="000000"/>
-                <w:sz w:val="22"/>
-              </w:rPr>
-              <w:t>A</w:t>
-            </w:r>
-            <w:r>
-              <w:rPr>
-                <w:rFonts w:ascii="Times New Roman" w:hAnsi="Times New Roman"/>
-                <w:color w:val="000000"/>
-                <w:sz w:val="22"/>
-              </w:rPr>
-              <w:t xml:space="preserve"> và </w:t>
-            </w:r>
-            <w:r>
-              <w:rPr>
-                <w:rFonts w:ascii="Times New Roman" w:hAnsi="Times New Roman"/>
-                <w:i/>
-                <w:color w:val="000000"/>
-                <w:sz w:val="22"/>
-              </w:rPr>
-              <w:t>Q</w:t>
-            </w:r>
-            <w:r>
-              <w:rPr>
-                <w:rFonts w:ascii="Times New Roman" w:hAnsi="Times New Roman"/>
-                <w:color w:val="000000"/>
-                <w:sz w:val="22"/>
-              </w:rPr>
-              <w:t>.</w:t>
+              <w:t>HS trình bày lời giải trên bảng, các học sinh khác nhận xét bài làm của bạn.</w:t>
             </w:r>
           </w:p>
         </w:tc>
@@ -6345,7 +6534,7 @@
                 <w:color w:val="000000"/>
                 <w:sz w:val="22"/>
               </w:rPr>
-              <w:t xml:space="preserve">GV chuẩn hóa đáp án: </w:t>
+              <w:t xml:space="preserve">GV chốt lời giải chuẩn: Độ biến thiên nội năng </w:t>
             </w:r>
             <w:r>
               <w:rPr>
@@ -6354,7 +6543,7 @@
                 <w:color w:val="000000"/>
                 <w:sz w:val="22"/>
               </w:rPr>
-              <w:t>Δ U = 200 - 120 = 80 J</w:t>
+              <w:t>Δ U = 80 J</w:t>
             </w:r>
             <w:r>
               <w:rPr>
@@ -6362,7 +6551,7 @@
                 <w:color w:val="000000"/>
                 <w:sz w:val="22"/>
               </w:rPr>
-              <w:t xml:space="preserve">. Nội năng khí tăng </w:t>
+              <w:t xml:space="preserve">. Nội năng của khí tăng </w:t>
             </w:r>
             <w:r>
               <w:rPr>
@@ -6414,13 +6603,28 @@
               </w:rPr>
               <w:t>Ghi nhận kiến thức:</w:t>
             </w:r>
+          </w:p>
+          <w:p>
+            <w:pPr>
+              <w:spacing w:before="40" w:after="40" w:line="276" w:lineRule="auto"/>
+              <w:ind w:left="170" w:hanging="113"/>
+              <w:jc w:val="left"/>
+            </w:pPr>
             <w:r>
               <w:rPr>
                 <w:rFonts w:ascii="Times New Roman" w:hAnsi="Times New Roman"/>
                 <w:color w:val="000000"/>
                 <w:sz w:val="22"/>
               </w:rPr>
-              <w:t xml:space="preserve"> Học sinh đối chiếu, sửa đổi kết quả bài làm và ghi nhận kiến thức cốt lõi vào vở.</w:t>
+              <w:t xml:space="preserve">- </w:t>
+            </w:r>
+            <w:r>
+              <w:rPr>
+                <w:rFonts w:ascii="Times New Roman" w:hAnsi="Times New Roman"/>
+                <w:color w:val="000000"/>
+                <w:sz w:val="22"/>
+              </w:rPr>
+              <w:t>HS đối chiếu bài làm, ghi lời giải chuẩn vào phiếu học tập và vở.</w:t>
             </w:r>
           </w:p>
         </w:tc>
@@ -6494,7 +6698,62 @@
           <w:color w:val="000000"/>
           <w:sz w:val="26"/>
         </w:rPr>
-        <w:t xml:space="preserve"> Vận dụng công thức nhiệt lượng giải quyết bài toán đun ấm nhôm chứa nước sôi thực tế.</w:t>
+        <w:t xml:space="preserve"> HS vận dụng công thức tính nhiệt lượng </w:t>
+      </w:r>
+      <w:r>
+        <w:rPr>
+          <w:rFonts w:ascii="Times New Roman" w:hAnsi="Times New Roman"/>
+          <w:b w:val="0"/>
+          <w:i/>
+          <w:color w:val="000000"/>
+          <w:sz w:val="26"/>
+        </w:rPr>
+        <w:t>Q = mcΔ t</w:t>
+      </w:r>
+      <w:r>
+        <w:rPr>
+          <w:rFonts w:ascii="Times New Roman" w:hAnsi="Times New Roman"/>
+          <w:b w:val="0"/>
+          <w:i w:val="0"/>
+          <w:color w:val="000000"/>
+          <w:sz w:val="26"/>
+        </w:rPr>
+        <w:t xml:space="preserve"> để tính toán thực tế cho ấm nước và liên hệ ứng dụng địa lý.</w:t>
+      </w:r>
+    </w:p>
+    <w:p>
+      <w:pPr>
+        <w:spacing w:before="60" w:after="60" w:line="312" w:lineRule="auto"/>
+        <w:ind w:left="283" w:hanging="170"/>
+        <w:jc w:val="both"/>
+      </w:pPr>
+      <w:r>
+        <w:rPr>
+          <w:rFonts w:ascii="Times New Roman" w:hAnsi="Times New Roman"/>
+          <w:color w:val="000000"/>
+          <w:sz w:val="26"/>
+        </w:rPr>
+        <w:t xml:space="preserve">- </w:t>
+      </w:r>
+      <w:r>
+        <w:rPr>
+          <w:rFonts w:ascii="Times New Roman" w:hAnsi="Times New Roman"/>
+          <w:b/>
+          <w:i w:val="0"/>
+          <w:color w:val="000000"/>
+          <w:sz w:val="26"/>
+        </w:rPr>
+        <w:t>Nội dung:</w:t>
+      </w:r>
+      <w:r>
+        <w:rPr>
+          <w:rFonts w:ascii="Times New Roman" w:hAnsi="Times New Roman"/>
+          <w:b w:val="0"/>
+          <w:i w:val="0"/>
+          <w:color w:val="000000"/>
+          <w:sz w:val="26"/>
+        </w:rPr>
+        <w:t xml:space="preserve"> GV giao Nhiệm vụ 7 (tính nhiệt lượng đun ấm nhôm chứa nước) và hướng dẫn HS tự đọc phần mở rộng Nhiệm vụ 8, 9 ở nhà.</w:t>
       </w:r>
     </w:p>
     <w:p>
@@ -6529,7 +6788,32 @@
           <w:color w:val="000000"/>
           <w:sz w:val="26"/>
         </w:rPr>
-        <w:t xml:space="preserve"> Lời giải Nhiệm vụ 4 trong PHT.</w:t>
+        <w:t xml:space="preserve"> Bài giải Nhiệm vụ 7 trong Phiếu học tập của học sinh.</w:t>
+      </w:r>
+    </w:p>
+    <w:p>
+      <w:pPr>
+        <w:spacing w:before="60" w:after="60" w:line="312" w:lineRule="auto"/>
+        <w:ind w:left="283" w:hanging="170"/>
+        <w:jc w:val="both"/>
+      </w:pPr>
+      <w:r>
+        <w:rPr>
+          <w:rFonts w:ascii="Times New Roman" w:hAnsi="Times New Roman"/>
+          <w:color w:val="000000"/>
+          <w:sz w:val="26"/>
+        </w:rPr>
+        <w:t xml:space="preserve">- </w:t>
+      </w:r>
+      <w:r>
+        <w:rPr>
+          <w:rFonts w:ascii="Times New Roman" w:hAnsi="Times New Roman"/>
+          <w:b/>
+          <w:i w:val="0"/>
+          <w:color w:val="000000"/>
+          <w:sz w:val="26"/>
+        </w:rPr>
+        <w:t>Tiến trình dạy học:</w:t>
       </w:r>
     </w:p>
     <w:tbl>
@@ -6673,30 +6957,7 @@
                 <w:color w:val="000000"/>
                 <w:sz w:val="22"/>
               </w:rPr>
-              <w:t>GV yêu cầu HS giải nhanh bài toán đun ấm nhôm chứa nước sôi ở Nhiệm vụ 4.</w:t>
-            </w:r>
-          </w:p>
-          <w:p>
-            <w:pPr>
-              <w:spacing w:before="40" w:after="40" w:line="276" w:lineRule="auto"/>
-              <w:ind w:left="170" w:hanging="113"/>
-              <w:jc w:val="left"/>
-            </w:pPr>
-            <w:r>
-              <w:rPr>
-                <w:rFonts w:ascii="Times New Roman" w:hAnsi="Times New Roman"/>
-                <w:color w:val="000000"/>
-                <w:sz w:val="22"/>
-              </w:rPr>
-              <w:t xml:space="preserve">- </w:t>
-            </w:r>
-            <w:r>
-              <w:rPr>
-                <w:rFonts w:ascii="Times New Roman" w:hAnsi="Times New Roman"/>
-                <w:color w:val="000000"/>
-                <w:sz w:val="22"/>
-              </w:rPr>
-              <w:t>Hướng dẫn đọc phần đọc thêm về James Watt và khí hậu ven biển.</w:t>
+              <w:t>GV giao nhiệm vụ giải bài toán đun ấm nước nhôm trong PHT và yêu cầu HS đọc phần STEM mở rộng.</w:t>
             </w:r>
           </w:p>
         </w:tc>
@@ -6731,13 +6992,28 @@
               </w:rPr>
               <w:t>Tiếp nhận nhiệm vụ:</w:t>
             </w:r>
+          </w:p>
+          <w:p>
+            <w:pPr>
+              <w:spacing w:before="40" w:after="40" w:line="276" w:lineRule="auto"/>
+              <w:ind w:left="170" w:hanging="113"/>
+              <w:jc w:val="left"/>
+            </w:pPr>
             <w:r>
               <w:rPr>
                 <w:rFonts w:ascii="Times New Roman" w:hAnsi="Times New Roman"/>
                 <w:color w:val="000000"/>
                 <w:sz w:val="22"/>
               </w:rPr>
-              <w:t xml:space="preserve"> Học sinh tiếp nhận nhiệm vụ học tập từ giáo viên.</w:t>
+              <w:t xml:space="preserve">- </w:t>
+            </w:r>
+            <w:r>
+              <w:rPr>
+                <w:rFonts w:ascii="Times New Roman" w:hAnsi="Times New Roman"/>
+                <w:color w:val="000000"/>
+                <w:sz w:val="22"/>
+              </w:rPr>
+              <w:t>HS nhận nhiệm vụ học tập trên PHT để chuẩn bị thực hiện tính toán.</w:t>
             </w:r>
           </w:p>
         </w:tc>
@@ -6777,13 +7053,79 @@
               </w:rPr>
               <w:t>Theo dõi, hỗ trợ:</w:t>
             </w:r>
+          </w:p>
+          <w:p>
+            <w:pPr>
+              <w:spacing w:before="40" w:after="40" w:line="276" w:lineRule="auto"/>
+              <w:ind w:left="170" w:hanging="113"/>
+              <w:jc w:val="left"/>
+            </w:pPr>
             <w:r>
               <w:rPr>
                 <w:rFonts w:ascii="Times New Roman" w:hAnsi="Times New Roman"/>
                 <w:color w:val="000000"/>
                 <w:sz w:val="22"/>
               </w:rPr>
-              <w:t xml:space="preserve"> Giáo viên theo dõi, quan sát và hỗ trợ gợi ý các nhóm khi cần thiết.</w:t>
+              <w:t xml:space="preserve">- </w:t>
+            </w:r>
+            <w:r>
+              <w:rPr>
+                <w:rFonts w:ascii="Times New Roman" w:hAnsi="Times New Roman"/>
+                <w:color w:val="000000"/>
+                <w:sz w:val="22"/>
+              </w:rPr>
+              <w:t xml:space="preserve">GV gợi ý HS tính riêng nhiệt lượng ấm thu vào </w:t>
+            </w:r>
+            <w:r>
+              <w:rPr>
+                <w:rFonts w:ascii="Times New Roman" w:hAnsi="Times New Roman"/>
+                <w:i/>
+                <w:color w:val="000000"/>
+                <w:sz w:val="22"/>
+              </w:rPr>
+              <w:t>Q_1</w:t>
+            </w:r>
+            <w:r>
+              <w:rPr>
+                <w:rFonts w:ascii="Times New Roman" w:hAnsi="Times New Roman"/>
+                <w:color w:val="000000"/>
+                <w:sz w:val="22"/>
+              </w:rPr>
+              <w:t xml:space="preserve">, nước thu vào </w:t>
+            </w:r>
+            <w:r>
+              <w:rPr>
+                <w:rFonts w:ascii="Times New Roman" w:hAnsi="Times New Roman"/>
+                <w:i/>
+                <w:color w:val="000000"/>
+                <w:sz w:val="22"/>
+              </w:rPr>
+              <w:t>Q_2</w:t>
+            </w:r>
+            <w:r>
+              <w:rPr>
+                <w:rFonts w:ascii="Times New Roman" w:hAnsi="Times New Roman"/>
+                <w:color w:val="000000"/>
+                <w:sz w:val="22"/>
+              </w:rPr>
+              <w:t xml:space="preserve">, rồi tính tổng nhiệt lượng </w:t>
+            </w:r>
+            <w:r>
+              <w:rPr>
+                <w:rFonts w:ascii="Times New Roman" w:hAnsi="Times New Roman"/>
+                <w:i/>
+                <w:color w:val="000000"/>
+                <w:sz w:val="22"/>
+              </w:rPr>
+              <w:t>Q = Q_1 + Q_2</w:t>
+            </w:r>
+            <w:r>
+              <w:rPr>
+                <w:rFonts w:ascii="Times New Roman" w:hAnsi="Times New Roman"/>
+                <w:color w:val="000000"/>
+                <w:sz w:val="22"/>
+              </w:rPr>
+              <w:t>.</w:t>
             </w:r>
           </w:p>
         </w:tc>
@@ -6839,7 +7181,7 @@
                 <w:color w:val="000000"/>
                 <w:sz w:val="22"/>
               </w:rPr>
-              <w:t xml:space="preserve">HS tính toán nhiệt lượng thu vào của ấm nhôm </w:t>
+              <w:t xml:space="preserve">HS thực hiện tính toán độc lập: </w:t>
             </w:r>
             <w:r>
               <w:rPr>
@@ -6848,7 +7190,7 @@
                 <w:color w:val="000000"/>
                 <w:sz w:val="22"/>
               </w:rPr>
-              <w:t>Q_1 = m_1c_1Δ t</w:t>
+              <w:t>Q_1 = m_1 c_1 Δ t</w:t>
             </w:r>
             <w:r>
               <w:rPr>
@@ -6856,7 +7198,7 @@
                 <w:color w:val="000000"/>
                 <w:sz w:val="22"/>
               </w:rPr>
-              <w:t xml:space="preserve"> và nước </w:t>
+              <w:t xml:space="preserve">, </w:t>
             </w:r>
             <w:r>
               <w:rPr>
@@ -6865,7 +7207,7 @@
                 <w:color w:val="000000"/>
                 <w:sz w:val="22"/>
               </w:rPr>
-              <w:t>Q_2 = m_2c_2Δ t</w:t>
+              <w:t>Q_2 = m_2 c_2 Δ t</w:t>
             </w:r>
             <w:r>
               <w:rPr>
@@ -6873,47 +7215,7 @@
                 <w:color w:val="000000"/>
                 <w:sz w:val="22"/>
               </w:rPr>
-              <w:t>.</w:t>
-            </w:r>
-          </w:p>
-          <w:p>
-            <w:pPr>
-              <w:spacing w:before="40" w:after="40" w:line="276" w:lineRule="auto"/>
-              <w:ind w:left="170" w:hanging="113"/>
-              <w:jc w:val="left"/>
-            </w:pPr>
-            <w:r>
-              <w:rPr>
-                <w:rFonts w:ascii="Times New Roman" w:hAnsi="Times New Roman"/>
-                <w:color w:val="000000"/>
-                <w:sz w:val="22"/>
-              </w:rPr>
-              <w:t xml:space="preserve">- </w:t>
-            </w:r>
-            <w:r>
-              <w:rPr>
-                <w:rFonts w:ascii="Times New Roman" w:hAnsi="Times New Roman"/>
-                <w:color w:val="000000"/>
-                <w:sz w:val="22"/>
-              </w:rPr>
-              <w:t xml:space="preserve">Tổng nhiệt lượng </w:t>
-            </w:r>
-            <w:r>
-              <w:rPr>
-                <w:rFonts w:ascii="Times New Roman" w:hAnsi="Times New Roman"/>
-                <w:i/>
-                <w:color w:val="000000"/>
-                <w:sz w:val="22"/>
-              </w:rPr>
-              <w:t>Q = Q_1 + Q_2</w:t>
-            </w:r>
-            <w:r>
-              <w:rPr>
-                <w:rFonts w:ascii="Times New Roman" w:hAnsi="Times New Roman"/>
-                <w:color w:val="000000"/>
-                <w:sz w:val="22"/>
-              </w:rPr>
-              <w:t>.</w:t>
+              <w:t>, cộng tổng lại.</w:t>
             </w:r>
           </w:p>
         </w:tc>
@@ -6953,13 +7255,28 @@
               </w:rPr>
               <w:t>Tổ chức báo cáo:</w:t>
             </w:r>
+          </w:p>
+          <w:p>
+            <w:pPr>
+              <w:spacing w:before="40" w:after="40" w:line="276" w:lineRule="auto"/>
+              <w:ind w:left="170" w:hanging="113"/>
+              <w:jc w:val="left"/>
+            </w:pPr>
             <w:r>
               <w:rPr>
                 <w:rFonts w:ascii="Times New Roman" w:hAnsi="Times New Roman"/>
                 <w:color w:val="000000"/>
                 <w:sz w:val="22"/>
               </w:rPr>
-              <w:t xml:space="preserve"> Giáo viên điều hành, gọi đại diện báo cáo kết quả, tổ chức nhận xét phản biện chéo giữa các học sinh.</w:t>
+              <w:t xml:space="preserve">- </w:t>
+            </w:r>
+            <w:r>
+              <w:rPr>
+                <w:rFonts w:ascii="Times New Roman" w:hAnsi="Times New Roman"/>
+                <w:color w:val="000000"/>
+                <w:sz w:val="22"/>
+              </w:rPr>
+              <w:t>GV gọi đại diện học sinh đọc kết quả tính toán cuối cùng và giải thích ngắn gọn ý nghĩa thực tế.</w:t>
             </w:r>
           </w:p>
         </w:tc>
@@ -6995,64 +7312,6 @@
               <w:t>Báo cáo, thảo luận:</w:t>
             </w:r>
           </w:p>
-        </w:tc>
-      </w:tr>
-      <w:tr>
-        <w:trPr>
-          <w:cantSplit/>
-        </w:trPr>
-        <w:tc>
-          <w:tcPr>
-            <w:tcW w:type="dxa" w:w="4535"/>
-            <w:tcMar>
-              <w:top w:w="114" w:type="dxa"/>
-              <w:bottom w:w="114" w:type="dxa"/>
-              <w:left w:w="170" w:type="dxa"/>
-              <w:right w:w="170" w:type="dxa"/>
-            </w:tcMar>
-            <w:tcBorders>
-              <w:top w:val="single" w:sz="4" w:space="0" w:color="BFBFBF"/>
-              <w:left w:val="single" w:sz="4" w:space="0" w:color="BFBFBF"/>
-              <w:bottom w:val="single" w:sz="4" w:space="0" w:color="BFBFBF"/>
-              <w:right w:val="single" w:sz="4" w:space="0" w:color="BFBFBF"/>
-            </w:tcBorders>
-          </w:tcPr>
-          <w:p>
-            <w:r/>
-          </w:p>
-        </w:tc>
-        <w:tc>
-          <w:tcPr>
-            <w:tcW w:type="dxa" w:w="4535"/>
-            <w:tcMar>
-              <w:top w:w="114" w:type="dxa"/>
-              <w:bottom w:w="114" w:type="dxa"/>
-              <w:left w:w="170" w:type="dxa"/>
-              <w:right w:w="170" w:type="dxa"/>
-            </w:tcMar>
-            <w:tcBorders>
-              <w:top w:val="single" w:sz="4" w:space="0" w:color="BFBFBF"/>
-              <w:left w:val="single" w:sz="4" w:space="0" w:color="BFBFBF"/>
-              <w:bottom w:val="single" w:sz="4" w:space="0" w:color="BFBFBF"/>
-              <w:right w:val="single" w:sz="4" w:space="0" w:color="BFBFBF"/>
-            </w:tcBorders>
-          </w:tcPr>
-          <w:p>
-            <w:pPr>
-              <w:spacing w:before="40" w:after="40" w:line="276" w:lineRule="auto"/>
-              <w:jc w:val="left"/>
-            </w:pPr>
-            <w:r/>
-            <w:r>
-              <w:rPr>
-                <w:rFonts w:ascii="Times New Roman" w:hAnsi="Times New Roman"/>
-                <w:b/>
-                <w:color w:val="000000"/>
-                <w:sz w:val="22"/>
-              </w:rPr>
-              <w:t>Báo cáo:</w:t>
-            </w:r>
-          </w:p>
           <w:p>
             <w:pPr>
               <w:spacing w:before="40" w:after="40" w:line="276" w:lineRule="auto"/>
@@ -7073,7 +7332,24 @@
                 <w:color w:val="000000"/>
                 <w:sz w:val="22"/>
               </w:rPr>
-              <w:t>HS nộp lại PHT trước khi ra về.</w:t>
+              <w:t xml:space="preserve">HS trả lời kết quả: </w:t>
+            </w:r>
+            <w:r>
+              <w:rPr>
+                <w:rFonts w:ascii="Times New Roman" w:hAnsi="Times New Roman"/>
+                <w:i/>
+                <w:color w:val="000000"/>
+                <w:sz w:val="22"/>
+              </w:rPr>
+              <w:t>Q = 707200 J ≈ 707,2 kJ</w:t>
+            </w:r>
+            <w:r>
+              <w:rPr>
+                <w:rFonts w:ascii="Times New Roman" w:hAnsi="Times New Roman"/>
+                <w:color w:val="000000"/>
+                <w:sz w:val="22"/>
+              </w:rPr>
+              <w:t>. Các HS khác đồng thuận kết quả.</w:t>
             </w:r>
           </w:p>
         </w:tc>
@@ -7134,7 +7410,7 @@
                 <w:color w:val="000000"/>
                 <w:sz w:val="22"/>
               </w:rPr>
-              <w:t>GV chốt đáp án chuẩn và thu PHT để đánh giá.</w:t>
+              <w:t>GV chuẩn hóa đáp số, nhận xét thái độ học tập và dặn dò HS đọc Nhiệm vụ 8, 9 về nhà để hiểu vai trò điều hòa khí hậu của nước.</w:t>
             </w:r>
           </w:p>
         </w:tc>
@@ -7169,13 +7445,28 @@
               </w:rPr>
               <w:t>Ghi nhận kiến thức:</w:t>
             </w:r>
+          </w:p>
+          <w:p>
+            <w:pPr>
+              <w:spacing w:before="40" w:after="40" w:line="276" w:lineRule="auto"/>
+              <w:ind w:left="170" w:hanging="113"/>
+              <w:jc w:val="left"/>
+            </w:pPr>
             <w:r>
               <w:rPr>
                 <w:rFonts w:ascii="Times New Roman" w:hAnsi="Times New Roman"/>
                 <w:color w:val="000000"/>
                 <w:sz w:val="22"/>
               </w:rPr>
-              <w:t xml:space="preserve"> Học sinh đối chiếu, sửa đổi kết quả bài làm và ghi nhận kiến thức cốt lõi vào vở.</w:t>
+              <w:t xml:space="preserve">- </w:t>
+            </w:r>
+            <w:r>
+              <w:rPr>
+                <w:rFonts w:ascii="Times New Roman" w:hAnsi="Times New Roman"/>
+                <w:color w:val="000000"/>
+                <w:sz w:val="22"/>
+              </w:rPr>
+              <w:t>HS ghi kết quả chuẩn vào PHT và tiếp nhận hướng dẫn tự học mở rộng ở nhà.</w:t>
             </w:r>
           </w:p>
         </w:tc>
@@ -7236,7 +7527,7 @@
           <w:rFonts w:ascii="Times New Roman" w:hAnsi="Times New Roman"/>
           <w:sz w:val="26"/>
         </w:rPr>
-        <w:t>1. ****</w:t>
+        <w:t>-  ............................................................................................................................................................................................................</w:t>
       </w:r>
       <w:r>
         <w:rPr>
@@ -7261,7 +7552,7 @@
           <w:rFonts w:ascii="Times New Roman" w:hAnsi="Times New Roman"/>
           <w:sz w:val="26"/>
         </w:rPr>
-        <w:t>2. ****</w:t>
+        <w:t>-  ............................................................................................................................................................................................................</w:t>
       </w:r>
       <w:r>
         <w:rPr>
@@ -7286,7 +7577,7 @@
           <w:rFonts w:ascii="Times New Roman" w:hAnsi="Times New Roman"/>
           <w:sz w:val="26"/>
         </w:rPr>
-        <w:t>3. ****</w:t>
+        <w:t>-  ................................................................................................................................................................................................</w:t>
       </w:r>
       <w:r>
         <w:rPr>

</xml_diff>